<commit_message>
feat: implement settings module with UI for village data management and document template uploads
</commit_message>
<xml_diff>
--- a/templates/keterangan_ahli_waris_template.docx
+++ b/templates/keterangan_ahli_waris_template.docx
@@ -1,7 +1,221 @@
 
 <file path=word/document.xml><?xml version="1.0" encoding="utf-8"?>
-<w:document xmlns:wpc="http://schemas.microsoft.com/office/word/2010/wordprocessingCanvas" xmlns:mc="http://schemas.openxmlformats.org/markup-compatibility/2006" xmlns:o="urn:schemas-microsoft-com:office:office" xmlns:r="http://schemas.openxmlformats.org/officeDocument/2006/relationships" xmlns:m="http://schemas.openxmlformats.org/officeDocument/2006/math" xmlns:v="urn:schemas-microsoft-com:vml" xmlns:wp14="http://schemas.microsoft.com/office/word/2010/wordprocessingDrawing" xmlns:wp="http://schemas.openxmlformats.org/drawingml/2006/wordprocessingDrawing" xmlns:w10="urn:schemas-microsoft-com:office:word" xmlns:w="http://schemas.openxmlformats.org/wordprocessingml/2006/main" xmlns:w14="http://schemas.microsoft.com/office/word/2010/wordml" xmlns:wpg="http://schemas.microsoft.com/office/word/2010/wordprocessingGroup" xmlns:wpi="http://schemas.microsoft.com/office/word/2010/wordprocessingInk" xmlns:wne="http://schemas.microsoft.com/office/word/2006/wordml" xmlns:wps="http://schemas.microsoft.com/office/word/2010/wordprocessingShape" mc:Ignorable="w14 wp14">
+<w:document xmlns:wpc="http://schemas.microsoft.com/office/word/2010/wordprocessingCanvas" xmlns:cx="http://schemas.microsoft.com/office/drawing/2014/chartex" xmlns:cx1="http://schemas.microsoft.com/office/drawing/2015/9/8/chartex" xmlns:cx2="http://schemas.microsoft.com/office/drawing/2015/10/21/chartex" xmlns:cx3="http://schemas.microsoft.com/office/drawing/2016/5/9/chartex" xmlns:cx4="http://schemas.microsoft.com/office/drawing/2016/5/10/chartex" xmlns:cx5="http://schemas.microsoft.com/office/drawing/2016/5/11/chartex" xmlns:cx6="http://schemas.microsoft.com/office/drawing/2016/5/12/chartex" xmlns:cx7="http://schemas.microsoft.com/office/drawing/2016/5/13/chartex" xmlns:cx8="http://schemas.microsoft.com/office/drawing/2016/5/14/chartex" xmlns:mc="http://schemas.openxmlformats.org/markup-compatibility/2006" xmlns:aink="http://schemas.microsoft.com/office/drawing/2016/ink" xmlns:am3d="http://schemas.microsoft.com/office/drawing/2017/model3d" xmlns:o="urn:schemas-microsoft-com:office:office" xmlns:oel="http://schemas.microsoft.com/office/2019/extlst" xmlns:r="http://schemas.openxmlformats.org/officeDocument/2006/relationships" xmlns:m="http://schemas.openxmlformats.org/officeDocument/2006/math" xmlns:v="urn:schemas-microsoft-com:vml" xmlns:wp14="http://schemas.microsoft.com/office/word/2010/wordprocessingDrawing" xmlns:wp="http://schemas.openxmlformats.org/drawingml/2006/wordprocessingDrawing" xmlns:w10="urn:schemas-microsoft-com:office:word" xmlns:w="http://schemas.openxmlformats.org/wordprocessingml/2006/main" xmlns:w14="http://schemas.microsoft.com/office/word/2010/wordml" xmlns:w15="http://schemas.microsoft.com/office/word/2012/wordml" xmlns:w16cex="http://schemas.microsoft.com/office/word/2018/wordml/cex" xmlns:w16cid="http://schemas.microsoft.com/office/word/2016/wordml/cid" xmlns:w16="http://schemas.microsoft.com/office/word/2018/wordml" xmlns:w16du="http://schemas.microsoft.com/office/word/2023/wordml/word16du" xmlns:w16sdtdh="http://schemas.microsoft.com/office/word/2020/wordml/sdtdatahash" xmlns:w16sdtfl="http://schemas.microsoft.com/office/word/2024/wordml/sdtformatlock" xmlns:w16se="http://schemas.microsoft.com/office/word/2015/wordml/symex" xmlns:wpg="http://schemas.microsoft.com/office/word/2010/wordprocessingGroup" xmlns:wpi="http://schemas.microsoft.com/office/word/2010/wordprocessingInk" xmlns:wne="http://schemas.microsoft.com/office/word/2006/wordml" xmlns:wps="http://schemas.microsoft.com/office/word/2010/wordprocessingShape" mc:Ignorable="w14 w15 w16se w16cid w16 w16cex w16sdtdh w16sdtfl w16du wp14">
   <w:body>
+    <w:p>
+      <w:pPr>
+        <w:pStyle w:val="HeaderSurat"/>
+        <w:ind w:left="0"/>
+        <w:rPr>
+          <w:noProof/>
+        </w:rPr>
+      </w:pPr>
+      <w:r>
+        <w:rPr>
+          <w:noProof/>
+        </w:rPr>
+        <w:drawing>
+          <wp:anchor distT="0" distB="0" distL="114300" distR="114300" simplePos="0" relativeHeight="251659264" behindDoc="1" locked="0" layoutInCell="1" allowOverlap="1" wp14:anchorId="7F0529E4" wp14:editId="0424FA4E">
+            <wp:simplePos x="0" y="0"/>
+            <wp:positionH relativeFrom="column">
+              <wp:posOffset>-327804</wp:posOffset>
+            </wp:positionH>
+            <wp:positionV relativeFrom="paragraph">
+              <wp:posOffset>0</wp:posOffset>
+            </wp:positionV>
+            <wp:extent cx="975360" cy="975360"/>
+            <wp:effectExtent l="0" t="0" r="0" b="0"/>
+            <wp:wrapNone/>
+            <wp:docPr id="1" name="Picture 1" descr="A green shield with a red and yellow logo&#10;&#10;AI-generated content may be incorrect."/>
+            <wp:cNvGraphicFramePr>
+              <a:graphicFrameLocks xmlns:a="http://schemas.openxmlformats.org/drawingml/2006/main" noChangeAspect="1"/>
+            </wp:cNvGraphicFramePr>
+            <a:graphic xmlns:a="http://schemas.openxmlformats.org/drawingml/2006/main">
+              <a:graphicData uri="http://schemas.openxmlformats.org/drawingml/2006/picture">
+                <pic:pic xmlns:pic="http://schemas.openxmlformats.org/drawingml/2006/picture">
+                  <pic:nvPicPr>
+                    <pic:cNvPr id="1" name="Picture 1" descr="A green shield with a red and yellow logo&#10;&#10;AI-generated content may be incorrect."/>
+                    <pic:cNvPicPr>
+                      <a:picLocks noChangeAspect="1" noChangeArrowheads="1"/>
+                    </pic:cNvPicPr>
+                  </pic:nvPicPr>
+                  <pic:blipFill>
+                    <a:blip r:embed="rId5">
+                      <a:extLst>
+                        <a:ext uri="{28A0092B-C50C-407E-A947-70E740481C1C}">
+                          <a14:useLocalDpi xmlns:a14="http://schemas.microsoft.com/office/drawing/2010/main" val="0"/>
+                        </a:ext>
+                      </a:extLst>
+                    </a:blip>
+                    <a:srcRect/>
+                    <a:stretch>
+                      <a:fillRect/>
+                    </a:stretch>
+                  </pic:blipFill>
+                  <pic:spPr bwMode="auto">
+                    <a:xfrm>
+                      <a:off x="0" y="0"/>
+                      <a:ext cx="975360" cy="975360"/>
+                    </a:xfrm>
+                    <a:prstGeom prst="rect">
+                      <a:avLst/>
+                    </a:prstGeom>
+                    <a:noFill/>
+                    <a:ln>
+                      <a:noFill/>
+                    </a:ln>
+                  </pic:spPr>
+                </pic:pic>
+              </a:graphicData>
+            </a:graphic>
+            <wp14:sizeRelH relativeFrom="page">
+              <wp14:pctWidth>0</wp14:pctWidth>
+            </wp14:sizeRelH>
+            <wp14:sizeRelV relativeFrom="page">
+              <wp14:pctHeight>0</wp14:pctHeight>
+            </wp14:sizeRelV>
+          </wp:anchor>
+        </w:drawing>
+      </w:r>
+      <w:r>
+        <w:rPr>
+          <w:noProof/>
+        </w:rPr>
+        <w:t>PEMERINTAH KABUPATEN Magelang</w:t>
+      </w:r>
+    </w:p>
+    <w:p>
+      <w:pPr>
+        <w:pStyle w:val="HeaderSurat"/>
+        <w:ind w:left="0"/>
+      </w:pPr>
+      <w:r>
+        <w:t>KECAMATAN Borobudur</w:t>
+      </w:r>
+    </w:p>
+    <w:p>
+      <w:pPr>
+        <w:pStyle w:val="HeaderSurat"/>
+        <w:ind w:left="0"/>
+        <w:rPr>
+          <w:b/>
+          <w:bCs/>
+        </w:rPr>
+      </w:pPr>
+      <w:r>
+        <w:rPr>
+          <w:b/>
+          <w:bCs/>
+        </w:rPr>
+        <w:t>desa Kembanglimus</w:t>
+      </w:r>
+    </w:p>
+    <w:p>
+      <w:pPr>
+        <w:pStyle w:val="HeaderSurat"/>
+        <w:ind w:left="0"/>
+        <w:rPr>
+          <w:caps w:val="0"/>
+          <w:sz w:val="20"/>
+          <w:szCs w:val="20"/>
+        </w:rPr>
+      </w:pPr>
+      <w:r>
+        <w:rPr>
+          <w:caps w:val="0"/>
+          <w:sz w:val="20"/>
+          <w:szCs w:val="20"/>
+        </w:rPr>
+        <w:t xml:space="preserve">Jl. Sudirman KM. 03, Kembanglimus, Borobudur Kode </w:t>
+      </w:r>
+      <w:proofErr w:type="gramStart"/>
+      <w:r>
+        <w:rPr>
+          <w:caps w:val="0"/>
+          <w:sz w:val="20"/>
+          <w:szCs w:val="20"/>
+        </w:rPr>
+        <w:t>Pos :</w:t>
+      </w:r>
+      <w:proofErr w:type="gramEnd"/>
+      <w:r>
+        <w:rPr>
+          <w:caps w:val="0"/>
+          <w:sz w:val="20"/>
+          <w:szCs w:val="20"/>
+        </w:rPr>
+        <w:t xml:space="preserve"> 56553</w:t>
+      </w:r>
+    </w:p>
+    <w:p>
+      <w:pPr>
+        <w:pStyle w:val="HeaderSurat"/>
+        <w:pBdr>
+          <w:bottom w:val="thinThickThinMediumGap" w:sz="18" w:space="1" w:color="auto"/>
+        </w:pBdr>
+        <w:ind w:left="0"/>
+        <w:rPr>
+          <w:caps w:val="0"/>
+          <w:sz w:val="20"/>
+          <w:szCs w:val="20"/>
+        </w:rPr>
+      </w:pPr>
+      <w:proofErr w:type="gramStart"/>
+      <w:r>
+        <w:rPr>
+          <w:caps w:val="0"/>
+          <w:sz w:val="20"/>
+          <w:szCs w:val="20"/>
+        </w:rPr>
+        <w:t>Telp :</w:t>
+      </w:r>
+      <w:proofErr w:type="gramEnd"/>
+      <w:r>
+        <w:rPr>
+          <w:caps w:val="0"/>
+          <w:sz w:val="20"/>
+          <w:szCs w:val="20"/>
+        </w:rPr>
+        <w:t xml:space="preserve"> (0293) 7182286 </w:t>
+      </w:r>
+      <w:proofErr w:type="gramStart"/>
+      <w:r>
+        <w:rPr>
+          <w:caps w:val="0"/>
+          <w:sz w:val="20"/>
+          <w:szCs w:val="20"/>
+        </w:rPr>
+        <w:t>E-Mail :</w:t>
+      </w:r>
+      <w:proofErr w:type="gramEnd"/>
+      <w:r>
+        <w:rPr>
+          <w:caps w:val="0"/>
+          <w:sz w:val="20"/>
+          <w:szCs w:val="20"/>
+        </w:rPr>
+        <w:t xml:space="preserve"> </w:t>
+      </w:r>
+      <w:hyperlink r:id="rId6" w:history="1">
+        <w:r>
+          <w:rPr>
+            <w:rStyle w:val="Hyperlink"/>
+            <w:caps w:val="0"/>
+            <w:sz w:val="20"/>
+            <w:szCs w:val="20"/>
+          </w:rPr>
+          <w:t>desakembanglimus1@gmail.com</w:t>
+        </w:r>
+      </w:hyperlink>
+      <w:r>
+        <w:rPr>
+          <w:caps w:val="0"/>
+          <w:sz w:val="20"/>
+          <w:szCs w:val="20"/>
+        </w:rPr>
+        <w:t xml:space="preserve"> </w:t>
+      </w:r>
+    </w:p>
     <w:p>
       <w:pPr>
         <w:spacing w:line="276" w:lineRule="auto"/>
@@ -12,23 +226,22 @@
           <w:bCs/>
           <w:sz w:val="32"/>
           <w:szCs w:val="32"/>
-          <w:lang w:val="fi-FI"/>
-        </w:rPr>
-      </w:pPr>
-    </w:p>
-    <w:p>
-      <w:pPr>
-        <w:spacing w:line="276" w:lineRule="auto"/>
-        <w:jc w:val="center"/>
+          <w:u w:val="single"/>
+          <w:lang w:val="fi-FI"/>
+        </w:rPr>
+      </w:pPr>
+      <w:r>
         <w:rPr>
           <w:rFonts w:ascii="Arial" w:hAnsi="Arial" w:cs="Arial"/>
           <w:b/>
           <w:bCs/>
           <w:sz w:val="32"/>
           <w:szCs w:val="32"/>
-          <w:lang w:val="fi-FI"/>
-        </w:rPr>
-      </w:pPr>
+          <w:u w:val="single"/>
+          <w:lang w:val="fi-FI"/>
+        </w:rPr>
+        <w:t xml:space="preserve">SURAT </w:t>
+      </w:r>
       <w:r>
         <w:rPr>
           <w:rFonts w:ascii="Arial" w:hAnsi="Arial" w:cs="Arial"/>
@@ -36,17 +249,7 @@
           <w:bCs/>
           <w:sz w:val="32"/>
           <w:szCs w:val="32"/>
-          <w:lang w:val="fi-FI"/>
-        </w:rPr>
-        <w:t xml:space="preserve">SURAT </w:t>
-      </w:r>
-      <w:r>
-        <w:rPr>
-          <w:rFonts w:ascii="Arial" w:hAnsi="Arial" w:cs="Arial"/>
-          <w:b/>
-          <w:bCs/>
-          <w:sz w:val="32"/>
-          <w:szCs w:val="32"/>
+          <w:u w:val="single"/>
           <w:lang w:val="fi-FI"/>
         </w:rPr>
         <w:t>PERNYATAAN AHLI WARIS</w:t>
@@ -58,17 +261,27 @@
         <w:jc w:val="center"/>
         <w:rPr>
           <w:rFonts w:ascii="Arial" w:hAnsi="Arial" w:cs="Arial"/>
-          <w:sz w:val="28"/>
-          <w:szCs w:val="28"/>
-          <w:u w:val="single"/>
-          <w:lang w:val="id-ID"/>
-        </w:rPr>
-      </w:pPr>
+          <w:lang w:val="fi-FI"/>
+        </w:rPr>
+      </w:pPr>
+      <w:r>
+        <w:rPr>
+          <w:rFonts w:ascii="Arial" w:hAnsi="Arial" w:cs="Arial"/>
+          <w:lang w:val="fi-FI"/>
+        </w:rPr>
+        <w:t>NOMOR SURAT</w:t>
+      </w:r>
+      <w:r>
+        <w:rPr>
+          <w:rFonts w:ascii="Arial" w:hAnsi="Arial" w:cs="Arial"/>
+          <w:lang w:val="fi-FI"/>
+        </w:rPr>
+        <w:t xml:space="preserve"> : {nomor_surat}</w:t>
+      </w:r>
     </w:p>
     <w:p>
       <w:pPr>
         <w:spacing w:line="276" w:lineRule="auto"/>
-        <w:jc w:val="center"/>
         <w:rPr>
           <w:rFonts w:ascii="Arial" w:hAnsi="Arial" w:cs="Arial"/>
           <w:sz w:val="20"/>
@@ -105,7 +318,7 @@
           <w:szCs w:val="20"/>
           <w:lang w:val="fi-FI"/>
         </w:rPr>
-        <w:t>...........................................</w:t>
+        <w:t>{nama_almarhum}</w:t>
       </w:r>
       <w:r>
         <w:rPr>
@@ -186,34 +399,7 @@
           <w:szCs w:val="20"/>
           <w:lang w:val="fi-FI"/>
         </w:rPr>
-        <w:t>................................................................................................</w:t>
-      </w:r>
-      <w:r>
-        <w:rPr>
-          <w:rFonts w:ascii="Arial" w:hAnsi="Arial" w:cs="Arial"/>
-          <w:sz w:val="20"/>
-          <w:szCs w:val="20"/>
-          <w:lang w:val="id-ID"/>
-        </w:rPr>
-        <w:t>.</w:t>
-      </w:r>
-      <w:r>
-        <w:rPr>
-          <w:rFonts w:ascii="Arial" w:hAnsi="Arial" w:cs="Arial"/>
-          <w:sz w:val="20"/>
-          <w:szCs w:val="20"/>
-          <w:lang w:val="en-US"/>
-        </w:rPr>
-        <w:t>................................</w:t>
-      </w:r>
-      <w:r>
-        <w:rPr>
-          <w:rFonts w:ascii="Arial" w:hAnsi="Arial" w:cs="Arial"/>
-          <w:sz w:val="20"/>
-          <w:szCs w:val="20"/>
-          <w:lang w:val="en-US"/>
-        </w:rPr>
-        <w:t>.</w:t>
+        <w:t>{nama_saksi_1}</w:t>
       </w:r>
     </w:p>
     <w:p>
@@ -264,34 +450,7 @@
           <w:szCs w:val="20"/>
           <w:lang w:val="fi-FI"/>
         </w:rPr>
-        <w:t>................................................................................................</w:t>
-      </w:r>
-      <w:r>
-        <w:rPr>
-          <w:rFonts w:ascii="Arial" w:hAnsi="Arial" w:cs="Arial"/>
-          <w:sz w:val="20"/>
-          <w:szCs w:val="20"/>
-          <w:lang w:val="id-ID"/>
-        </w:rPr>
-        <w:t>.</w:t>
-      </w:r>
-      <w:r>
-        <w:rPr>
-          <w:rFonts w:ascii="Arial" w:hAnsi="Arial" w:cs="Arial"/>
-          <w:sz w:val="20"/>
-          <w:szCs w:val="20"/>
-          <w:lang w:val="en-US"/>
-        </w:rPr>
-        <w:t>................................</w:t>
-      </w:r>
-      <w:r>
-        <w:rPr>
-          <w:rFonts w:ascii="Arial" w:hAnsi="Arial" w:cs="Arial"/>
-          <w:sz w:val="20"/>
-          <w:szCs w:val="20"/>
-          <w:lang w:val="en-US"/>
-        </w:rPr>
-        <w:t>.</w:t>
+        <w:t>{tempat_lahir_saksi_1}, {tanggal_lahir_saksi_1}</w:t>
       </w:r>
       <w:r>
         <w:rPr>
@@ -369,34 +528,7 @@
           <w:szCs w:val="20"/>
           <w:lang w:val="fi-FI"/>
         </w:rPr>
-        <w:t>................................................................................................</w:t>
-      </w:r>
-      <w:r>
-        <w:rPr>
-          <w:rFonts w:ascii="Arial" w:hAnsi="Arial" w:cs="Arial"/>
-          <w:sz w:val="20"/>
-          <w:szCs w:val="20"/>
-          <w:lang w:val="id-ID"/>
-        </w:rPr>
-        <w:t>.</w:t>
-      </w:r>
-      <w:r>
-        <w:rPr>
-          <w:rFonts w:ascii="Arial" w:hAnsi="Arial" w:cs="Arial"/>
-          <w:sz w:val="20"/>
-          <w:szCs w:val="20"/>
-          <w:lang w:val="en-US"/>
-        </w:rPr>
-        <w:t>................................</w:t>
-      </w:r>
-      <w:r>
-        <w:rPr>
-          <w:rFonts w:ascii="Arial" w:hAnsi="Arial" w:cs="Arial"/>
-          <w:sz w:val="20"/>
-          <w:szCs w:val="20"/>
-          <w:lang w:val="en-US"/>
-        </w:rPr>
-        <w:t>.</w:t>
+        <w:t>{nik_saksi_1}</w:t>
       </w:r>
     </w:p>
     <w:p>
@@ -473,34 +605,7 @@
           <w:szCs w:val="20"/>
           <w:lang w:val="fi-FI"/>
         </w:rPr>
-        <w:t>................................................................................................</w:t>
-      </w:r>
-      <w:r>
-        <w:rPr>
-          <w:rFonts w:ascii="Arial" w:hAnsi="Arial" w:cs="Arial"/>
-          <w:sz w:val="20"/>
-          <w:szCs w:val="20"/>
-          <w:lang w:val="id-ID"/>
-        </w:rPr>
-        <w:t>.</w:t>
-      </w:r>
-      <w:r>
-        <w:rPr>
-          <w:rFonts w:ascii="Arial" w:hAnsi="Arial" w:cs="Arial"/>
-          <w:sz w:val="20"/>
-          <w:szCs w:val="20"/>
-          <w:lang w:val="en-US"/>
-        </w:rPr>
-        <w:t>................................</w:t>
-      </w:r>
-      <w:r>
-        <w:rPr>
-          <w:rFonts w:ascii="Arial" w:hAnsi="Arial" w:cs="Arial"/>
-          <w:sz w:val="20"/>
-          <w:szCs w:val="20"/>
-          <w:lang w:val="en-US"/>
-        </w:rPr>
-        <w:t>.</w:t>
+        <w:t>{pekerjaan_saksi_1}</w:t>
       </w:r>
     </w:p>
     <w:p>
@@ -513,7 +618,7 @@
           <w:rFonts w:ascii="Arial" w:hAnsi="Arial" w:cs="Arial"/>
           <w:sz w:val="20"/>
           <w:szCs w:val="20"/>
-          <w:lang w:val="en-US"/>
+          <w:lang w:val="fi-FI"/>
         </w:rPr>
       </w:pPr>
       <w:r>
@@ -559,130 +664,16 @@
           <w:szCs w:val="20"/>
           <w:lang w:val="fi-FI"/>
         </w:rPr>
-        <w:t>:  ................................................................................................</w:t>
-      </w:r>
-      <w:r>
-        <w:rPr>
-          <w:rFonts w:ascii="Arial" w:hAnsi="Arial" w:cs="Arial"/>
-          <w:sz w:val="20"/>
-          <w:szCs w:val="20"/>
-          <w:lang w:val="id-ID"/>
-        </w:rPr>
-        <w:t>.</w:t>
-      </w:r>
-      <w:r>
-        <w:rPr>
-          <w:rFonts w:ascii="Arial" w:hAnsi="Arial" w:cs="Arial"/>
-          <w:sz w:val="20"/>
-          <w:szCs w:val="20"/>
-          <w:lang w:val="en-US"/>
-        </w:rPr>
-        <w:t>................................</w:t>
-      </w:r>
-      <w:r>
-        <w:rPr>
-          <w:rFonts w:ascii="Arial" w:hAnsi="Arial" w:cs="Arial"/>
-          <w:sz w:val="20"/>
-          <w:szCs w:val="20"/>
-          <w:lang w:val="en-US"/>
-        </w:rPr>
-        <w:t>.</w:t>
-      </w:r>
-    </w:p>
-    <w:p>
-      <w:pPr>
-        <w:pStyle w:val="ListParagraph"/>
-        <w:spacing w:line="276" w:lineRule="auto"/>
-        <w:ind w:left="284"/>
-        <w:jc w:val="both"/>
-        <w:rPr>
-          <w:rFonts w:ascii="Arial" w:hAnsi="Arial" w:cs="Arial"/>
-          <w:sz w:val="20"/>
-          <w:szCs w:val="20"/>
-          <w:lang w:val="fi-FI"/>
-        </w:rPr>
-      </w:pPr>
-      <w:r>
-        <w:rPr>
-          <w:rFonts w:ascii="Arial" w:hAnsi="Arial" w:cs="Arial"/>
-          <w:sz w:val="20"/>
-          <w:szCs w:val="20"/>
-          <w:lang w:val="en-US"/>
-        </w:rPr>
-        <w:tab/>
-      </w:r>
-      <w:r>
-        <w:rPr>
-          <w:rFonts w:ascii="Arial" w:hAnsi="Arial" w:cs="Arial"/>
-          <w:sz w:val="20"/>
-          <w:szCs w:val="20"/>
-          <w:lang w:val="en-US"/>
-        </w:rPr>
-        <w:tab/>
-      </w:r>
-      <w:r>
-        <w:rPr>
-          <w:rFonts w:ascii="Arial" w:hAnsi="Arial" w:cs="Arial"/>
-          <w:sz w:val="20"/>
-          <w:szCs w:val="20"/>
-          <w:lang w:val="en-US"/>
-        </w:rPr>
-        <w:tab/>
-      </w:r>
-      <w:r>
-        <w:rPr>
-          <w:rFonts w:ascii="Arial" w:hAnsi="Arial" w:cs="Arial"/>
-          <w:sz w:val="20"/>
-          <w:szCs w:val="20"/>
-          <w:lang w:val="en-US"/>
-        </w:rPr>
-        <w:tab/>
-        <w:t xml:space="preserve">   </w:t>
-      </w:r>
-      <w:r>
-        <w:rPr>
-          <w:rFonts w:ascii="Arial" w:hAnsi="Arial" w:cs="Arial"/>
-          <w:sz w:val="20"/>
-          <w:szCs w:val="20"/>
-          <w:lang w:val="fi-FI"/>
-        </w:rPr>
-        <w:t>................................................................................................</w:t>
-      </w:r>
-      <w:r>
-        <w:rPr>
-          <w:rFonts w:ascii="Arial" w:hAnsi="Arial" w:cs="Arial"/>
-          <w:sz w:val="20"/>
-          <w:szCs w:val="20"/>
-          <w:lang w:val="id-ID"/>
-        </w:rPr>
-        <w:t>.</w:t>
-      </w:r>
-      <w:r>
-        <w:rPr>
-          <w:rFonts w:ascii="Arial" w:hAnsi="Arial" w:cs="Arial"/>
-          <w:sz w:val="20"/>
-          <w:szCs w:val="20"/>
-          <w:lang w:val="en-US"/>
-        </w:rPr>
-        <w:t>................................</w:t>
-      </w:r>
-      <w:r>
-        <w:rPr>
-          <w:rFonts w:ascii="Arial" w:hAnsi="Arial" w:cs="Arial"/>
-          <w:sz w:val="20"/>
-          <w:szCs w:val="20"/>
-          <w:lang w:val="en-US"/>
-        </w:rPr>
-        <w:t>.</w:t>
-      </w:r>
-      <w:r>
-        <w:rPr>
-          <w:rFonts w:ascii="Arial" w:hAnsi="Arial" w:cs="Arial"/>
-          <w:sz w:val="20"/>
-          <w:szCs w:val="20"/>
-          <w:lang w:val="fi-FI"/>
-        </w:rPr>
-        <w:t xml:space="preserve">     </w:t>
+        <w:t xml:space="preserve">:  </w:t>
+      </w:r>
+      <w:r>
+        <w:rPr>
+          <w:rFonts w:ascii="Arial" w:hAnsi="Arial" w:cs="Arial"/>
+          <w:sz w:val="20"/>
+          <w:szCs w:val="20"/>
+          <w:lang w:val="fi-FI"/>
+        </w:rPr>
+        <w:t>{alamat_saksi_1}</w:t>
       </w:r>
     </w:p>
     <w:p>
@@ -737,14 +728,6 @@
           <w:lang w:val="fi-FI"/>
         </w:rPr>
         <w:tab/>
-      </w:r>
-      <w:r>
-        <w:rPr>
-          <w:rFonts w:ascii="Arial" w:hAnsi="Arial" w:cs="Arial"/>
-          <w:sz w:val="20"/>
-          <w:szCs w:val="20"/>
-          <w:lang w:val="fi-FI"/>
-        </w:rPr>
         <w:t xml:space="preserve">:  </w:t>
       </w:r>
       <w:r>
@@ -754,34 +737,25 @@
           <w:szCs w:val="20"/>
           <w:lang w:val="fi-FI"/>
         </w:rPr>
-        <w:t>................................................................................................</w:t>
-      </w:r>
-      <w:r>
-        <w:rPr>
-          <w:rFonts w:ascii="Arial" w:hAnsi="Arial" w:cs="Arial"/>
-          <w:sz w:val="20"/>
-          <w:szCs w:val="20"/>
-          <w:lang w:val="id-ID"/>
-        </w:rPr>
-        <w:t>.</w:t>
-      </w:r>
-      <w:r>
-        <w:rPr>
-          <w:rFonts w:ascii="Arial" w:hAnsi="Arial" w:cs="Arial"/>
-          <w:sz w:val="20"/>
-          <w:szCs w:val="20"/>
-          <w:lang w:val="en-US"/>
-        </w:rPr>
-        <w:t>................................</w:t>
-      </w:r>
-      <w:r>
-        <w:rPr>
-          <w:rFonts w:ascii="Arial" w:hAnsi="Arial" w:cs="Arial"/>
-          <w:sz w:val="20"/>
-          <w:szCs w:val="20"/>
-          <w:lang w:val="en-US"/>
-        </w:rPr>
-        <w:t>.</w:t>
+        <w:t>{nama_saksi_</w:t>
+      </w:r>
+      <w:r>
+        <w:rPr>
+          <w:rFonts w:ascii="Arial" w:hAnsi="Arial" w:cs="Arial"/>
+          <w:sz w:val="20"/>
+          <w:szCs w:val="20"/>
+          <w:lang w:val="fi-FI"/>
+        </w:rPr>
+        <w:t>2</w:t>
+      </w:r>
+      <w:r>
+        <w:rPr>
+          <w:rFonts w:ascii="Arial" w:hAnsi="Arial" w:cs="Arial"/>
+          <w:sz w:val="20"/>
+          <w:szCs w:val="20"/>
+          <w:lang w:val="fi-FI"/>
+        </w:rPr>
+        <w:t>}</w:t>
       </w:r>
     </w:p>
     <w:p>
@@ -823,43 +797,34 @@
           <w:szCs w:val="20"/>
           <w:lang w:val="fi-FI"/>
         </w:rPr>
-        <w:t>................................................................................................</w:t>
-      </w:r>
-      <w:r>
-        <w:rPr>
-          <w:rFonts w:ascii="Arial" w:hAnsi="Arial" w:cs="Arial"/>
-          <w:sz w:val="20"/>
-          <w:szCs w:val="20"/>
-          <w:lang w:val="id-ID"/>
-        </w:rPr>
-        <w:t>.</w:t>
-      </w:r>
-      <w:r>
-        <w:rPr>
-          <w:rFonts w:ascii="Arial" w:hAnsi="Arial" w:cs="Arial"/>
-          <w:sz w:val="20"/>
-          <w:szCs w:val="20"/>
-          <w:lang w:val="en-US"/>
-        </w:rPr>
-        <w:t>................................</w:t>
-      </w:r>
-      <w:r>
-        <w:rPr>
-          <w:rFonts w:ascii="Arial" w:hAnsi="Arial" w:cs="Arial"/>
-          <w:sz w:val="20"/>
-          <w:szCs w:val="20"/>
-          <w:lang w:val="en-US"/>
-        </w:rPr>
-        <w:t>.</w:t>
-      </w:r>
-      <w:r>
-        <w:rPr>
-          <w:rFonts w:ascii="Arial" w:hAnsi="Arial" w:cs="Arial"/>
-          <w:sz w:val="20"/>
-          <w:szCs w:val="20"/>
-          <w:lang w:val="fi-FI"/>
-        </w:rPr>
-        <w:t xml:space="preserve">                            </w:t>
+        <w:t>{tempat_lahir_saksi_2}, {tanggal_lahir_saksi_</w:t>
+      </w:r>
+      <w:r>
+        <w:rPr>
+          <w:rFonts w:ascii="Arial" w:hAnsi="Arial" w:cs="Arial"/>
+          <w:sz w:val="20"/>
+          <w:szCs w:val="20"/>
+          <w:lang w:val="fi-FI"/>
+        </w:rPr>
+        <w:t>2</w:t>
+      </w:r>
+      <w:r>
+        <w:rPr>
+          <w:rFonts w:ascii="Arial" w:hAnsi="Arial" w:cs="Arial"/>
+          <w:sz w:val="20"/>
+          <w:szCs w:val="20"/>
+          <w:lang w:val="fi-FI"/>
+        </w:rPr>
+        <w:t>}</w:t>
+      </w:r>
+      <w:r>
+        <w:rPr>
+          <w:rFonts w:ascii="Arial" w:hAnsi="Arial" w:cs="Arial"/>
+          <w:sz w:val="20"/>
+          <w:szCs w:val="20"/>
+          <w:lang w:val="fi-FI"/>
+        </w:rPr>
+        <w:t xml:space="preserve">                           </w:t>
       </w:r>
     </w:p>
     <w:p>
@@ -919,14 +884,6 @@
           <w:lang w:val="fi-FI"/>
         </w:rPr>
         <w:tab/>
-      </w:r>
-      <w:r>
-        <w:rPr>
-          <w:rFonts w:ascii="Arial" w:hAnsi="Arial" w:cs="Arial"/>
-          <w:sz w:val="20"/>
-          <w:szCs w:val="20"/>
-          <w:lang w:val="fi-FI"/>
-        </w:rPr>
         <w:t xml:space="preserve">:  </w:t>
       </w:r>
       <w:r>
@@ -936,34 +893,25 @@
           <w:szCs w:val="20"/>
           <w:lang w:val="fi-FI"/>
         </w:rPr>
-        <w:t>................................................................................................</w:t>
-      </w:r>
-      <w:r>
-        <w:rPr>
-          <w:rFonts w:ascii="Arial" w:hAnsi="Arial" w:cs="Arial"/>
-          <w:sz w:val="20"/>
-          <w:szCs w:val="20"/>
-          <w:lang w:val="id-ID"/>
-        </w:rPr>
-        <w:t>.</w:t>
-      </w:r>
-      <w:r>
-        <w:rPr>
-          <w:rFonts w:ascii="Arial" w:hAnsi="Arial" w:cs="Arial"/>
-          <w:sz w:val="20"/>
-          <w:szCs w:val="20"/>
-          <w:lang w:val="en-US"/>
-        </w:rPr>
-        <w:t>................................</w:t>
-      </w:r>
-      <w:r>
-        <w:rPr>
-          <w:rFonts w:ascii="Arial" w:hAnsi="Arial" w:cs="Arial"/>
-          <w:sz w:val="20"/>
-          <w:szCs w:val="20"/>
-          <w:lang w:val="en-US"/>
-        </w:rPr>
-        <w:t>.</w:t>
+        <w:t>{nik_saksi_</w:t>
+      </w:r>
+      <w:r>
+        <w:rPr>
+          <w:rFonts w:ascii="Arial" w:hAnsi="Arial" w:cs="Arial"/>
+          <w:sz w:val="20"/>
+          <w:szCs w:val="20"/>
+          <w:lang w:val="fi-FI"/>
+        </w:rPr>
+        <w:t>2</w:t>
+      </w:r>
+      <w:r>
+        <w:rPr>
+          <w:rFonts w:ascii="Arial" w:hAnsi="Arial" w:cs="Arial"/>
+          <w:sz w:val="20"/>
+          <w:szCs w:val="20"/>
+          <w:lang w:val="fi-FI"/>
+        </w:rPr>
+        <w:t>}</w:t>
       </w:r>
     </w:p>
     <w:p>
@@ -1014,14 +962,6 @@
           <w:lang w:val="fi-FI"/>
         </w:rPr>
         <w:tab/>
-      </w:r>
-      <w:r>
-        <w:rPr>
-          <w:rFonts w:ascii="Arial" w:hAnsi="Arial" w:cs="Arial"/>
-          <w:sz w:val="20"/>
-          <w:szCs w:val="20"/>
-          <w:lang w:val="fi-FI"/>
-        </w:rPr>
         <w:t xml:space="preserve">: </w:t>
       </w:r>
       <w:r>
@@ -1031,43 +971,25 @@
           <w:szCs w:val="20"/>
           <w:lang w:val="fi-FI"/>
         </w:rPr>
-        <w:t xml:space="preserve"> </w:t>
-      </w:r>
-      <w:r>
-        <w:rPr>
-          <w:rFonts w:ascii="Arial" w:hAnsi="Arial" w:cs="Arial"/>
-          <w:sz w:val="20"/>
-          <w:szCs w:val="20"/>
-          <w:lang w:val="fi-FI"/>
-        </w:rPr>
-        <w:t>................................................................................................</w:t>
-      </w:r>
-      <w:r>
-        <w:rPr>
-          <w:rFonts w:ascii="Arial" w:hAnsi="Arial" w:cs="Arial"/>
-          <w:sz w:val="20"/>
-          <w:szCs w:val="20"/>
-          <w:lang w:val="id-ID"/>
-        </w:rPr>
-        <w:t>.</w:t>
-      </w:r>
-      <w:r>
-        <w:rPr>
-          <w:rFonts w:ascii="Arial" w:hAnsi="Arial" w:cs="Arial"/>
-          <w:sz w:val="20"/>
-          <w:szCs w:val="20"/>
-          <w:lang w:val="en-US"/>
-        </w:rPr>
-        <w:t>................................</w:t>
-      </w:r>
-      <w:r>
-        <w:rPr>
-          <w:rFonts w:ascii="Arial" w:hAnsi="Arial" w:cs="Arial"/>
-          <w:sz w:val="20"/>
-          <w:szCs w:val="20"/>
-          <w:lang w:val="en-US"/>
-        </w:rPr>
-        <w:t>.</w:t>
+        <w:t xml:space="preserve"> {pekerjaan_saksi_</w:t>
+      </w:r>
+      <w:r>
+        <w:rPr>
+          <w:rFonts w:ascii="Arial" w:hAnsi="Arial" w:cs="Arial"/>
+          <w:sz w:val="20"/>
+          <w:szCs w:val="20"/>
+          <w:lang w:val="fi-FI"/>
+        </w:rPr>
+        <w:t>2</w:t>
+      </w:r>
+      <w:r>
+        <w:rPr>
+          <w:rFonts w:ascii="Arial" w:hAnsi="Arial" w:cs="Arial"/>
+          <w:sz w:val="20"/>
+          <w:szCs w:val="20"/>
+          <w:lang w:val="fi-FI"/>
+        </w:rPr>
+        <w:t>}</w:t>
       </w:r>
     </w:p>
     <w:p>
@@ -1080,7 +1002,7 @@
           <w:rFonts w:ascii="Arial" w:hAnsi="Arial" w:cs="Arial"/>
           <w:sz w:val="20"/>
           <w:szCs w:val="20"/>
-          <w:lang w:val="en-US"/>
+          <w:lang w:val="fi-FI"/>
         </w:rPr>
       </w:pPr>
       <w:r>
@@ -1118,129 +1040,34 @@
           <w:lang w:val="fi-FI"/>
         </w:rPr>
         <w:tab/>
-      </w:r>
-      <w:r>
-        <w:rPr>
-          <w:rFonts w:ascii="Arial" w:hAnsi="Arial" w:cs="Arial"/>
-          <w:sz w:val="20"/>
-          <w:szCs w:val="20"/>
-          <w:lang w:val="fi-FI"/>
-        </w:rPr>
-        <w:t>:  ................................................................................................</w:t>
-      </w:r>
-      <w:r>
-        <w:rPr>
-          <w:rFonts w:ascii="Arial" w:hAnsi="Arial" w:cs="Arial"/>
-          <w:sz w:val="20"/>
-          <w:szCs w:val="20"/>
-          <w:lang w:val="id-ID"/>
-        </w:rPr>
-        <w:t>.</w:t>
-      </w:r>
-      <w:r>
-        <w:rPr>
-          <w:rFonts w:ascii="Arial" w:hAnsi="Arial" w:cs="Arial"/>
-          <w:sz w:val="20"/>
-          <w:szCs w:val="20"/>
-          <w:lang w:val="en-US"/>
-        </w:rPr>
-        <w:t>.................................</w:t>
-      </w:r>
-    </w:p>
-    <w:p>
-      <w:pPr>
-        <w:pStyle w:val="ListParagraph"/>
-        <w:spacing w:line="276" w:lineRule="auto"/>
-        <w:ind w:left="284"/>
-        <w:jc w:val="both"/>
-        <w:rPr>
-          <w:rFonts w:ascii="Arial" w:hAnsi="Arial" w:cs="Arial"/>
-          <w:sz w:val="20"/>
-          <w:szCs w:val="20"/>
-          <w:lang w:val="fi-FI"/>
-        </w:rPr>
-      </w:pPr>
-      <w:r>
-        <w:rPr>
-          <w:rFonts w:ascii="Arial" w:hAnsi="Arial" w:cs="Arial"/>
-          <w:sz w:val="20"/>
-          <w:szCs w:val="20"/>
-          <w:lang w:val="en-US"/>
-        </w:rPr>
-        <w:tab/>
-      </w:r>
-      <w:r>
-        <w:rPr>
-          <w:rFonts w:ascii="Arial" w:hAnsi="Arial" w:cs="Arial"/>
-          <w:sz w:val="20"/>
-          <w:szCs w:val="20"/>
-          <w:lang w:val="en-US"/>
-        </w:rPr>
-        <w:tab/>
-      </w:r>
-      <w:r>
-        <w:rPr>
-          <w:rFonts w:ascii="Arial" w:hAnsi="Arial" w:cs="Arial"/>
-          <w:sz w:val="20"/>
-          <w:szCs w:val="20"/>
-          <w:lang w:val="en-US"/>
-        </w:rPr>
-        <w:tab/>
-      </w:r>
-      <w:r>
-        <w:rPr>
-          <w:rFonts w:ascii="Arial" w:hAnsi="Arial" w:cs="Arial"/>
-          <w:sz w:val="20"/>
-          <w:szCs w:val="20"/>
-          <w:lang w:val="en-US"/>
-        </w:rPr>
-        <w:tab/>
-        <w:t xml:space="preserve">   </w:t>
-      </w:r>
-      <w:r>
-        <w:rPr>
-          <w:rFonts w:ascii="Arial" w:hAnsi="Arial" w:cs="Arial"/>
-          <w:sz w:val="20"/>
-          <w:szCs w:val="20"/>
-          <w:lang w:val="fi-FI"/>
-        </w:rPr>
-        <w:t>................................................................................................</w:t>
-      </w:r>
-      <w:r>
-        <w:rPr>
-          <w:rFonts w:ascii="Arial" w:hAnsi="Arial" w:cs="Arial"/>
-          <w:sz w:val="20"/>
-          <w:szCs w:val="20"/>
-          <w:lang w:val="id-ID"/>
-        </w:rPr>
-        <w:t>.</w:t>
-      </w:r>
-      <w:r>
-        <w:rPr>
-          <w:rFonts w:ascii="Arial" w:hAnsi="Arial" w:cs="Arial"/>
-          <w:sz w:val="20"/>
-          <w:szCs w:val="20"/>
-          <w:lang w:val="en-US"/>
-        </w:rPr>
-        <w:t>................................</w:t>
-      </w:r>
-      <w:r>
-        <w:rPr>
-          <w:rFonts w:ascii="Arial" w:hAnsi="Arial" w:cs="Arial"/>
-          <w:sz w:val="20"/>
-          <w:szCs w:val="20"/>
-          <w:lang w:val="en-US"/>
-        </w:rPr>
-        <w:t>.</w:t>
-      </w:r>
-      <w:r>
-        <w:rPr>
-          <w:rFonts w:ascii="Arial" w:hAnsi="Arial" w:cs="Arial"/>
-          <w:sz w:val="20"/>
-          <w:szCs w:val="20"/>
-          <w:lang w:val="fi-FI"/>
-        </w:rPr>
-        <w:t xml:space="preserve">          </w:t>
+        <w:t xml:space="preserve">:  </w:t>
+      </w:r>
+      <w:r>
+        <w:rPr>
+          <w:rFonts w:ascii="Arial" w:hAnsi="Arial" w:cs="Arial"/>
+          <w:sz w:val="20"/>
+          <w:szCs w:val="20"/>
+          <w:lang w:val="fi-FI"/>
+        </w:rPr>
+        <w:t>{alamat_saksi_</w:t>
+      </w:r>
+      <w:r>
+        <w:rPr>
+          <w:rFonts w:ascii="Arial" w:hAnsi="Arial" w:cs="Arial"/>
+          <w:sz w:val="20"/>
+          <w:szCs w:val="20"/>
+          <w:lang w:val="fi-FI"/>
+        </w:rPr>
+        <w:t>2</w:t>
+      </w:r>
+      <w:r>
+        <w:rPr>
+          <w:rFonts w:ascii="Arial" w:hAnsi="Arial" w:cs="Arial"/>
+          <w:sz w:val="20"/>
+          <w:szCs w:val="20"/>
+          <w:lang w:val="fi-FI"/>
+        </w:rPr>
+        <w:t>}</w:t>
       </w:r>
     </w:p>
     <w:p>
@@ -1449,43 +1276,7 @@
           <w:szCs w:val="20"/>
           <w:lang w:val="fi-FI"/>
         </w:rPr>
-        <w:t>...............................................................................................</w:t>
-      </w:r>
-      <w:r>
-        <w:rPr>
-          <w:rFonts w:ascii="Arial" w:hAnsi="Arial" w:cs="Arial"/>
-          <w:sz w:val="20"/>
-          <w:szCs w:val="20"/>
-          <w:lang w:val="id-ID"/>
-        </w:rPr>
-        <w:t>.</w:t>
-      </w:r>
-      <w:r>
-        <w:rPr>
-          <w:rFonts w:ascii="Arial" w:hAnsi="Arial" w:cs="Arial"/>
-          <w:sz w:val="20"/>
-          <w:szCs w:val="20"/>
-          <w:lang w:val="en-US"/>
-        </w:rPr>
-        <w:t>................................</w:t>
-      </w:r>
-      <w:r>
-        <w:rPr>
-          <w:rFonts w:ascii="Arial" w:hAnsi="Arial" w:cs="Arial"/>
-          <w:sz w:val="20"/>
-          <w:szCs w:val="20"/>
-          <w:lang w:val="en-US"/>
-        </w:rPr>
-        <w:t>.</w:t>
-      </w:r>
-      <w:r>
-        <w:rPr>
-          <w:rFonts w:ascii="Arial" w:hAnsi="Arial" w:cs="Arial"/>
-          <w:sz w:val="20"/>
-          <w:szCs w:val="20"/>
-          <w:lang w:val="fi-FI"/>
-        </w:rPr>
-        <w:t>.</w:t>
+        <w:t>{nama_almarhum}</w:t>
       </w:r>
     </w:p>
     <w:p>
@@ -1544,43 +1335,7 @@
           <w:szCs w:val="20"/>
           <w:lang w:val="fi-FI"/>
         </w:rPr>
-        <w:t>................................................................................................</w:t>
-      </w:r>
-      <w:r>
-        <w:rPr>
-          <w:rFonts w:ascii="Arial" w:hAnsi="Arial" w:cs="Arial"/>
-          <w:sz w:val="20"/>
-          <w:szCs w:val="20"/>
-          <w:lang w:val="id-ID"/>
-        </w:rPr>
-        <w:t>.</w:t>
-      </w:r>
-      <w:r>
-        <w:rPr>
-          <w:rFonts w:ascii="Arial" w:hAnsi="Arial" w:cs="Arial"/>
-          <w:sz w:val="20"/>
-          <w:szCs w:val="20"/>
-          <w:lang w:val="en-US"/>
-        </w:rPr>
-        <w:t>................................</w:t>
-      </w:r>
-      <w:r>
-        <w:rPr>
-          <w:rFonts w:ascii="Arial" w:hAnsi="Arial" w:cs="Arial"/>
-          <w:sz w:val="20"/>
-          <w:szCs w:val="20"/>
-          <w:lang w:val="en-US"/>
-        </w:rPr>
-        <w:t>.</w:t>
-      </w:r>
-      <w:r>
-        <w:rPr>
-          <w:rFonts w:ascii="Arial" w:hAnsi="Arial" w:cs="Arial"/>
-          <w:sz w:val="20"/>
-          <w:szCs w:val="20"/>
-          <w:lang w:val="fi-FI"/>
-        </w:rPr>
-        <w:t xml:space="preserve">                            </w:t>
+        <w:t>{tempat_lahir_almarhum},{tanggal_lahir_almarhum}</w:t>
       </w:r>
     </w:p>
     <w:p>
@@ -1649,34 +1404,7 @@
           <w:szCs w:val="20"/>
           <w:lang w:val="fi-FI"/>
         </w:rPr>
-        <w:t>................................................................................................</w:t>
-      </w:r>
-      <w:r>
-        <w:rPr>
-          <w:rFonts w:ascii="Arial" w:hAnsi="Arial" w:cs="Arial"/>
-          <w:sz w:val="20"/>
-          <w:szCs w:val="20"/>
-          <w:lang w:val="id-ID"/>
-        </w:rPr>
-        <w:t>.</w:t>
-      </w:r>
-      <w:r>
-        <w:rPr>
-          <w:rFonts w:ascii="Arial" w:hAnsi="Arial" w:cs="Arial"/>
-          <w:sz w:val="20"/>
-          <w:szCs w:val="20"/>
-          <w:lang w:val="en-US"/>
-        </w:rPr>
-        <w:t>................................</w:t>
-      </w:r>
-      <w:r>
-        <w:rPr>
-          <w:rFonts w:ascii="Arial" w:hAnsi="Arial" w:cs="Arial"/>
-          <w:sz w:val="20"/>
-          <w:szCs w:val="20"/>
-          <w:lang w:val="en-US"/>
-        </w:rPr>
-        <w:t>.</w:t>
+        <w:t>{nik_almarhum}</w:t>
       </w:r>
     </w:p>
     <w:p>
@@ -1754,34 +1482,7 @@
           <w:szCs w:val="20"/>
           <w:lang w:val="fi-FI"/>
         </w:rPr>
-        <w:t>................................................................................................</w:t>
-      </w:r>
-      <w:r>
-        <w:rPr>
-          <w:rFonts w:ascii="Arial" w:hAnsi="Arial" w:cs="Arial"/>
-          <w:sz w:val="20"/>
-          <w:szCs w:val="20"/>
-          <w:lang w:val="id-ID"/>
-        </w:rPr>
-        <w:t>.</w:t>
-      </w:r>
-      <w:r>
-        <w:rPr>
-          <w:rFonts w:ascii="Arial" w:hAnsi="Arial" w:cs="Arial"/>
-          <w:sz w:val="20"/>
-          <w:szCs w:val="20"/>
-          <w:lang w:val="en-US"/>
-        </w:rPr>
-        <w:t>................................</w:t>
-      </w:r>
-      <w:r>
-        <w:rPr>
-          <w:rFonts w:ascii="Arial" w:hAnsi="Arial" w:cs="Arial"/>
-          <w:sz w:val="20"/>
-          <w:szCs w:val="20"/>
-          <w:lang w:val="en-US"/>
-        </w:rPr>
-        <w:t>.</w:t>
+        <w:t>{pekerjaan_almarhum}</w:t>
       </w:r>
     </w:p>
     <w:p>
@@ -1839,110 +1540,35 @@
           <w:lang w:val="fi-FI"/>
         </w:rPr>
         <w:tab/>
-        <w:t>:  ................................................................................................</w:t>
-      </w:r>
-      <w:r>
-        <w:rPr>
-          <w:rFonts w:ascii="Arial" w:hAnsi="Arial" w:cs="Arial"/>
-          <w:sz w:val="20"/>
-          <w:szCs w:val="20"/>
-          <w:lang w:val="id-ID"/>
-        </w:rPr>
-        <w:t>.</w:t>
-      </w:r>
-      <w:r>
-        <w:rPr>
-          <w:rFonts w:ascii="Arial" w:hAnsi="Arial" w:cs="Arial"/>
-          <w:sz w:val="20"/>
-          <w:szCs w:val="20"/>
-          <w:lang w:val="en-US"/>
-        </w:rPr>
-        <w:t>................................</w:t>
-      </w:r>
-      <w:r>
-        <w:rPr>
-          <w:rFonts w:ascii="Arial" w:hAnsi="Arial" w:cs="Arial"/>
-          <w:sz w:val="20"/>
-          <w:szCs w:val="20"/>
-          <w:lang w:val="en-US"/>
-        </w:rPr>
-        <w:t>.</w:t>
-      </w:r>
-      <w:r>
-        <w:rPr>
-          <w:rFonts w:ascii="Arial" w:hAnsi="Arial" w:cs="Arial"/>
-          <w:sz w:val="20"/>
-          <w:szCs w:val="20"/>
-          <w:lang w:val="fi-FI"/>
-        </w:rPr>
-        <w:t xml:space="preserve">  </w:t>
-      </w:r>
-    </w:p>
-    <w:p>
-      <w:pPr>
-        <w:spacing w:line="276" w:lineRule="auto"/>
-        <w:jc w:val="both"/>
-        <w:rPr>
-          <w:rFonts w:ascii="Arial" w:hAnsi="Arial" w:cs="Arial"/>
-          <w:sz w:val="20"/>
-          <w:szCs w:val="20"/>
-          <w:lang w:val="fi-FI"/>
-        </w:rPr>
-      </w:pPr>
-      <w:r>
-        <w:rPr>
-          <w:rFonts w:ascii="Arial" w:hAnsi="Arial" w:cs="Arial"/>
-          <w:sz w:val="20"/>
-          <w:szCs w:val="20"/>
-          <w:lang w:val="fi-FI"/>
-        </w:rPr>
-        <w:tab/>
-      </w:r>
-      <w:r>
-        <w:rPr>
-          <w:rFonts w:ascii="Arial" w:hAnsi="Arial" w:cs="Arial"/>
-          <w:sz w:val="20"/>
-          <w:szCs w:val="20"/>
-          <w:lang w:val="fi-FI"/>
-        </w:rPr>
-        <w:tab/>
-      </w:r>
-      <w:r>
-        <w:rPr>
-          <w:rFonts w:ascii="Arial" w:hAnsi="Arial" w:cs="Arial"/>
-          <w:sz w:val="20"/>
-          <w:szCs w:val="20"/>
-          <w:lang w:val="fi-FI"/>
-        </w:rPr>
-        <w:tab/>
-      </w:r>
-      <w:r>
-        <w:rPr>
-          <w:rFonts w:ascii="Arial" w:hAnsi="Arial" w:cs="Arial"/>
-          <w:sz w:val="20"/>
-          <w:szCs w:val="20"/>
-          <w:lang w:val="fi-FI"/>
-        </w:rPr>
-        <w:tab/>
-        <w:t xml:space="preserve">   ..................................................................................................</w:t>
-      </w:r>
-      <w:r>
-        <w:rPr>
-          <w:rFonts w:ascii="Arial" w:hAnsi="Arial" w:cs="Arial"/>
-          <w:sz w:val="20"/>
-          <w:szCs w:val="20"/>
-          <w:lang w:val="fi-FI"/>
-        </w:rPr>
-        <w:t>................................</w:t>
-      </w:r>
-      <w:r>
-        <w:rPr>
-          <w:rFonts w:ascii="Arial" w:hAnsi="Arial" w:cs="Arial"/>
-          <w:sz w:val="20"/>
-          <w:szCs w:val="20"/>
-          <w:lang w:val="fi-FI"/>
-        </w:rPr>
-        <w:t xml:space="preserve">  </w:t>
+        <w:t xml:space="preserve">:  </w:t>
+      </w:r>
+      <w:r>
+        <w:rPr>
+          <w:rFonts w:ascii="Arial" w:hAnsi="Arial" w:cs="Arial"/>
+          <w:sz w:val="20"/>
+          <w:szCs w:val="20"/>
+          <w:lang w:val="fi-FI"/>
+        </w:rPr>
+        <w:t>{alamat_almarhum}</w:t>
+      </w:r>
+      <w:r>
+        <w:rPr>
+          <w:rFonts w:ascii="Arial" w:hAnsi="Arial" w:cs="Arial"/>
+          <w:sz w:val="20"/>
+          <w:szCs w:val="20"/>
+          <w:lang w:val="fi-FI"/>
+        </w:rPr>
+        <w:tab/>
+      </w:r>
+      <w:r>
+        <w:rPr>
+          <w:rFonts w:ascii="Arial" w:hAnsi="Arial" w:cs="Arial"/>
+          <w:sz w:val="20"/>
+          <w:szCs w:val="20"/>
+          <w:lang w:val="fi-FI"/>
+        </w:rPr>
+        <w:tab/>
+        <w:t xml:space="preserve">   </w:t>
       </w:r>
     </w:p>
     <w:p>
@@ -2043,43 +1669,16 @@
           <w:lang w:val="fi-FI"/>
         </w:rPr>
         <w:tab/>
-        <w:t>:  ...............................................................................................</w:t>
-      </w:r>
-      <w:r>
-        <w:rPr>
-          <w:rFonts w:ascii="Arial" w:hAnsi="Arial" w:cs="Arial"/>
-          <w:sz w:val="20"/>
-          <w:szCs w:val="20"/>
-          <w:lang w:val="id-ID"/>
-        </w:rPr>
-        <w:t>.</w:t>
-      </w:r>
-      <w:r>
-        <w:rPr>
-          <w:rFonts w:ascii="Arial" w:hAnsi="Arial" w:cs="Arial"/>
-          <w:sz w:val="20"/>
-          <w:szCs w:val="20"/>
-          <w:lang w:val="en-US"/>
-        </w:rPr>
-        <w:t>................................</w:t>
-      </w:r>
-      <w:r>
-        <w:rPr>
-          <w:rFonts w:ascii="Arial" w:hAnsi="Arial" w:cs="Arial"/>
-          <w:sz w:val="20"/>
-          <w:szCs w:val="20"/>
-          <w:lang w:val="en-US"/>
-        </w:rPr>
-        <w:t>.</w:t>
-      </w:r>
-      <w:r>
-        <w:rPr>
-          <w:rFonts w:ascii="Arial" w:hAnsi="Arial" w:cs="Arial"/>
-          <w:sz w:val="20"/>
-          <w:szCs w:val="20"/>
-          <w:lang w:val="fi-FI"/>
-        </w:rPr>
-        <w:t>.</w:t>
+        <w:t xml:space="preserve">:  </w:t>
+      </w:r>
+      <w:r>
+        <w:rPr>
+          <w:rFonts w:ascii="Arial" w:hAnsi="Arial" w:cs="Arial"/>
+          <w:sz w:val="20"/>
+          <w:szCs w:val="20"/>
+          <w:lang w:val="fi-FI"/>
+        </w:rPr>
+        <w:t>{nama_ayah_almarhum}</w:t>
       </w:r>
     </w:p>
     <w:p>
@@ -2112,43 +1711,16 @@
           <w:lang w:val="fi-FI"/>
         </w:rPr>
         <w:tab/>
-        <w:t>:  ................................................................................................</w:t>
-      </w:r>
-      <w:r>
-        <w:rPr>
-          <w:rFonts w:ascii="Arial" w:hAnsi="Arial" w:cs="Arial"/>
-          <w:sz w:val="20"/>
-          <w:szCs w:val="20"/>
-          <w:lang w:val="id-ID"/>
-        </w:rPr>
-        <w:t>.</w:t>
-      </w:r>
-      <w:r>
-        <w:rPr>
-          <w:rFonts w:ascii="Arial" w:hAnsi="Arial" w:cs="Arial"/>
-          <w:sz w:val="20"/>
-          <w:szCs w:val="20"/>
-          <w:lang w:val="en-US"/>
-        </w:rPr>
-        <w:t>................................</w:t>
-      </w:r>
-      <w:r>
-        <w:rPr>
-          <w:rFonts w:ascii="Arial" w:hAnsi="Arial" w:cs="Arial"/>
-          <w:sz w:val="20"/>
-          <w:szCs w:val="20"/>
-          <w:lang w:val="en-US"/>
-        </w:rPr>
-        <w:t>.</w:t>
-      </w:r>
-      <w:r>
-        <w:rPr>
-          <w:rFonts w:ascii="Arial" w:hAnsi="Arial" w:cs="Arial"/>
-          <w:sz w:val="20"/>
-          <w:szCs w:val="20"/>
-          <w:lang w:val="fi-FI"/>
-        </w:rPr>
-        <w:t xml:space="preserve">                            </w:t>
+        <w:t xml:space="preserve">:  </w:t>
+      </w:r>
+      <w:r>
+        <w:rPr>
+          <w:rFonts w:ascii="Arial" w:hAnsi="Arial" w:cs="Arial"/>
+          <w:sz w:val="20"/>
+          <w:szCs w:val="20"/>
+          <w:lang w:val="fi-FI"/>
+        </w:rPr>
+        <w:t>{tempat_lahir_ayah_almarhum}, {tanggal_lahir_ayah_almarhum}</w:t>
       </w:r>
     </w:p>
     <w:p>
@@ -2234,34 +1806,7 @@
           <w:szCs w:val="20"/>
           <w:lang w:val="fi-FI"/>
         </w:rPr>
-        <w:t>................................................................................................</w:t>
-      </w:r>
-      <w:r>
-        <w:rPr>
-          <w:rFonts w:ascii="Arial" w:hAnsi="Arial" w:cs="Arial"/>
-          <w:sz w:val="20"/>
-          <w:szCs w:val="20"/>
-          <w:lang w:val="id-ID"/>
-        </w:rPr>
-        <w:t>.</w:t>
-      </w:r>
-      <w:r>
-        <w:rPr>
-          <w:rFonts w:ascii="Arial" w:hAnsi="Arial" w:cs="Arial"/>
-          <w:sz w:val="20"/>
-          <w:szCs w:val="20"/>
-          <w:lang w:val="en-US"/>
-        </w:rPr>
-        <w:t>................................</w:t>
-      </w:r>
-      <w:r>
-        <w:rPr>
-          <w:rFonts w:ascii="Arial" w:hAnsi="Arial" w:cs="Arial"/>
-          <w:sz w:val="20"/>
-          <w:szCs w:val="20"/>
-          <w:lang w:val="en-US"/>
-        </w:rPr>
-        <w:t>.</w:t>
+        <w:t>{pekerjaan_ayah_almarhum}</w:t>
       </w:r>
     </w:p>
     <w:p>
@@ -2292,7 +1837,7 @@
           <w:szCs w:val="20"/>
           <w:lang w:val="fi-FI"/>
         </w:rPr>
-        <w:tab/>
+        <w:t xml:space="preserve"> </w:t>
       </w:r>
       <w:r>
         <w:rPr>
@@ -2319,92 +1864,62 @@
           <w:szCs w:val="20"/>
           <w:lang w:val="fi-FI"/>
         </w:rPr>
-        <w:t>:  ................................................................................................</w:t>
-      </w:r>
-      <w:r>
-        <w:rPr>
-          <w:rFonts w:ascii="Arial" w:hAnsi="Arial" w:cs="Arial"/>
-          <w:sz w:val="20"/>
-          <w:szCs w:val="20"/>
-          <w:lang w:val="id-ID"/>
-        </w:rPr>
-        <w:t>.</w:t>
-      </w:r>
-      <w:r>
-        <w:rPr>
-          <w:rFonts w:ascii="Arial" w:hAnsi="Arial" w:cs="Arial"/>
-          <w:sz w:val="20"/>
-          <w:szCs w:val="20"/>
-          <w:lang w:val="en-US"/>
-        </w:rPr>
-        <w:t>................................</w:t>
-      </w:r>
-      <w:r>
-        <w:rPr>
-          <w:rFonts w:ascii="Arial" w:hAnsi="Arial" w:cs="Arial"/>
-          <w:sz w:val="20"/>
-          <w:szCs w:val="20"/>
-          <w:lang w:val="en-US"/>
-        </w:rPr>
-        <w:t>.</w:t>
-      </w:r>
-      <w:r>
-        <w:rPr>
-          <w:rFonts w:ascii="Arial" w:hAnsi="Arial" w:cs="Arial"/>
-          <w:sz w:val="20"/>
-          <w:szCs w:val="20"/>
-          <w:lang w:val="fi-FI"/>
-        </w:rPr>
-        <w:t xml:space="preserve">  </w:t>
-      </w:r>
-    </w:p>
-    <w:p>
-      <w:pPr>
-        <w:spacing w:line="276" w:lineRule="auto"/>
-        <w:jc w:val="both"/>
-        <w:rPr>
-          <w:rFonts w:ascii="Arial" w:hAnsi="Arial" w:cs="Arial"/>
-          <w:sz w:val="20"/>
-          <w:szCs w:val="20"/>
-          <w:lang w:val="fi-FI"/>
-        </w:rPr>
-      </w:pPr>
-      <w:r>
-        <w:rPr>
-          <w:rFonts w:ascii="Arial" w:hAnsi="Arial" w:cs="Arial"/>
-          <w:sz w:val="20"/>
-          <w:szCs w:val="20"/>
-          <w:lang w:val="fi-FI"/>
-        </w:rPr>
-        <w:tab/>
-      </w:r>
-      <w:r>
-        <w:rPr>
-          <w:rFonts w:ascii="Arial" w:hAnsi="Arial" w:cs="Arial"/>
-          <w:sz w:val="20"/>
-          <w:szCs w:val="20"/>
-          <w:lang w:val="fi-FI"/>
-        </w:rPr>
-        <w:tab/>
-      </w:r>
-      <w:r>
-        <w:rPr>
-          <w:rFonts w:ascii="Arial" w:hAnsi="Arial" w:cs="Arial"/>
-          <w:sz w:val="20"/>
-          <w:szCs w:val="20"/>
-          <w:lang w:val="fi-FI"/>
-        </w:rPr>
-        <w:tab/>
-      </w:r>
-      <w:r>
-        <w:rPr>
-          <w:rFonts w:ascii="Arial" w:hAnsi="Arial" w:cs="Arial"/>
-          <w:sz w:val="20"/>
-          <w:szCs w:val="20"/>
-          <w:lang w:val="fi-FI"/>
-        </w:rPr>
-        <w:tab/>
-        <w:t xml:space="preserve">   .................................................................................................................................</w:t>
+        <w:tab/>
+      </w:r>
+      <w:r>
+        <w:rPr>
+          <w:rFonts w:ascii="Arial" w:hAnsi="Arial" w:cs="Arial"/>
+          <w:sz w:val="20"/>
+          <w:szCs w:val="20"/>
+          <w:lang w:val="fi-FI"/>
+        </w:rPr>
+        <w:t xml:space="preserve">:  </w:t>
+      </w:r>
+      <w:r>
+        <w:rPr>
+          <w:rFonts w:ascii="Arial" w:hAnsi="Arial" w:cs="Arial"/>
+          <w:sz w:val="20"/>
+          <w:szCs w:val="20"/>
+          <w:lang w:val="fi-FI"/>
+        </w:rPr>
+        <w:t>{</w:t>
+      </w:r>
+      <w:r>
+        <w:rPr>
+          <w:rFonts w:ascii="Arial" w:hAnsi="Arial" w:cs="Arial"/>
+          <w:sz w:val="20"/>
+          <w:szCs w:val="20"/>
+          <w:lang w:val="fi-FI"/>
+        </w:rPr>
+        <w:t>alamat_ayah_almarhum</w:t>
+      </w:r>
+      <w:r>
+        <w:rPr>
+          <w:rFonts w:ascii="Arial" w:hAnsi="Arial" w:cs="Arial"/>
+          <w:sz w:val="20"/>
+          <w:szCs w:val="20"/>
+          <w:lang w:val="fi-FI"/>
+        </w:rPr>
+        <w:t>}</w:t>
+      </w:r>
+      <w:r>
+        <w:rPr>
+          <w:rFonts w:ascii="Arial" w:hAnsi="Arial" w:cs="Arial"/>
+          <w:sz w:val="20"/>
+          <w:szCs w:val="20"/>
+          <w:lang w:val="fi-FI"/>
+        </w:rPr>
+        <w:tab/>
+      </w:r>
+      <w:r>
+        <w:rPr>
+          <w:rFonts w:ascii="Arial" w:hAnsi="Arial" w:cs="Arial"/>
+          <w:sz w:val="20"/>
+          <w:szCs w:val="20"/>
+          <w:lang w:val="fi-FI"/>
+        </w:rPr>
+        <w:tab/>
+        <w:t xml:space="preserve">   </w:t>
       </w:r>
     </w:p>
     <w:p>
@@ -2484,43 +1999,34 @@
           <w:lang w:val="fi-FI"/>
         </w:rPr>
         <w:tab/>
-        <w:t>:  ...............................................................................................</w:t>
-      </w:r>
-      <w:r>
-        <w:rPr>
-          <w:rFonts w:ascii="Arial" w:hAnsi="Arial" w:cs="Arial"/>
-          <w:sz w:val="20"/>
-          <w:szCs w:val="20"/>
-          <w:lang w:val="id-ID"/>
-        </w:rPr>
-        <w:t>.</w:t>
-      </w:r>
-      <w:r>
-        <w:rPr>
-          <w:rFonts w:ascii="Arial" w:hAnsi="Arial" w:cs="Arial"/>
-          <w:sz w:val="20"/>
-          <w:szCs w:val="20"/>
-          <w:lang w:val="en-US"/>
-        </w:rPr>
-        <w:t>................................</w:t>
-      </w:r>
-      <w:r>
-        <w:rPr>
-          <w:rFonts w:ascii="Arial" w:hAnsi="Arial" w:cs="Arial"/>
-          <w:sz w:val="20"/>
-          <w:szCs w:val="20"/>
-          <w:lang w:val="en-US"/>
-        </w:rPr>
-        <w:t>.</w:t>
-      </w:r>
-      <w:r>
-        <w:rPr>
-          <w:rFonts w:ascii="Arial" w:hAnsi="Arial" w:cs="Arial"/>
-          <w:sz w:val="20"/>
-          <w:szCs w:val="20"/>
-          <w:lang w:val="fi-FI"/>
-        </w:rPr>
-        <w:t>.</w:t>
+        <w:t xml:space="preserve">:  </w:t>
+      </w:r>
+      <w:r>
+        <w:rPr>
+          <w:rFonts w:ascii="Arial" w:hAnsi="Arial" w:cs="Arial"/>
+          <w:sz w:val="20"/>
+          <w:szCs w:val="20"/>
+          <w:lang w:val="fi-FI"/>
+        </w:rPr>
+        <w:t>{nama_</w:t>
+      </w:r>
+      <w:r>
+        <w:rPr>
+          <w:rFonts w:ascii="Arial" w:hAnsi="Arial" w:cs="Arial"/>
+          <w:sz w:val="20"/>
+          <w:szCs w:val="20"/>
+          <w:lang w:val="fi-FI"/>
+        </w:rPr>
+        <w:t>ibu</w:t>
+      </w:r>
+      <w:r>
+        <w:rPr>
+          <w:rFonts w:ascii="Arial" w:hAnsi="Arial" w:cs="Arial"/>
+          <w:sz w:val="20"/>
+          <w:szCs w:val="20"/>
+          <w:lang w:val="fi-FI"/>
+        </w:rPr>
+        <w:t>_almarhum}</w:t>
       </w:r>
     </w:p>
     <w:p>
@@ -2553,43 +2059,52 @@
           <w:lang w:val="fi-FI"/>
         </w:rPr>
         <w:tab/>
-        <w:t>:  ................................................................................................</w:t>
-      </w:r>
-      <w:r>
-        <w:rPr>
-          <w:rFonts w:ascii="Arial" w:hAnsi="Arial" w:cs="Arial"/>
-          <w:sz w:val="20"/>
-          <w:szCs w:val="20"/>
-          <w:lang w:val="id-ID"/>
-        </w:rPr>
-        <w:t>.</w:t>
-      </w:r>
-      <w:r>
-        <w:rPr>
-          <w:rFonts w:ascii="Arial" w:hAnsi="Arial" w:cs="Arial"/>
-          <w:sz w:val="20"/>
-          <w:szCs w:val="20"/>
-          <w:lang w:val="en-US"/>
-        </w:rPr>
-        <w:t>................................</w:t>
-      </w:r>
-      <w:r>
-        <w:rPr>
-          <w:rFonts w:ascii="Arial" w:hAnsi="Arial" w:cs="Arial"/>
-          <w:sz w:val="20"/>
-          <w:szCs w:val="20"/>
-          <w:lang w:val="en-US"/>
-        </w:rPr>
-        <w:t>.</w:t>
-      </w:r>
-      <w:r>
-        <w:rPr>
-          <w:rFonts w:ascii="Arial" w:hAnsi="Arial" w:cs="Arial"/>
-          <w:sz w:val="20"/>
-          <w:szCs w:val="20"/>
-          <w:lang w:val="fi-FI"/>
-        </w:rPr>
-        <w:t xml:space="preserve">                            </w:t>
+        <w:t xml:space="preserve">:  </w:t>
+      </w:r>
+      <w:r>
+        <w:rPr>
+          <w:rFonts w:ascii="Arial" w:hAnsi="Arial" w:cs="Arial"/>
+          <w:sz w:val="20"/>
+          <w:szCs w:val="20"/>
+          <w:lang w:val="fi-FI"/>
+        </w:rPr>
+        <w:t>{tempat_lahir_</w:t>
+      </w:r>
+      <w:r>
+        <w:rPr>
+          <w:rFonts w:ascii="Arial" w:hAnsi="Arial" w:cs="Arial"/>
+          <w:sz w:val="20"/>
+          <w:szCs w:val="20"/>
+          <w:lang w:val="fi-FI"/>
+        </w:rPr>
+        <w:t xml:space="preserve"> </w:t>
+      </w:r>
+      <w:r>
+        <w:rPr>
+          <w:rFonts w:ascii="Arial" w:hAnsi="Arial" w:cs="Arial"/>
+          <w:sz w:val="20"/>
+          <w:szCs w:val="20"/>
+          <w:lang w:val="fi-FI"/>
+        </w:rPr>
+        <w:t>ibu_almarhum}, {tanggal_lahir_</w:t>
+      </w:r>
+      <w:r>
+        <w:rPr>
+          <w:rFonts w:ascii="Arial" w:hAnsi="Arial" w:cs="Arial"/>
+          <w:sz w:val="20"/>
+          <w:szCs w:val="20"/>
+          <w:lang w:val="fi-FI"/>
+        </w:rPr>
+        <w:t>ibu</w:t>
+      </w:r>
+      <w:r>
+        <w:rPr>
+          <w:rFonts w:ascii="Arial" w:hAnsi="Arial" w:cs="Arial"/>
+          <w:sz w:val="20"/>
+          <w:szCs w:val="20"/>
+          <w:lang w:val="fi-FI"/>
+        </w:rPr>
+        <w:t>_almarhum}</w:t>
       </w:r>
     </w:p>
     <w:p>
@@ -2675,34 +2190,25 @@
           <w:szCs w:val="20"/>
           <w:lang w:val="fi-FI"/>
         </w:rPr>
-        <w:t>................................................................................................</w:t>
-      </w:r>
-      <w:r>
-        <w:rPr>
-          <w:rFonts w:ascii="Arial" w:hAnsi="Arial" w:cs="Arial"/>
-          <w:sz w:val="20"/>
-          <w:szCs w:val="20"/>
-          <w:lang w:val="id-ID"/>
-        </w:rPr>
-        <w:t>.</w:t>
-      </w:r>
-      <w:r>
-        <w:rPr>
-          <w:rFonts w:ascii="Arial" w:hAnsi="Arial" w:cs="Arial"/>
-          <w:sz w:val="20"/>
-          <w:szCs w:val="20"/>
-          <w:lang w:val="en-US"/>
-        </w:rPr>
-        <w:t>................................</w:t>
-      </w:r>
-      <w:r>
-        <w:rPr>
-          <w:rFonts w:ascii="Arial" w:hAnsi="Arial" w:cs="Arial"/>
-          <w:sz w:val="20"/>
-          <w:szCs w:val="20"/>
-          <w:lang w:val="en-US"/>
-        </w:rPr>
-        <w:t>.</w:t>
+        <w:t>{pekerjaan_</w:t>
+      </w:r>
+      <w:r>
+        <w:rPr>
+          <w:rFonts w:ascii="Arial" w:hAnsi="Arial" w:cs="Arial"/>
+          <w:sz w:val="20"/>
+          <w:szCs w:val="20"/>
+          <w:lang w:val="fi-FI"/>
+        </w:rPr>
+        <w:t xml:space="preserve"> </w:t>
+      </w:r>
+      <w:r>
+        <w:rPr>
+          <w:rFonts w:ascii="Arial" w:hAnsi="Arial" w:cs="Arial"/>
+          <w:sz w:val="20"/>
+          <w:szCs w:val="20"/>
+          <w:lang w:val="fi-FI"/>
+        </w:rPr>
+        <w:t>ibu_almarhum}</w:t>
       </w:r>
     </w:p>
     <w:p>
@@ -2733,70 +2239,89 @@
           <w:szCs w:val="20"/>
           <w:lang w:val="fi-FI"/>
         </w:rPr>
-        <w:tab/>
-      </w:r>
-      <w:r>
-        <w:rPr>
-          <w:rFonts w:ascii="Arial" w:hAnsi="Arial" w:cs="Arial"/>
-          <w:sz w:val="20"/>
-          <w:szCs w:val="20"/>
-          <w:lang w:val="fi-FI"/>
-        </w:rPr>
-        <w:t>Terakhir</w:t>
-      </w:r>
-      <w:r>
-        <w:rPr>
-          <w:rFonts w:ascii="Arial" w:hAnsi="Arial" w:cs="Arial"/>
-          <w:sz w:val="20"/>
-          <w:szCs w:val="20"/>
-          <w:lang w:val="fi-FI"/>
-        </w:rPr>
-        <w:tab/>
-      </w:r>
-      <w:r>
-        <w:rPr>
-          <w:rFonts w:ascii="Arial" w:hAnsi="Arial" w:cs="Arial"/>
-          <w:sz w:val="20"/>
-          <w:szCs w:val="20"/>
-          <w:lang w:val="fi-FI"/>
-        </w:rPr>
-        <w:t>:  ................................................................................................</w:t>
-      </w:r>
-      <w:r>
-        <w:rPr>
-          <w:rFonts w:ascii="Arial" w:hAnsi="Arial" w:cs="Arial"/>
-          <w:sz w:val="20"/>
-          <w:szCs w:val="20"/>
-          <w:lang w:val="id-ID"/>
-        </w:rPr>
-        <w:t>.</w:t>
-      </w:r>
-      <w:r>
-        <w:rPr>
-          <w:rFonts w:ascii="Arial" w:hAnsi="Arial" w:cs="Arial"/>
-          <w:sz w:val="20"/>
-          <w:szCs w:val="20"/>
-          <w:lang w:val="en-US"/>
-        </w:rPr>
-        <w:t>................................</w:t>
-      </w:r>
-      <w:r>
-        <w:rPr>
-          <w:rFonts w:ascii="Arial" w:hAnsi="Arial" w:cs="Arial"/>
-          <w:sz w:val="20"/>
-          <w:szCs w:val="20"/>
-          <w:lang w:val="en-US"/>
-        </w:rPr>
-        <w:t>.</w:t>
-      </w:r>
-      <w:r>
-        <w:rPr>
-          <w:rFonts w:ascii="Arial" w:hAnsi="Arial" w:cs="Arial"/>
-          <w:sz w:val="20"/>
-          <w:szCs w:val="20"/>
-          <w:lang w:val="fi-FI"/>
-        </w:rPr>
-        <w:t xml:space="preserve">  </w:t>
+        <w:t xml:space="preserve"> Terakhir</w:t>
+      </w:r>
+      <w:r>
+        <w:rPr>
+          <w:rFonts w:ascii="Arial" w:hAnsi="Arial" w:cs="Arial"/>
+          <w:sz w:val="20"/>
+          <w:szCs w:val="20"/>
+          <w:lang w:val="fi-FI"/>
+        </w:rPr>
+        <w:tab/>
+      </w:r>
+      <w:r>
+        <w:rPr>
+          <w:rFonts w:ascii="Arial" w:hAnsi="Arial" w:cs="Arial"/>
+          <w:sz w:val="20"/>
+          <w:szCs w:val="20"/>
+          <w:lang w:val="fi-FI"/>
+        </w:rPr>
+        <w:tab/>
+      </w:r>
+      <w:r>
+        <w:rPr>
+          <w:rFonts w:ascii="Arial" w:hAnsi="Arial" w:cs="Arial"/>
+          <w:sz w:val="20"/>
+          <w:szCs w:val="20"/>
+          <w:lang w:val="fi-FI"/>
+        </w:rPr>
+        <w:t xml:space="preserve">:  </w:t>
+      </w:r>
+      <w:r>
+        <w:rPr>
+          <w:rFonts w:ascii="Arial" w:hAnsi="Arial" w:cs="Arial"/>
+          <w:sz w:val="20"/>
+          <w:szCs w:val="20"/>
+          <w:lang w:val="fi-FI"/>
+        </w:rPr>
+        <w:t>{alamat_</w:t>
+      </w:r>
+      <w:r>
+        <w:rPr>
+          <w:rFonts w:ascii="Arial" w:hAnsi="Arial" w:cs="Arial"/>
+          <w:sz w:val="20"/>
+          <w:szCs w:val="20"/>
+          <w:lang w:val="fi-FI"/>
+        </w:rPr>
+        <w:t xml:space="preserve"> </w:t>
+      </w:r>
+      <w:r>
+        <w:rPr>
+          <w:rFonts w:ascii="Arial" w:hAnsi="Arial" w:cs="Arial"/>
+          <w:sz w:val="20"/>
+          <w:szCs w:val="20"/>
+          <w:lang w:val="fi-FI"/>
+        </w:rPr>
+        <w:t>ibu_almarhum}</w:t>
+      </w:r>
+      <w:r>
+        <w:rPr>
+          <w:rFonts w:ascii="Arial" w:hAnsi="Arial" w:cs="Arial"/>
+          <w:sz w:val="20"/>
+          <w:szCs w:val="20"/>
+          <w:lang w:val="fi-FI"/>
+        </w:rPr>
+        <w:tab/>
+      </w:r>
+      <w:r>
+        <w:rPr>
+          <w:rFonts w:ascii="Arial" w:hAnsi="Arial" w:cs="Arial"/>
+          <w:sz w:val="20"/>
+          <w:szCs w:val="20"/>
+          <w:lang w:val="fi-FI"/>
+        </w:rPr>
+        <w:tab/>
+      </w:r>
+      <w:r>
+        <w:rPr>
+          <w:rFonts w:ascii="Arial" w:hAnsi="Arial" w:cs="Arial"/>
+          <w:sz w:val="20"/>
+          <w:szCs w:val="20"/>
+          <w:lang w:val="fi-FI"/>
+        </w:rPr>
+        <w:tab/>
+        <w:t xml:space="preserve">   </w:t>
       </w:r>
     </w:p>
     <w:p>
@@ -2817,55 +2342,6 @@
           <w:szCs w:val="20"/>
           <w:lang w:val="fi-FI"/>
         </w:rPr>
-        <w:tab/>
-      </w:r>
-      <w:r>
-        <w:rPr>
-          <w:rFonts w:ascii="Arial" w:hAnsi="Arial" w:cs="Arial"/>
-          <w:sz w:val="20"/>
-          <w:szCs w:val="20"/>
-          <w:lang w:val="fi-FI"/>
-        </w:rPr>
-        <w:tab/>
-      </w:r>
-      <w:r>
-        <w:rPr>
-          <w:rFonts w:ascii="Arial" w:hAnsi="Arial" w:cs="Arial"/>
-          <w:sz w:val="20"/>
-          <w:szCs w:val="20"/>
-          <w:lang w:val="fi-FI"/>
-        </w:rPr>
-        <w:tab/>
-      </w:r>
-      <w:r>
-        <w:rPr>
-          <w:rFonts w:ascii="Arial" w:hAnsi="Arial" w:cs="Arial"/>
-          <w:sz w:val="20"/>
-          <w:szCs w:val="20"/>
-          <w:lang w:val="fi-FI"/>
-        </w:rPr>
-        <w:tab/>
-        <w:t xml:space="preserve">   .................................................................................................................................</w:t>
-      </w:r>
-    </w:p>
-    <w:p>
-      <w:pPr>
-        <w:spacing w:line="276" w:lineRule="auto"/>
-        <w:jc w:val="both"/>
-        <w:rPr>
-          <w:rFonts w:ascii="Arial" w:hAnsi="Arial" w:cs="Arial"/>
-          <w:sz w:val="20"/>
-          <w:szCs w:val="20"/>
-          <w:lang w:val="fi-FI"/>
-        </w:rPr>
-      </w:pPr>
-      <w:r>
-        <w:rPr>
-          <w:rFonts w:ascii="Arial" w:hAnsi="Arial" w:cs="Arial"/>
-          <w:sz w:val="20"/>
-          <w:szCs w:val="20"/>
-          <w:lang w:val="fi-FI"/>
-        </w:rPr>
         <w:t xml:space="preserve">telah meninggal dunia di </w:t>
       </w:r>
       <w:r>
@@ -2875,43 +2351,7 @@
           <w:szCs w:val="20"/>
           <w:lang w:val="fi-FI"/>
         </w:rPr>
-        <w:t>.............................................................</w:t>
-      </w:r>
-      <w:r>
-        <w:rPr>
-          <w:rFonts w:ascii="Arial" w:hAnsi="Arial" w:cs="Arial"/>
-          <w:sz w:val="20"/>
-          <w:szCs w:val="20"/>
-          <w:lang w:val="fi-FI"/>
-        </w:rPr>
-        <w:t>.............</w:t>
-      </w:r>
-      <w:r>
-        <w:rPr>
-          <w:rFonts w:ascii="Arial" w:hAnsi="Arial" w:cs="Arial"/>
-          <w:sz w:val="20"/>
-          <w:szCs w:val="20"/>
-          <w:lang w:val="fi-FI"/>
-        </w:rPr>
-        <w:t>.........................</w:t>
-      </w:r>
-      <w:r>
-        <w:rPr>
-          <w:rFonts w:ascii="Arial" w:hAnsi="Arial" w:cs="Arial"/>
-          <w:sz w:val="20"/>
-          <w:szCs w:val="20"/>
-          <w:lang w:val="fi-FI"/>
-        </w:rPr>
-        <w:t>............</w:t>
-      </w:r>
-      <w:r>
-        <w:rPr>
-          <w:rFonts w:ascii="Arial" w:hAnsi="Arial" w:cs="Arial"/>
-          <w:sz w:val="20"/>
-          <w:szCs w:val="20"/>
-          <w:lang w:val="fi-FI"/>
-        </w:rPr>
-        <w:t>................</w:t>
+        <w:t>{lokasi_meninggal}</w:t>
       </w:r>
       <w:r>
         <w:rPr>
@@ -2947,7 +2387,7 @@
           <w:szCs w:val="20"/>
           <w:lang w:val="fi-FI"/>
         </w:rPr>
-        <w:t>...........................................</w:t>
+        <w:t>{tanggal_meninggal}</w:t>
       </w:r>
       <w:r>
         <w:rPr>
@@ -3001,7 +2441,7 @@
           <w:szCs w:val="20"/>
           <w:lang w:val="fi-FI"/>
         </w:rPr>
-        <w:t>.............................</w:t>
+        <w:t>{nomor_akta_kematian}</w:t>
       </w:r>
       <w:r>
         <w:rPr>
@@ -3046,16 +2486,7 @@
           <w:szCs w:val="20"/>
           <w:lang w:val="fi-FI"/>
         </w:rPr>
-        <w:t>............................</w:t>
-      </w:r>
-      <w:r>
-        <w:rPr>
-          <w:rFonts w:ascii="Arial" w:hAnsi="Arial" w:cs="Arial"/>
-          <w:sz w:val="20"/>
-          <w:szCs w:val="20"/>
-          <w:lang w:val="fi-FI"/>
-        </w:rPr>
-        <w:t>.</w:t>
+        <w:t>{tanggal_akta_kematian}</w:t>
       </w:r>
     </w:p>
     <w:p>
@@ -3253,43 +2684,7 @@
           <w:szCs w:val="20"/>
           <w:lang w:val="fi-FI"/>
         </w:rPr>
-        <w:t>...............................................................................................</w:t>
-      </w:r>
-      <w:r>
-        <w:rPr>
-          <w:rFonts w:ascii="Arial" w:hAnsi="Arial" w:cs="Arial"/>
-          <w:sz w:val="20"/>
-          <w:szCs w:val="20"/>
-          <w:lang w:val="id-ID"/>
-        </w:rPr>
-        <w:t>.</w:t>
-      </w:r>
-      <w:r>
-        <w:rPr>
-          <w:rFonts w:ascii="Arial" w:hAnsi="Arial" w:cs="Arial"/>
-          <w:sz w:val="20"/>
-          <w:szCs w:val="20"/>
-          <w:lang w:val="en-US"/>
-        </w:rPr>
-        <w:t>................................</w:t>
-      </w:r>
-      <w:r>
-        <w:rPr>
-          <w:rFonts w:ascii="Arial" w:hAnsi="Arial" w:cs="Arial"/>
-          <w:sz w:val="20"/>
-          <w:szCs w:val="20"/>
-          <w:lang w:val="en-US"/>
-        </w:rPr>
-        <w:t>.</w:t>
-      </w:r>
-      <w:r>
-        <w:rPr>
-          <w:rFonts w:ascii="Arial" w:hAnsi="Arial" w:cs="Arial"/>
-          <w:sz w:val="20"/>
-          <w:szCs w:val="20"/>
-          <w:lang w:val="fi-FI"/>
-        </w:rPr>
-        <w:t>.</w:t>
+        <w:t>{nama_pasangan_almarhum}</w:t>
       </w:r>
     </w:p>
     <w:p>
@@ -3348,52 +2743,16 @@
           <w:szCs w:val="20"/>
           <w:lang w:val="fi-FI"/>
         </w:rPr>
-        <w:t>...............................................................................................</w:t>
-      </w:r>
-      <w:r>
-        <w:rPr>
-          <w:rFonts w:ascii="Arial" w:hAnsi="Arial" w:cs="Arial"/>
-          <w:sz w:val="20"/>
-          <w:szCs w:val="20"/>
-          <w:lang w:val="id-ID"/>
-        </w:rPr>
-        <w:t>.</w:t>
-      </w:r>
-      <w:r>
-        <w:rPr>
-          <w:rFonts w:ascii="Arial" w:hAnsi="Arial" w:cs="Arial"/>
-          <w:sz w:val="20"/>
-          <w:szCs w:val="20"/>
-          <w:lang w:val="en-US"/>
-        </w:rPr>
-        <w:t>................................</w:t>
-      </w:r>
-      <w:r>
-        <w:rPr>
-          <w:rFonts w:ascii="Arial" w:hAnsi="Arial" w:cs="Arial"/>
-          <w:sz w:val="20"/>
-          <w:szCs w:val="20"/>
-          <w:lang w:val="en-US"/>
-        </w:rPr>
-        <w:t>.</w:t>
-      </w:r>
-      <w:r>
-        <w:rPr>
-          <w:rFonts w:ascii="Arial" w:hAnsi="Arial" w:cs="Arial"/>
-          <w:sz w:val="20"/>
-          <w:szCs w:val="20"/>
-          <w:lang w:val="fi-FI"/>
-        </w:rPr>
-        <w:t>.</w:t>
-      </w:r>
-      <w:r>
-        <w:rPr>
-          <w:rFonts w:ascii="Arial" w:hAnsi="Arial" w:cs="Arial"/>
-          <w:sz w:val="20"/>
-          <w:szCs w:val="20"/>
-          <w:lang w:val="fi-FI"/>
-        </w:rPr>
-        <w:t xml:space="preserve">                            </w:t>
+        <w:t xml:space="preserve">{tempat_lahir_pasangan_almarhum}, </w:t>
+      </w:r>
+      <w:r>
+        <w:rPr>
+          <w:rFonts w:ascii="Arial" w:hAnsi="Arial" w:cs="Arial"/>
+          <w:sz w:val="20"/>
+          <w:szCs w:val="20"/>
+          <w:lang w:val="fi-FI"/>
+        </w:rPr>
+        <w:t>{tanggal_lahir_pasangan_almarhum}</w:t>
       </w:r>
     </w:p>
     <w:p>
@@ -3462,43 +2821,25 @@
           <w:szCs w:val="20"/>
           <w:lang w:val="fi-FI"/>
         </w:rPr>
-        <w:t>...............................................................................................</w:t>
-      </w:r>
-      <w:r>
-        <w:rPr>
-          <w:rFonts w:ascii="Arial" w:hAnsi="Arial" w:cs="Arial"/>
-          <w:sz w:val="20"/>
-          <w:szCs w:val="20"/>
-          <w:lang w:val="id-ID"/>
-        </w:rPr>
-        <w:t>.</w:t>
-      </w:r>
-      <w:r>
-        <w:rPr>
-          <w:rFonts w:ascii="Arial" w:hAnsi="Arial" w:cs="Arial"/>
-          <w:sz w:val="20"/>
-          <w:szCs w:val="20"/>
-          <w:lang w:val="en-US"/>
-        </w:rPr>
-        <w:t>................................</w:t>
-      </w:r>
-      <w:r>
-        <w:rPr>
-          <w:rFonts w:ascii="Arial" w:hAnsi="Arial" w:cs="Arial"/>
-          <w:sz w:val="20"/>
-          <w:szCs w:val="20"/>
-          <w:lang w:val="en-US"/>
-        </w:rPr>
-        <w:t>.</w:t>
-      </w:r>
-      <w:r>
-        <w:rPr>
-          <w:rFonts w:ascii="Arial" w:hAnsi="Arial" w:cs="Arial"/>
-          <w:sz w:val="20"/>
-          <w:szCs w:val="20"/>
-          <w:lang w:val="fi-FI"/>
-        </w:rPr>
-        <w:t>.</w:t>
+        <w:t>{</w:t>
+      </w:r>
+      <w:r>
+        <w:rPr>
+          <w:rFonts w:ascii="Arial" w:hAnsi="Arial" w:cs="Arial"/>
+          <w:sz w:val="20"/>
+          <w:szCs w:val="20"/>
+          <w:lang w:val="fi-FI"/>
+        </w:rPr>
+        <w:t>nik_pasangan_almarhum</w:t>
+      </w:r>
+      <w:r>
+        <w:rPr>
+          <w:rFonts w:ascii="Arial" w:hAnsi="Arial" w:cs="Arial"/>
+          <w:sz w:val="20"/>
+          <w:szCs w:val="20"/>
+          <w:lang w:val="fi-FI"/>
+        </w:rPr>
+        <w:t>}</w:t>
       </w:r>
     </w:p>
     <w:p>
@@ -3567,43 +2908,25 @@
           <w:szCs w:val="20"/>
           <w:lang w:val="fi-FI"/>
         </w:rPr>
-        <w:t>...............................................................................................</w:t>
-      </w:r>
-      <w:r>
-        <w:rPr>
-          <w:rFonts w:ascii="Arial" w:hAnsi="Arial" w:cs="Arial"/>
-          <w:sz w:val="20"/>
-          <w:szCs w:val="20"/>
-          <w:lang w:val="id-ID"/>
-        </w:rPr>
-        <w:t>.</w:t>
-      </w:r>
-      <w:r>
-        <w:rPr>
-          <w:rFonts w:ascii="Arial" w:hAnsi="Arial" w:cs="Arial"/>
-          <w:sz w:val="20"/>
-          <w:szCs w:val="20"/>
-          <w:lang w:val="en-US"/>
-        </w:rPr>
-        <w:t>................................</w:t>
-      </w:r>
-      <w:r>
-        <w:rPr>
-          <w:rFonts w:ascii="Arial" w:hAnsi="Arial" w:cs="Arial"/>
-          <w:sz w:val="20"/>
-          <w:szCs w:val="20"/>
-          <w:lang w:val="en-US"/>
-        </w:rPr>
-        <w:t>.</w:t>
-      </w:r>
-      <w:r>
-        <w:rPr>
-          <w:rFonts w:ascii="Arial" w:hAnsi="Arial" w:cs="Arial"/>
-          <w:sz w:val="20"/>
-          <w:szCs w:val="20"/>
-          <w:lang w:val="fi-FI"/>
-        </w:rPr>
-        <w:t>.</w:t>
+        <w:t>{</w:t>
+      </w:r>
+      <w:r>
+        <w:rPr>
+          <w:rFonts w:ascii="Arial" w:hAnsi="Arial" w:cs="Arial"/>
+          <w:sz w:val="20"/>
+          <w:szCs w:val="20"/>
+          <w:lang w:val="fi-FI"/>
+        </w:rPr>
+        <w:t>pekerjaan_pasangan_almarhum</w:t>
+      </w:r>
+      <w:r>
+        <w:rPr>
+          <w:rFonts w:ascii="Arial" w:hAnsi="Arial" w:cs="Arial"/>
+          <w:sz w:val="20"/>
+          <w:szCs w:val="20"/>
+          <w:lang w:val="fi-FI"/>
+        </w:rPr>
+        <w:t>}</w:t>
       </w:r>
     </w:p>
     <w:p>
@@ -3661,43 +2984,62 @@
           <w:lang w:val="fi-FI"/>
         </w:rPr>
         <w:tab/>
-        <w:t>:  ................................................................................................</w:t>
-      </w:r>
-      <w:r>
-        <w:rPr>
-          <w:rFonts w:ascii="Arial" w:hAnsi="Arial" w:cs="Arial"/>
-          <w:sz w:val="20"/>
-          <w:szCs w:val="20"/>
-          <w:lang w:val="id-ID"/>
-        </w:rPr>
-        <w:t>.</w:t>
-      </w:r>
-      <w:r>
-        <w:rPr>
-          <w:rFonts w:ascii="Arial" w:hAnsi="Arial" w:cs="Arial"/>
-          <w:sz w:val="20"/>
-          <w:szCs w:val="20"/>
-          <w:lang w:val="en-US"/>
-        </w:rPr>
-        <w:t>................................</w:t>
-      </w:r>
-      <w:r>
-        <w:rPr>
-          <w:rFonts w:ascii="Arial" w:hAnsi="Arial" w:cs="Arial"/>
-          <w:sz w:val="20"/>
-          <w:szCs w:val="20"/>
-          <w:lang w:val="en-US"/>
-        </w:rPr>
-        <w:t>.</w:t>
-      </w:r>
-      <w:r>
-        <w:rPr>
-          <w:rFonts w:ascii="Arial" w:hAnsi="Arial" w:cs="Arial"/>
-          <w:sz w:val="20"/>
-          <w:szCs w:val="20"/>
-          <w:lang w:val="fi-FI"/>
-        </w:rPr>
-        <w:t xml:space="preserve">  </w:t>
+        <w:t xml:space="preserve">:  </w:t>
+      </w:r>
+      <w:r>
+        <w:rPr>
+          <w:rFonts w:ascii="Arial" w:hAnsi="Arial" w:cs="Arial"/>
+          <w:sz w:val="20"/>
+          <w:szCs w:val="20"/>
+          <w:lang w:val="fi-FI"/>
+        </w:rPr>
+        <w:t>{</w:t>
+      </w:r>
+      <w:r>
+        <w:rPr>
+          <w:rFonts w:ascii="Arial" w:hAnsi="Arial" w:cs="Arial"/>
+          <w:sz w:val="20"/>
+          <w:szCs w:val="20"/>
+          <w:lang w:val="fi-FI"/>
+        </w:rPr>
+        <w:t>alamat_pasangan_almarhum</w:t>
+      </w:r>
+      <w:r>
+        <w:rPr>
+          <w:rFonts w:ascii="Arial" w:hAnsi="Arial" w:cs="Arial"/>
+          <w:sz w:val="20"/>
+          <w:szCs w:val="20"/>
+          <w:lang w:val="fi-FI"/>
+        </w:rPr>
+        <w:t>}</w:t>
+      </w:r>
+      <w:r>
+        <w:rPr>
+          <w:rFonts w:ascii="Arial" w:hAnsi="Arial" w:cs="Arial"/>
+          <w:sz w:val="20"/>
+          <w:szCs w:val="20"/>
+          <w:lang w:val="fi-FI"/>
+        </w:rPr>
+        <w:tab/>
+      </w:r>
+      <w:r>
+        <w:rPr>
+          <w:rFonts w:ascii="Arial" w:hAnsi="Arial" w:cs="Arial"/>
+          <w:sz w:val="20"/>
+          <w:szCs w:val="20"/>
+          <w:lang w:val="fi-FI"/>
+        </w:rPr>
+        <w:tab/>
+      </w:r>
+      <w:r>
+        <w:rPr>
+          <w:rFonts w:ascii="Arial" w:hAnsi="Arial" w:cs="Arial"/>
+          <w:sz w:val="20"/>
+          <w:szCs w:val="20"/>
+          <w:lang w:val="fi-FI"/>
+        </w:rPr>
+        <w:tab/>
+        <w:t xml:space="preserve">   </w:t>
       </w:r>
     </w:p>
     <w:p>
@@ -3718,74 +3060,16 @@
           <w:szCs w:val="20"/>
           <w:lang w:val="fi-FI"/>
         </w:rPr>
-        <w:tab/>
-      </w:r>
-      <w:r>
-        <w:rPr>
-          <w:rFonts w:ascii="Arial" w:hAnsi="Arial" w:cs="Arial"/>
-          <w:sz w:val="20"/>
-          <w:szCs w:val="20"/>
-          <w:lang w:val="fi-FI"/>
-        </w:rPr>
-        <w:tab/>
-      </w:r>
-      <w:r>
-        <w:rPr>
-          <w:rFonts w:ascii="Arial" w:hAnsi="Arial" w:cs="Arial"/>
-          <w:sz w:val="20"/>
-          <w:szCs w:val="20"/>
-          <w:lang w:val="fi-FI"/>
-        </w:rPr>
-        <w:tab/>
-      </w:r>
-      <w:r>
-        <w:rPr>
-          <w:rFonts w:ascii="Arial" w:hAnsi="Arial" w:cs="Arial"/>
-          <w:sz w:val="20"/>
-          <w:szCs w:val="20"/>
-          <w:lang w:val="fi-FI"/>
-        </w:rPr>
-        <w:tab/>
-        <w:t xml:space="preserve">   ..................................................................................................</w:t>
-      </w:r>
-      <w:r>
-        <w:rPr>
-          <w:rFonts w:ascii="Arial" w:hAnsi="Arial" w:cs="Arial"/>
-          <w:sz w:val="20"/>
-          <w:szCs w:val="20"/>
-          <w:lang w:val="fi-FI"/>
-        </w:rPr>
-        <w:t>................................</w:t>
-      </w:r>
-      <w:r>
-        <w:rPr>
-          <w:rFonts w:ascii="Arial" w:hAnsi="Arial" w:cs="Arial"/>
-          <w:sz w:val="20"/>
-          <w:szCs w:val="20"/>
-          <w:lang w:val="fi-FI"/>
-        </w:rPr>
-        <w:t xml:space="preserve">  </w:t>
-      </w:r>
-    </w:p>
-    <w:p>
-      <w:pPr>
-        <w:spacing w:line="276" w:lineRule="auto"/>
-        <w:jc w:val="both"/>
-        <w:rPr>
-          <w:rFonts w:ascii="Arial" w:hAnsi="Arial" w:cs="Arial"/>
-          <w:sz w:val="20"/>
-          <w:szCs w:val="20"/>
-          <w:lang w:val="fi-FI"/>
-        </w:rPr>
-      </w:pPr>
-      <w:r>
-        <w:rPr>
-          <w:rFonts w:ascii="Arial" w:hAnsi="Arial" w:cs="Arial"/>
-          <w:sz w:val="20"/>
-          <w:szCs w:val="20"/>
-          <w:lang w:val="fi-FI"/>
-        </w:rPr>
-        <w:t>telah dilahirkan ......</w:t>
+        <w:t xml:space="preserve">telah dilahirkan </w:t>
+      </w:r>
+      <w:r>
+        <w:rPr>
+          <w:rFonts w:ascii="Arial" w:hAnsi="Arial" w:cs="Arial"/>
+          <w:sz w:val="20"/>
+          <w:szCs w:val="20"/>
+          <w:lang w:val="fi-FI"/>
+        </w:rPr>
+        <w:t>{jumlah_anak_almarhum}</w:t>
       </w:r>
       <w:r>
         <w:rPr>
@@ -3821,16 +3105,16 @@
           <w:szCs w:val="20"/>
           <w:lang w:val="fi-FI"/>
         </w:rPr>
-        <w:t>....</w:t>
-      </w:r>
-      <w:r>
-        <w:rPr>
-          <w:rFonts w:ascii="Arial" w:hAnsi="Arial" w:cs="Arial"/>
-          <w:sz w:val="20"/>
-          <w:szCs w:val="20"/>
-          <w:lang w:val="fi-FI"/>
-        </w:rPr>
-        <w:t>.......... ) orang anak yaitu :</w:t>
+        <w:t>{jumlah_anak_almarhum}</w:t>
+      </w:r>
+      <w:r>
+        <w:rPr>
+          <w:rFonts w:ascii="Arial" w:hAnsi="Arial" w:cs="Arial"/>
+          <w:sz w:val="20"/>
+          <w:szCs w:val="20"/>
+          <w:lang w:val="fi-FI"/>
+        </w:rPr>
+        <w:t xml:space="preserve"> ) orang anak yaitu :</w:t>
       </w:r>
     </w:p>
     <w:p>
@@ -3894,43 +3178,7 @@
           <w:szCs w:val="20"/>
           <w:lang w:val="fi-FI"/>
         </w:rPr>
-        <w:t>...............................................................................................</w:t>
-      </w:r>
-      <w:r>
-        <w:rPr>
-          <w:rFonts w:ascii="Arial" w:hAnsi="Arial" w:cs="Arial"/>
-          <w:sz w:val="20"/>
-          <w:szCs w:val="20"/>
-          <w:lang w:val="id-ID"/>
-        </w:rPr>
-        <w:t>.</w:t>
-      </w:r>
-      <w:r>
-        <w:rPr>
-          <w:rFonts w:ascii="Arial" w:hAnsi="Arial" w:cs="Arial"/>
-          <w:sz w:val="20"/>
-          <w:szCs w:val="20"/>
-          <w:lang w:val="en-US"/>
-        </w:rPr>
-        <w:t>................................</w:t>
-      </w:r>
-      <w:r>
-        <w:rPr>
-          <w:rFonts w:ascii="Arial" w:hAnsi="Arial" w:cs="Arial"/>
-          <w:sz w:val="20"/>
-          <w:szCs w:val="20"/>
-          <w:lang w:val="en-US"/>
-        </w:rPr>
-        <w:t>.</w:t>
-      </w:r>
-      <w:r>
-        <w:rPr>
-          <w:rFonts w:ascii="Arial" w:hAnsi="Arial" w:cs="Arial"/>
-          <w:sz w:val="20"/>
-          <w:szCs w:val="20"/>
-          <w:lang w:val="fi-FI"/>
-        </w:rPr>
-        <w:t>.</w:t>
+        <w:t>{nama_anak_1}</w:t>
       </w:r>
     </w:p>
     <w:p>
@@ -3972,52 +3220,7 @@
           <w:szCs w:val="20"/>
           <w:lang w:val="fi-FI"/>
         </w:rPr>
-        <w:t>...............................................................................................</w:t>
-      </w:r>
-      <w:r>
-        <w:rPr>
-          <w:rFonts w:ascii="Arial" w:hAnsi="Arial" w:cs="Arial"/>
-          <w:sz w:val="20"/>
-          <w:szCs w:val="20"/>
-          <w:lang w:val="id-ID"/>
-        </w:rPr>
-        <w:t>.</w:t>
-      </w:r>
-      <w:r>
-        <w:rPr>
-          <w:rFonts w:ascii="Arial" w:hAnsi="Arial" w:cs="Arial"/>
-          <w:sz w:val="20"/>
-          <w:szCs w:val="20"/>
-          <w:lang w:val="en-US"/>
-        </w:rPr>
-        <w:t>................................</w:t>
-      </w:r>
-      <w:r>
-        <w:rPr>
-          <w:rFonts w:ascii="Arial" w:hAnsi="Arial" w:cs="Arial"/>
-          <w:sz w:val="20"/>
-          <w:szCs w:val="20"/>
-          <w:lang w:val="en-US"/>
-        </w:rPr>
-        <w:t>.</w:t>
-      </w:r>
-      <w:r>
-        <w:rPr>
-          <w:rFonts w:ascii="Arial" w:hAnsi="Arial" w:cs="Arial"/>
-          <w:sz w:val="20"/>
-          <w:szCs w:val="20"/>
-          <w:lang w:val="fi-FI"/>
-        </w:rPr>
-        <w:t>.</w:t>
-      </w:r>
-      <w:r>
-        <w:rPr>
-          <w:rFonts w:ascii="Arial" w:hAnsi="Arial" w:cs="Arial"/>
-          <w:sz w:val="20"/>
-          <w:szCs w:val="20"/>
-          <w:lang w:val="fi-FI"/>
-        </w:rPr>
-        <w:t xml:space="preserve">                            </w:t>
+        <w:t>{tempat_lahir_anak_1}, {tanggal_lahir_anak_1}</w:t>
       </w:r>
     </w:p>
     <w:p>
@@ -4086,43 +3289,7 @@
           <w:szCs w:val="20"/>
           <w:lang w:val="fi-FI"/>
         </w:rPr>
-        <w:t>...............................................................................................</w:t>
-      </w:r>
-      <w:r>
-        <w:rPr>
-          <w:rFonts w:ascii="Arial" w:hAnsi="Arial" w:cs="Arial"/>
-          <w:sz w:val="20"/>
-          <w:szCs w:val="20"/>
-          <w:lang w:val="id-ID"/>
-        </w:rPr>
-        <w:t>.</w:t>
-      </w:r>
-      <w:r>
-        <w:rPr>
-          <w:rFonts w:ascii="Arial" w:hAnsi="Arial" w:cs="Arial"/>
-          <w:sz w:val="20"/>
-          <w:szCs w:val="20"/>
-          <w:lang w:val="en-US"/>
-        </w:rPr>
-        <w:t>................................</w:t>
-      </w:r>
-      <w:r>
-        <w:rPr>
-          <w:rFonts w:ascii="Arial" w:hAnsi="Arial" w:cs="Arial"/>
-          <w:sz w:val="20"/>
-          <w:szCs w:val="20"/>
-          <w:lang w:val="en-US"/>
-        </w:rPr>
-        <w:t>.</w:t>
-      </w:r>
-      <w:r>
-        <w:rPr>
-          <w:rFonts w:ascii="Arial" w:hAnsi="Arial" w:cs="Arial"/>
-          <w:sz w:val="20"/>
-          <w:szCs w:val="20"/>
-          <w:lang w:val="fi-FI"/>
-        </w:rPr>
-        <w:t>.</w:t>
+        <w:t>{nik_anak_1}</w:t>
       </w:r>
     </w:p>
     <w:p>
@@ -4191,43 +3358,7 @@
           <w:szCs w:val="20"/>
           <w:lang w:val="fi-FI"/>
         </w:rPr>
-        <w:t>...............................................................................................</w:t>
-      </w:r>
-      <w:r>
-        <w:rPr>
-          <w:rFonts w:ascii="Arial" w:hAnsi="Arial" w:cs="Arial"/>
-          <w:sz w:val="20"/>
-          <w:szCs w:val="20"/>
-          <w:lang w:val="id-ID"/>
-        </w:rPr>
-        <w:t>.</w:t>
-      </w:r>
-      <w:r>
-        <w:rPr>
-          <w:rFonts w:ascii="Arial" w:hAnsi="Arial" w:cs="Arial"/>
-          <w:sz w:val="20"/>
-          <w:szCs w:val="20"/>
-          <w:lang w:val="en-US"/>
-        </w:rPr>
-        <w:t>................................</w:t>
-      </w:r>
-      <w:r>
-        <w:rPr>
-          <w:rFonts w:ascii="Arial" w:hAnsi="Arial" w:cs="Arial"/>
-          <w:sz w:val="20"/>
-          <w:szCs w:val="20"/>
-          <w:lang w:val="en-US"/>
-        </w:rPr>
-        <w:t>.</w:t>
-      </w:r>
-      <w:r>
-        <w:rPr>
-          <w:rFonts w:ascii="Arial" w:hAnsi="Arial" w:cs="Arial"/>
-          <w:sz w:val="20"/>
-          <w:szCs w:val="20"/>
-          <w:lang w:val="fi-FI"/>
-        </w:rPr>
-        <w:t>.</w:t>
+        <w:t>{pekerjaan_anak_1}</w:t>
       </w:r>
     </w:p>
     <w:p>
@@ -4278,43 +3409,34 @@
           <w:lang w:val="fi-FI"/>
         </w:rPr>
         <w:tab/>
-        <w:t>:  ................................................................................................</w:t>
-      </w:r>
-      <w:r>
-        <w:rPr>
-          <w:rFonts w:ascii="Arial" w:hAnsi="Arial" w:cs="Arial"/>
-          <w:sz w:val="20"/>
-          <w:szCs w:val="20"/>
-          <w:lang w:val="id-ID"/>
-        </w:rPr>
-        <w:t>.</w:t>
-      </w:r>
-      <w:r>
-        <w:rPr>
-          <w:rFonts w:ascii="Arial" w:hAnsi="Arial" w:cs="Arial"/>
-          <w:sz w:val="20"/>
-          <w:szCs w:val="20"/>
-          <w:lang w:val="en-US"/>
-        </w:rPr>
-        <w:t>................................</w:t>
-      </w:r>
-      <w:r>
-        <w:rPr>
-          <w:rFonts w:ascii="Arial" w:hAnsi="Arial" w:cs="Arial"/>
-          <w:sz w:val="20"/>
-          <w:szCs w:val="20"/>
-          <w:lang w:val="en-US"/>
-        </w:rPr>
-        <w:t>.</w:t>
-      </w:r>
-      <w:r>
-        <w:rPr>
-          <w:rFonts w:ascii="Arial" w:hAnsi="Arial" w:cs="Arial"/>
-          <w:sz w:val="20"/>
-          <w:szCs w:val="20"/>
-          <w:lang w:val="fi-FI"/>
-        </w:rPr>
-        <w:t xml:space="preserve">     </w:t>
+        <w:t xml:space="preserve">:  </w:t>
+      </w:r>
+      <w:r>
+        <w:rPr>
+          <w:rFonts w:ascii="Arial" w:hAnsi="Arial" w:cs="Arial"/>
+          <w:sz w:val="20"/>
+          <w:szCs w:val="20"/>
+          <w:lang w:val="fi-FI"/>
+        </w:rPr>
+        <w:t>{</w:t>
+      </w:r>
+      <w:r>
+        <w:rPr>
+          <w:rFonts w:ascii="Arial" w:hAnsi="Arial" w:cs="Arial"/>
+          <w:sz w:val="20"/>
+          <w:szCs w:val="20"/>
+          <w:lang w:val="fi-FI"/>
+        </w:rPr>
+        <w:t>alamat_anak_1</w:t>
+      </w:r>
+      <w:r>
+        <w:rPr>
+          <w:rFonts w:ascii="Arial" w:hAnsi="Arial" w:cs="Arial"/>
+          <w:sz w:val="20"/>
+          <w:szCs w:val="20"/>
+          <w:lang w:val="fi-FI"/>
+        </w:rPr>
+        <w:t>}</w:t>
       </w:r>
     </w:p>
     <w:p>
@@ -4369,14 +3491,6 @@
           <w:lang w:val="fi-FI"/>
         </w:rPr>
         <w:tab/>
-      </w:r>
-      <w:r>
-        <w:rPr>
-          <w:rFonts w:ascii="Arial" w:hAnsi="Arial" w:cs="Arial"/>
-          <w:sz w:val="20"/>
-          <w:szCs w:val="20"/>
-          <w:lang w:val="fi-FI"/>
-        </w:rPr>
         <w:t xml:space="preserve">:  </w:t>
       </w:r>
       <w:r>
@@ -4386,43 +3500,25 @@
           <w:szCs w:val="20"/>
           <w:lang w:val="fi-FI"/>
         </w:rPr>
-        <w:t>...............................................................................................</w:t>
-      </w:r>
-      <w:r>
-        <w:rPr>
-          <w:rFonts w:ascii="Arial" w:hAnsi="Arial" w:cs="Arial"/>
-          <w:sz w:val="20"/>
-          <w:szCs w:val="20"/>
-          <w:lang w:val="id-ID"/>
-        </w:rPr>
-        <w:t>.</w:t>
-      </w:r>
-      <w:r>
-        <w:rPr>
-          <w:rFonts w:ascii="Arial" w:hAnsi="Arial" w:cs="Arial"/>
-          <w:sz w:val="20"/>
-          <w:szCs w:val="20"/>
-          <w:lang w:val="en-US"/>
-        </w:rPr>
-        <w:t>................................</w:t>
-      </w:r>
-      <w:r>
-        <w:rPr>
-          <w:rFonts w:ascii="Arial" w:hAnsi="Arial" w:cs="Arial"/>
-          <w:sz w:val="20"/>
-          <w:szCs w:val="20"/>
-          <w:lang w:val="en-US"/>
-        </w:rPr>
-        <w:t>.</w:t>
-      </w:r>
-      <w:r>
-        <w:rPr>
-          <w:rFonts w:ascii="Arial" w:hAnsi="Arial" w:cs="Arial"/>
-          <w:sz w:val="20"/>
-          <w:szCs w:val="20"/>
-          <w:lang w:val="fi-FI"/>
-        </w:rPr>
-        <w:t>.</w:t>
+        <w:t>{nama_anak_</w:t>
+      </w:r>
+      <w:r>
+        <w:rPr>
+          <w:rFonts w:ascii="Arial" w:hAnsi="Arial" w:cs="Arial"/>
+          <w:sz w:val="20"/>
+          <w:szCs w:val="20"/>
+          <w:lang w:val="fi-FI"/>
+        </w:rPr>
+        <w:t>2</w:t>
+      </w:r>
+      <w:r>
+        <w:rPr>
+          <w:rFonts w:ascii="Arial" w:hAnsi="Arial" w:cs="Arial"/>
+          <w:sz w:val="20"/>
+          <w:szCs w:val="20"/>
+          <w:lang w:val="fi-FI"/>
+        </w:rPr>
+        <w:t>}</w:t>
       </w:r>
     </w:p>
     <w:p>
@@ -4464,52 +3560,43 @@
           <w:szCs w:val="20"/>
           <w:lang w:val="fi-FI"/>
         </w:rPr>
-        <w:t>...............................................................................................</w:t>
-      </w:r>
-      <w:r>
-        <w:rPr>
-          <w:rFonts w:ascii="Arial" w:hAnsi="Arial" w:cs="Arial"/>
-          <w:sz w:val="20"/>
-          <w:szCs w:val="20"/>
-          <w:lang w:val="id-ID"/>
-        </w:rPr>
-        <w:t>.</w:t>
-      </w:r>
-      <w:r>
-        <w:rPr>
-          <w:rFonts w:ascii="Arial" w:hAnsi="Arial" w:cs="Arial"/>
-          <w:sz w:val="20"/>
-          <w:szCs w:val="20"/>
-          <w:lang w:val="en-US"/>
-        </w:rPr>
-        <w:t>................................</w:t>
-      </w:r>
-      <w:r>
-        <w:rPr>
-          <w:rFonts w:ascii="Arial" w:hAnsi="Arial" w:cs="Arial"/>
-          <w:sz w:val="20"/>
-          <w:szCs w:val="20"/>
-          <w:lang w:val="en-US"/>
-        </w:rPr>
-        <w:t>.</w:t>
-      </w:r>
-      <w:r>
-        <w:rPr>
-          <w:rFonts w:ascii="Arial" w:hAnsi="Arial" w:cs="Arial"/>
-          <w:sz w:val="20"/>
-          <w:szCs w:val="20"/>
-          <w:lang w:val="fi-FI"/>
-        </w:rPr>
-        <w:t>.</w:t>
-      </w:r>
-      <w:r>
-        <w:rPr>
-          <w:rFonts w:ascii="Arial" w:hAnsi="Arial" w:cs="Arial"/>
-          <w:sz w:val="20"/>
-          <w:szCs w:val="20"/>
-          <w:lang w:val="fi-FI"/>
-        </w:rPr>
-        <w:t xml:space="preserve">                            </w:t>
+        <w:t>{tempat_lahir_anak_</w:t>
+      </w:r>
+      <w:r>
+        <w:rPr>
+          <w:rFonts w:ascii="Arial" w:hAnsi="Arial" w:cs="Arial"/>
+          <w:sz w:val="20"/>
+          <w:szCs w:val="20"/>
+          <w:lang w:val="fi-FI"/>
+        </w:rPr>
+        <w:t>2</w:t>
+      </w:r>
+      <w:r>
+        <w:rPr>
+          <w:rFonts w:ascii="Arial" w:hAnsi="Arial" w:cs="Arial"/>
+          <w:sz w:val="20"/>
+          <w:szCs w:val="20"/>
+          <w:lang w:val="fi-FI"/>
+        </w:rPr>
+        <w:t>}, {tanggal_lahir_anak_</w:t>
+      </w:r>
+      <w:r>
+        <w:rPr>
+          <w:rFonts w:ascii="Arial" w:hAnsi="Arial" w:cs="Arial"/>
+          <w:sz w:val="20"/>
+          <w:szCs w:val="20"/>
+          <w:lang w:val="fi-FI"/>
+        </w:rPr>
+        <w:t>2</w:t>
+      </w:r>
+      <w:r>
+        <w:rPr>
+          <w:rFonts w:ascii="Arial" w:hAnsi="Arial" w:cs="Arial"/>
+          <w:sz w:val="20"/>
+          <w:szCs w:val="20"/>
+          <w:lang w:val="fi-FI"/>
+        </w:rPr>
+        <w:t>}</w:t>
       </w:r>
     </w:p>
     <w:p>
@@ -4569,14 +3656,6 @@
           <w:lang w:val="fi-FI"/>
         </w:rPr>
         <w:tab/>
-      </w:r>
-      <w:r>
-        <w:rPr>
-          <w:rFonts w:ascii="Arial" w:hAnsi="Arial" w:cs="Arial"/>
-          <w:sz w:val="20"/>
-          <w:szCs w:val="20"/>
-          <w:lang w:val="fi-FI"/>
-        </w:rPr>
         <w:t xml:space="preserve">:  </w:t>
       </w:r>
       <w:r>
@@ -4586,43 +3665,25 @@
           <w:szCs w:val="20"/>
           <w:lang w:val="fi-FI"/>
         </w:rPr>
-        <w:t>...............................................................................................</w:t>
-      </w:r>
-      <w:r>
-        <w:rPr>
-          <w:rFonts w:ascii="Arial" w:hAnsi="Arial" w:cs="Arial"/>
-          <w:sz w:val="20"/>
-          <w:szCs w:val="20"/>
-          <w:lang w:val="id-ID"/>
-        </w:rPr>
-        <w:t>.</w:t>
-      </w:r>
-      <w:r>
-        <w:rPr>
-          <w:rFonts w:ascii="Arial" w:hAnsi="Arial" w:cs="Arial"/>
-          <w:sz w:val="20"/>
-          <w:szCs w:val="20"/>
-          <w:lang w:val="en-US"/>
-        </w:rPr>
-        <w:t>................................</w:t>
-      </w:r>
-      <w:r>
-        <w:rPr>
-          <w:rFonts w:ascii="Arial" w:hAnsi="Arial" w:cs="Arial"/>
-          <w:sz w:val="20"/>
-          <w:szCs w:val="20"/>
-          <w:lang w:val="en-US"/>
-        </w:rPr>
-        <w:t>.</w:t>
-      </w:r>
-      <w:r>
-        <w:rPr>
-          <w:rFonts w:ascii="Arial" w:hAnsi="Arial" w:cs="Arial"/>
-          <w:sz w:val="20"/>
-          <w:szCs w:val="20"/>
-          <w:lang w:val="fi-FI"/>
-        </w:rPr>
-        <w:t>.</w:t>
+        <w:t>{nik_anak_</w:t>
+      </w:r>
+      <w:r>
+        <w:rPr>
+          <w:rFonts w:ascii="Arial" w:hAnsi="Arial" w:cs="Arial"/>
+          <w:sz w:val="20"/>
+          <w:szCs w:val="20"/>
+          <w:lang w:val="fi-FI"/>
+        </w:rPr>
+        <w:t>2</w:t>
+      </w:r>
+      <w:r>
+        <w:rPr>
+          <w:rFonts w:ascii="Arial" w:hAnsi="Arial" w:cs="Arial"/>
+          <w:sz w:val="20"/>
+          <w:szCs w:val="20"/>
+          <w:lang w:val="fi-FI"/>
+        </w:rPr>
+        <w:t>}</w:t>
       </w:r>
     </w:p>
     <w:p>
@@ -4673,14 +3734,6 @@
           <w:lang w:val="fi-FI"/>
         </w:rPr>
         <w:tab/>
-      </w:r>
-      <w:r>
-        <w:rPr>
-          <w:rFonts w:ascii="Arial" w:hAnsi="Arial" w:cs="Arial"/>
-          <w:sz w:val="20"/>
-          <w:szCs w:val="20"/>
-          <w:lang w:val="fi-FI"/>
-        </w:rPr>
         <w:t xml:space="preserve">: </w:t>
       </w:r>
       <w:r>
@@ -4690,52 +3743,25 @@
           <w:szCs w:val="20"/>
           <w:lang w:val="fi-FI"/>
         </w:rPr>
-        <w:t xml:space="preserve"> </w:t>
-      </w:r>
-      <w:r>
-        <w:rPr>
-          <w:rFonts w:ascii="Arial" w:hAnsi="Arial" w:cs="Arial"/>
-          <w:sz w:val="20"/>
-          <w:szCs w:val="20"/>
-          <w:lang w:val="fi-FI"/>
-        </w:rPr>
-        <w:t>...............................................................................................</w:t>
-      </w:r>
-      <w:r>
-        <w:rPr>
-          <w:rFonts w:ascii="Arial" w:hAnsi="Arial" w:cs="Arial"/>
-          <w:sz w:val="20"/>
-          <w:szCs w:val="20"/>
-          <w:lang w:val="id-ID"/>
-        </w:rPr>
-        <w:t>.</w:t>
-      </w:r>
-      <w:r>
-        <w:rPr>
-          <w:rFonts w:ascii="Arial" w:hAnsi="Arial" w:cs="Arial"/>
-          <w:sz w:val="20"/>
-          <w:szCs w:val="20"/>
-          <w:lang w:val="en-US"/>
-        </w:rPr>
-        <w:t>................................</w:t>
-      </w:r>
-      <w:r>
-        <w:rPr>
-          <w:rFonts w:ascii="Arial" w:hAnsi="Arial" w:cs="Arial"/>
-          <w:sz w:val="20"/>
-          <w:szCs w:val="20"/>
-          <w:lang w:val="en-US"/>
-        </w:rPr>
-        <w:t>.</w:t>
-      </w:r>
-      <w:r>
-        <w:rPr>
-          <w:rFonts w:ascii="Arial" w:hAnsi="Arial" w:cs="Arial"/>
-          <w:sz w:val="20"/>
-          <w:szCs w:val="20"/>
-          <w:lang w:val="fi-FI"/>
-        </w:rPr>
-        <w:t>.</w:t>
+        <w:t xml:space="preserve"> {pekerjaan_anak_</w:t>
+      </w:r>
+      <w:r>
+        <w:rPr>
+          <w:rFonts w:ascii="Arial" w:hAnsi="Arial" w:cs="Arial"/>
+          <w:sz w:val="20"/>
+          <w:szCs w:val="20"/>
+          <w:lang w:val="fi-FI"/>
+        </w:rPr>
+        <w:t>2</w:t>
+      </w:r>
+      <w:r>
+        <w:rPr>
+          <w:rFonts w:ascii="Arial" w:hAnsi="Arial" w:cs="Arial"/>
+          <w:sz w:val="20"/>
+          <w:szCs w:val="20"/>
+          <w:lang w:val="fi-FI"/>
+        </w:rPr>
+        <w:t>}</w:t>
       </w:r>
     </w:p>
     <w:p>
@@ -4748,7 +3774,7 @@
           <w:rFonts w:ascii="Arial" w:hAnsi="Arial" w:cs="Arial"/>
           <w:sz w:val="20"/>
           <w:szCs w:val="20"/>
-          <w:lang w:val="en-US"/>
+          <w:lang w:val="fi-FI"/>
         </w:rPr>
       </w:pPr>
       <w:r>
@@ -4786,33 +3812,34 @@
           <w:lang w:val="fi-FI"/>
         </w:rPr>
         <w:tab/>
-      </w:r>
-      <w:r>
-        <w:rPr>
-          <w:rFonts w:ascii="Arial" w:hAnsi="Arial" w:cs="Arial"/>
-          <w:sz w:val="20"/>
-          <w:szCs w:val="20"/>
-          <w:lang w:val="fi-FI"/>
-        </w:rPr>
-        <w:t>:  ................................................................................................</w:t>
-      </w:r>
-      <w:r>
-        <w:rPr>
-          <w:rFonts w:ascii="Arial" w:hAnsi="Arial" w:cs="Arial"/>
-          <w:sz w:val="20"/>
-          <w:szCs w:val="20"/>
-          <w:lang w:val="id-ID"/>
-        </w:rPr>
-        <w:t>.</w:t>
-      </w:r>
-      <w:r>
-        <w:rPr>
-          <w:rFonts w:ascii="Arial" w:hAnsi="Arial" w:cs="Arial"/>
-          <w:sz w:val="20"/>
-          <w:szCs w:val="20"/>
-          <w:lang w:val="en-US"/>
-        </w:rPr>
-        <w:t>.................................</w:t>
+        <w:t xml:space="preserve">:  </w:t>
+      </w:r>
+      <w:r>
+        <w:rPr>
+          <w:rFonts w:ascii="Arial" w:hAnsi="Arial" w:cs="Arial"/>
+          <w:sz w:val="20"/>
+          <w:szCs w:val="20"/>
+          <w:lang w:val="fi-FI"/>
+        </w:rPr>
+        <w:t>{alamat_anak_</w:t>
+      </w:r>
+      <w:r>
+        <w:rPr>
+          <w:rFonts w:ascii="Arial" w:hAnsi="Arial" w:cs="Arial"/>
+          <w:sz w:val="20"/>
+          <w:szCs w:val="20"/>
+          <w:lang w:val="fi-FI"/>
+        </w:rPr>
+        <w:t>2</w:t>
+      </w:r>
+      <w:r>
+        <w:rPr>
+          <w:rFonts w:ascii="Arial" w:hAnsi="Arial" w:cs="Arial"/>
+          <w:sz w:val="20"/>
+          <w:szCs w:val="20"/>
+          <w:lang w:val="fi-FI"/>
+        </w:rPr>
+        <w:t>}</w:t>
       </w:r>
     </w:p>
     <w:p>
@@ -5279,6 +4306,34 @@
     </w:p>
     <w:p>
       <w:pPr>
+        <w:pStyle w:val="ListParagraph"/>
+        <w:spacing w:line="276" w:lineRule="auto"/>
+        <w:ind w:left="284"/>
+        <w:jc w:val="both"/>
+        <w:rPr>
+          <w:rFonts w:ascii="Arial" w:hAnsi="Arial" w:cs="Arial"/>
+          <w:sz w:val="20"/>
+          <w:szCs w:val="20"/>
+          <w:lang w:val="en-US"/>
+        </w:rPr>
+      </w:pPr>
+    </w:p>
+    <w:p>
+      <w:pPr>
+        <w:pStyle w:val="ListParagraph"/>
+        <w:spacing w:line="276" w:lineRule="auto"/>
+        <w:ind w:left="284"/>
+        <w:jc w:val="both"/>
+        <w:rPr>
+          <w:rFonts w:ascii="Arial" w:hAnsi="Arial" w:cs="Arial"/>
+          <w:sz w:val="20"/>
+          <w:szCs w:val="20"/>
+          <w:lang w:val="en-US"/>
+        </w:rPr>
+      </w:pPr>
+    </w:p>
+    <w:p>
+      <w:pPr>
         <w:spacing w:line="276" w:lineRule="auto"/>
         <w:jc w:val="both"/>
         <w:rPr>
@@ -5288,37 +4343,14 @@
           <w:lang w:val="fi-FI"/>
         </w:rPr>
       </w:pPr>
-    </w:p>
-    <w:p>
-      <w:pPr>
-        <w:spacing w:line="276" w:lineRule="auto"/>
-        <w:jc w:val="both"/>
-        <w:rPr>
-          <w:rFonts w:ascii="Arial" w:hAnsi="Arial" w:cs="Arial"/>
-          <w:sz w:val="20"/>
-          <w:szCs w:val="20"/>
-          <w:lang w:val="fi-FI"/>
-        </w:rPr>
-      </w:pPr>
-    </w:p>
-    <w:p>
-      <w:pPr>
-        <w:spacing w:line="276" w:lineRule="auto"/>
-        <w:jc w:val="both"/>
-        <w:rPr>
-          <w:rFonts w:ascii="Arial" w:hAnsi="Arial" w:cs="Arial"/>
-          <w:sz w:val="20"/>
-          <w:szCs w:val="20"/>
-          <w:lang w:val="fi-FI"/>
-        </w:rPr>
-      </w:pPr>
-      <w:r>
-        <w:rPr>
-          <w:rFonts w:ascii="Arial" w:hAnsi="Arial" w:cs="Arial"/>
-          <w:sz w:val="20"/>
-          <w:szCs w:val="20"/>
-          <w:lang w:val="fi-FI"/>
-        </w:rPr>
+      <w:r>
+        <w:rPr>
+          <w:rFonts w:ascii="Arial" w:hAnsi="Arial" w:cs="Arial"/>
+          <w:sz w:val="20"/>
+          <w:szCs w:val="20"/>
+          <w:lang w:val="fi-FI"/>
+        </w:rPr>
+        <w:lastRenderedPageBreak/>
         <w:t xml:space="preserve">Bahwa anak tersebut </w:t>
       </w:r>
       <w:r>
@@ -9723,8 +8755,6 @@
             </w:r>
           </w:p>
         </w:tc>
-        <w:bookmarkStart w:id="0" w:name="_GoBack"/>
-        <w:bookmarkEnd w:id="0"/>
       </w:tr>
     </w:tbl>
     <w:p>
@@ -9749,11 +8779,11 @@
 </file>
 
 <file path=word/numbering.xml><?xml version="1.0" encoding="utf-8"?>
-<w:numbering xmlns:wpc="http://schemas.microsoft.com/office/word/2010/wordprocessingCanvas" xmlns:mc="http://schemas.openxmlformats.org/markup-compatibility/2006" xmlns:o="urn:schemas-microsoft-com:office:office" xmlns:r="http://schemas.openxmlformats.org/officeDocument/2006/relationships" xmlns:m="http://schemas.openxmlformats.org/officeDocument/2006/math" xmlns:v="urn:schemas-microsoft-com:vml" xmlns:wp14="http://schemas.microsoft.com/office/word/2010/wordprocessingDrawing" xmlns:wp="http://schemas.openxmlformats.org/drawingml/2006/wordprocessingDrawing" xmlns:w10="urn:schemas-microsoft-com:office:word" xmlns:w="http://schemas.openxmlformats.org/wordprocessingml/2006/main" xmlns:w14="http://schemas.microsoft.com/office/word/2010/wordml" xmlns:wpg="http://schemas.microsoft.com/office/word/2010/wordprocessingGroup" xmlns:wpi="http://schemas.microsoft.com/office/word/2010/wordprocessingInk" xmlns:wne="http://schemas.microsoft.com/office/word/2006/wordml" xmlns:wps="http://schemas.microsoft.com/office/word/2010/wordprocessingShape" mc:Ignorable="w14 wp14">
-  <w:abstractNum w:abstractNumId="0">
+<w:numbering xmlns:wpc="http://schemas.microsoft.com/office/word/2010/wordprocessingCanvas" xmlns:cx="http://schemas.microsoft.com/office/drawing/2014/chartex" xmlns:cx1="http://schemas.microsoft.com/office/drawing/2015/9/8/chartex" xmlns:cx2="http://schemas.microsoft.com/office/drawing/2015/10/21/chartex" xmlns:cx3="http://schemas.microsoft.com/office/drawing/2016/5/9/chartex" xmlns:cx4="http://schemas.microsoft.com/office/drawing/2016/5/10/chartex" xmlns:cx5="http://schemas.microsoft.com/office/drawing/2016/5/11/chartex" xmlns:cx6="http://schemas.microsoft.com/office/drawing/2016/5/12/chartex" xmlns:cx7="http://schemas.microsoft.com/office/drawing/2016/5/13/chartex" xmlns:cx8="http://schemas.microsoft.com/office/drawing/2016/5/14/chartex" xmlns:mc="http://schemas.openxmlformats.org/markup-compatibility/2006" xmlns:aink="http://schemas.microsoft.com/office/drawing/2016/ink" xmlns:am3d="http://schemas.microsoft.com/office/drawing/2017/model3d" xmlns:o="urn:schemas-microsoft-com:office:office" xmlns:oel="http://schemas.microsoft.com/office/2019/extlst" xmlns:r="http://schemas.openxmlformats.org/officeDocument/2006/relationships" xmlns:m="http://schemas.openxmlformats.org/officeDocument/2006/math" xmlns:v="urn:schemas-microsoft-com:vml" xmlns:wp14="http://schemas.microsoft.com/office/word/2010/wordprocessingDrawing" xmlns:wp="http://schemas.openxmlformats.org/drawingml/2006/wordprocessingDrawing" xmlns:w10="urn:schemas-microsoft-com:office:word" xmlns:w="http://schemas.openxmlformats.org/wordprocessingml/2006/main" xmlns:w14="http://schemas.microsoft.com/office/word/2010/wordml" xmlns:w15="http://schemas.microsoft.com/office/word/2012/wordml" xmlns:w16cex="http://schemas.microsoft.com/office/word/2018/wordml/cex" xmlns:w16cid="http://schemas.microsoft.com/office/word/2016/wordml/cid" xmlns:w16="http://schemas.microsoft.com/office/word/2018/wordml" xmlns:w16du="http://schemas.microsoft.com/office/word/2023/wordml/word16du" xmlns:w16sdtdh="http://schemas.microsoft.com/office/word/2020/wordml/sdtdatahash" xmlns:w16sdtfl="http://schemas.microsoft.com/office/word/2024/wordml/sdtformatlock" xmlns:w16se="http://schemas.microsoft.com/office/word/2015/wordml/symex" xmlns:wpg="http://schemas.microsoft.com/office/word/2010/wordprocessingGroup" xmlns:wpi="http://schemas.microsoft.com/office/word/2010/wordprocessingInk" xmlns:wne="http://schemas.microsoft.com/office/word/2006/wordml" xmlns:wps="http://schemas.microsoft.com/office/word/2010/wordprocessingShape" mc:Ignorable="w14 w15 w16se w16cid w16 w16cex w16sdtdh w16sdtfl w16du wp14">
+  <w:abstractNum w:abstractNumId="0" w15:restartNumberingAfterBreak="0">
     <w:nsid w:val="017E64AB"/>
     <w:multiLevelType w:val="hybridMultilevel"/>
-    <w:tmpl w:val="9EF256E2"/>
+    <w:tmpl w:val="256CE60E"/>
     <w:lvl w:ilvl="0" w:tplc="3809000F">
       <w:start w:val="1"/>
       <w:numFmt w:val="decimal"/>
@@ -9839,7 +8869,7 @@
       </w:pPr>
     </w:lvl>
   </w:abstractNum>
-  <w:abstractNum w:abstractNumId="1">
+  <w:abstractNum w:abstractNumId="1" w15:restartNumberingAfterBreak="0">
     <w:nsid w:val="06E372D3"/>
     <w:multiLevelType w:val="hybridMultilevel"/>
     <w:tmpl w:val="9EF256E2"/>
@@ -9928,7 +8958,7 @@
       </w:pPr>
     </w:lvl>
   </w:abstractNum>
-  <w:abstractNum w:abstractNumId="2">
+  <w:abstractNum w:abstractNumId="2" w15:restartNumberingAfterBreak="0">
     <w:nsid w:val="4B2B6D9A"/>
     <w:multiLevelType w:val="hybridMultilevel"/>
     <w:tmpl w:val="40EAD766"/>
@@ -10041,7 +9071,7 @@
       </w:rPr>
     </w:lvl>
   </w:abstractNum>
-  <w:abstractNum w:abstractNumId="3">
+  <w:abstractNum w:abstractNumId="3" w15:restartNumberingAfterBreak="0">
     <w:nsid w:val="53152022"/>
     <w:multiLevelType w:val="hybridMultilevel"/>
     <w:tmpl w:val="5162B5A0"/>
@@ -10130,7 +9160,7 @@
       </w:pPr>
     </w:lvl>
   </w:abstractNum>
-  <w:abstractNum w:abstractNumId="4">
+  <w:abstractNum w:abstractNumId="4" w15:restartNumberingAfterBreak="0">
     <w:nsid w:val="56B534BA"/>
     <w:multiLevelType w:val="hybridMultilevel"/>
     <w:tmpl w:val="31CA5F44"/>
@@ -10246,7 +9276,7 @@
       </w:pPr>
     </w:lvl>
   </w:abstractNum>
-  <w:abstractNum w:abstractNumId="5">
+  <w:abstractNum w:abstractNumId="5" w15:restartNumberingAfterBreak="0">
     <w:nsid w:val="64AC68B8"/>
     <w:multiLevelType w:val="hybridMultilevel"/>
     <w:tmpl w:val="31CA5F44"/>
@@ -10362,7 +9392,7 @@
       </w:pPr>
     </w:lvl>
   </w:abstractNum>
-  <w:abstractNum w:abstractNumId="6">
+  <w:abstractNum w:abstractNumId="6" w15:restartNumberingAfterBreak="0">
     <w:nsid w:val="6DF225DF"/>
     <w:multiLevelType w:val="hybridMultilevel"/>
     <w:tmpl w:val="9EF256E2"/>
@@ -10451,7 +9481,7 @@
       </w:pPr>
     </w:lvl>
   </w:abstractNum>
-  <w:abstractNum w:abstractNumId="7">
+  <w:abstractNum w:abstractNumId="7" w15:restartNumberingAfterBreak="0">
     <w:nsid w:val="7E136C81"/>
     <w:multiLevelType w:val="hybridMultilevel"/>
     <w:tmpl w:val="7FC2CB3C"/>
@@ -10564,35 +9594,35 @@
       </w:rPr>
     </w:lvl>
   </w:abstractNum>
-  <w:num w:numId="1">
+  <w:num w:numId="1" w16cid:durableId="2093815500">
     <w:abstractNumId w:val="4"/>
   </w:num>
-  <w:num w:numId="2">
+  <w:num w:numId="2" w16cid:durableId="1584030450">
     <w:abstractNumId w:val="7"/>
   </w:num>
-  <w:num w:numId="3">
+  <w:num w:numId="3" w16cid:durableId="770903247">
     <w:abstractNumId w:val="2"/>
   </w:num>
-  <w:num w:numId="4">
+  <w:num w:numId="4" w16cid:durableId="1917157174">
     <w:abstractNumId w:val="0"/>
   </w:num>
-  <w:num w:numId="5">
+  <w:num w:numId="5" w16cid:durableId="1539001766">
     <w:abstractNumId w:val="5"/>
   </w:num>
-  <w:num w:numId="6">
+  <w:num w:numId="6" w16cid:durableId="1828283284">
     <w:abstractNumId w:val="1"/>
   </w:num>
-  <w:num w:numId="7">
+  <w:num w:numId="7" w16cid:durableId="426584161">
     <w:abstractNumId w:val="6"/>
   </w:num>
-  <w:num w:numId="8">
+  <w:num w:numId="8" w16cid:durableId="1635334407">
     <w:abstractNumId w:val="3"/>
   </w:num>
 </w:numbering>
 </file>
 
 <file path=word/styles.xml><?xml version="1.0" encoding="utf-8"?>
-<w:styles xmlns:mc="http://schemas.openxmlformats.org/markup-compatibility/2006" xmlns:r="http://schemas.openxmlformats.org/officeDocument/2006/relationships" xmlns:w="http://schemas.openxmlformats.org/wordprocessingml/2006/main" xmlns:w14="http://schemas.microsoft.com/office/word/2010/wordml" mc:Ignorable="w14">
+<w:styles xmlns:mc="http://schemas.openxmlformats.org/markup-compatibility/2006" xmlns:r="http://schemas.openxmlformats.org/officeDocument/2006/relationships" xmlns:w="http://schemas.openxmlformats.org/wordprocessingml/2006/main" xmlns:w14="http://schemas.microsoft.com/office/word/2010/wordml" xmlns:w15="http://schemas.microsoft.com/office/word/2012/wordml" xmlns:w16cex="http://schemas.microsoft.com/office/word/2018/wordml/cex" xmlns:w16cid="http://schemas.microsoft.com/office/word/2016/wordml/cid" xmlns:w16="http://schemas.microsoft.com/office/word/2018/wordml" xmlns:w16du="http://schemas.microsoft.com/office/word/2023/wordml/word16du" xmlns:w16sdtdh="http://schemas.microsoft.com/office/word/2020/wordml/sdtdatahash" xmlns:w16sdtfl="http://schemas.microsoft.com/office/word/2024/wordml/sdtformatlock" xmlns:w16se="http://schemas.microsoft.com/office/word/2015/wordml/symex" mc:Ignorable="w14 w15 w16se w16cid w16 w16cex w16sdtdh w16sdtfl w16du">
   <w:docDefaults>
     <w:rPrDefault>
       <w:rPr>
@@ -10608,149 +9638,388 @@
       </w:pPr>
     </w:pPrDefault>
   </w:docDefaults>
-  <w:latentStyles w:defLockedState="0" w:defUIPriority="99" w:defSemiHidden="1" w:defUnhideWhenUsed="1" w:defQFormat="0" w:count="267">
-    <w:lsdException w:name="Normal" w:semiHidden="0" w:uiPriority="0" w:unhideWhenUsed="0" w:qFormat="1"/>
-    <w:lsdException w:name="heading 1" w:semiHidden="0" w:uiPriority="9" w:unhideWhenUsed="0" w:qFormat="1"/>
-    <w:lsdException w:name="heading 2" w:uiPriority="9" w:qFormat="1"/>
-    <w:lsdException w:name="heading 3" w:uiPriority="9" w:qFormat="1"/>
-    <w:lsdException w:name="heading 4" w:uiPriority="9" w:qFormat="1"/>
-    <w:lsdException w:name="heading 5" w:uiPriority="9" w:qFormat="1"/>
-    <w:lsdException w:name="heading 6" w:uiPriority="9" w:qFormat="1"/>
-    <w:lsdException w:name="heading 7" w:uiPriority="9" w:qFormat="1"/>
-    <w:lsdException w:name="heading 8" w:uiPriority="9" w:qFormat="1"/>
-    <w:lsdException w:name="heading 9" w:uiPriority="9" w:qFormat="1"/>
-    <w:lsdException w:name="toc 1" w:uiPriority="39"/>
-    <w:lsdException w:name="toc 2" w:uiPriority="39"/>
-    <w:lsdException w:name="toc 3" w:uiPriority="39"/>
-    <w:lsdException w:name="toc 4" w:uiPriority="39"/>
-    <w:lsdException w:name="toc 5" w:uiPriority="39"/>
-    <w:lsdException w:name="toc 6" w:uiPriority="39"/>
-    <w:lsdException w:name="toc 7" w:uiPriority="39"/>
-    <w:lsdException w:name="toc 8" w:uiPriority="39"/>
-    <w:lsdException w:name="toc 9" w:uiPriority="39"/>
-    <w:lsdException w:name="caption" w:uiPriority="35" w:qFormat="1"/>
-    <w:lsdException w:name="Title" w:semiHidden="0" w:uiPriority="10" w:unhideWhenUsed="0" w:qFormat="1"/>
-    <w:lsdException w:name="Default Paragraph Font" w:uiPriority="1"/>
-    <w:lsdException w:name="Subtitle" w:semiHidden="0" w:uiPriority="11" w:unhideWhenUsed="0" w:qFormat="1"/>
-    <w:lsdException w:name="Strong" w:semiHidden="0" w:uiPriority="22" w:unhideWhenUsed="0" w:qFormat="1"/>
-    <w:lsdException w:name="Emphasis" w:semiHidden="0" w:uiPriority="20" w:unhideWhenUsed="0" w:qFormat="1"/>
-    <w:lsdException w:name="Table Grid" w:semiHidden="0" w:uiPriority="59" w:unhideWhenUsed="0"/>
-    <w:lsdException w:name="Placeholder Text" w:unhideWhenUsed="0"/>
-    <w:lsdException w:name="No Spacing" w:semiHidden="0" w:uiPriority="1" w:unhideWhenUsed="0" w:qFormat="1"/>
-    <w:lsdException w:name="Light Shading" w:semiHidden="0" w:uiPriority="60" w:unhideWhenUsed="0"/>
-    <w:lsdException w:name="Light List" w:semiHidden="0" w:uiPriority="61" w:unhideWhenUsed="0"/>
-    <w:lsdException w:name="Light Grid" w:semiHidden="0" w:uiPriority="62" w:unhideWhenUsed="0"/>
-    <w:lsdException w:name="Medium Shading 1" w:semiHidden="0" w:uiPriority="63" w:unhideWhenUsed="0"/>
-    <w:lsdException w:name="Medium Shading 2" w:semiHidden="0" w:uiPriority="64" w:unhideWhenUsed="0"/>
-    <w:lsdException w:name="Medium List 1" w:semiHidden="0" w:uiPriority="65" w:unhideWhenUsed="0"/>
-    <w:lsdException w:name="Medium List 2" w:semiHidden="0" w:uiPriority="66" w:unhideWhenUsed="0"/>
-    <w:lsdException w:name="Medium Grid 1" w:semiHidden="0" w:uiPriority="67" w:unhideWhenUsed="0"/>
-    <w:lsdException w:name="Medium Grid 2" w:semiHidden="0" w:uiPriority="68" w:unhideWhenUsed="0"/>
-    <w:lsdException w:name="Medium Grid 3" w:semiHidden="0" w:uiPriority="69" w:unhideWhenUsed="0"/>
-    <w:lsdException w:name="Dark List" w:semiHidden="0" w:uiPriority="70" w:unhideWhenUsed="0"/>
-    <w:lsdException w:name="Colorful Shading" w:semiHidden="0" w:uiPriority="71" w:unhideWhenUsed="0"/>
-    <w:lsdException w:name="Colorful List" w:semiHidden="0" w:uiPriority="72" w:unhideWhenUsed="0"/>
-    <w:lsdException w:name="Colorful Grid" w:semiHidden="0" w:uiPriority="73" w:unhideWhenUsed="0"/>
-    <w:lsdException w:name="Light Shading Accent 1" w:semiHidden="0" w:uiPriority="60" w:unhideWhenUsed="0"/>
-    <w:lsdException w:name="Light List Accent 1" w:semiHidden="0" w:uiPriority="61" w:unhideWhenUsed="0"/>
-    <w:lsdException w:name="Light Grid Accent 1" w:semiHidden="0" w:uiPriority="62" w:unhideWhenUsed="0"/>
-    <w:lsdException w:name="Medium Shading 1 Accent 1" w:semiHidden="0" w:uiPriority="63" w:unhideWhenUsed="0"/>
-    <w:lsdException w:name="Medium Shading 2 Accent 1" w:semiHidden="0" w:uiPriority="64" w:unhideWhenUsed="0"/>
-    <w:lsdException w:name="Medium List 1 Accent 1" w:semiHidden="0" w:uiPriority="65" w:unhideWhenUsed="0"/>
-    <w:lsdException w:name="Revision" w:unhideWhenUsed="0"/>
-    <w:lsdException w:name="List Paragraph" w:semiHidden="0" w:uiPriority="34" w:unhideWhenUsed="0" w:qFormat="1"/>
-    <w:lsdException w:name="Quote" w:semiHidden="0" w:uiPriority="29" w:unhideWhenUsed="0" w:qFormat="1"/>
-    <w:lsdException w:name="Intense Quote" w:semiHidden="0" w:uiPriority="30" w:unhideWhenUsed="0" w:qFormat="1"/>
-    <w:lsdException w:name="Medium List 2 Accent 1" w:semiHidden="0" w:uiPriority="66" w:unhideWhenUsed="0"/>
-    <w:lsdException w:name="Medium Grid 1 Accent 1" w:semiHidden="0" w:uiPriority="67" w:unhideWhenUsed="0"/>
-    <w:lsdException w:name="Medium Grid 2 Accent 1" w:semiHidden="0" w:uiPriority="68" w:unhideWhenUsed="0"/>
-    <w:lsdException w:name="Medium Grid 3 Accent 1" w:semiHidden="0" w:uiPriority="69" w:unhideWhenUsed="0"/>
-    <w:lsdException w:name="Dark List Accent 1" w:semiHidden="0" w:uiPriority="70" w:unhideWhenUsed="0"/>
-    <w:lsdException w:name="Colorful Shading Accent 1" w:semiHidden="0" w:uiPriority="71" w:unhideWhenUsed="0"/>
-    <w:lsdException w:name="Colorful List Accent 1" w:semiHidden="0" w:uiPriority="72" w:unhideWhenUsed="0"/>
-    <w:lsdException w:name="Colorful Grid Accent 1" w:semiHidden="0" w:uiPriority="73" w:unhideWhenUsed="0"/>
-    <w:lsdException w:name="Light Shading Accent 2" w:semiHidden="0" w:uiPriority="60" w:unhideWhenUsed="0"/>
-    <w:lsdException w:name="Light List Accent 2" w:semiHidden="0" w:uiPriority="61" w:unhideWhenUsed="0"/>
-    <w:lsdException w:name="Light Grid Accent 2" w:semiHidden="0" w:uiPriority="62" w:unhideWhenUsed="0"/>
-    <w:lsdException w:name="Medium Shading 1 Accent 2" w:semiHidden="0" w:uiPriority="63" w:unhideWhenUsed="0"/>
-    <w:lsdException w:name="Medium Shading 2 Accent 2" w:semiHidden="0" w:uiPriority="64" w:unhideWhenUsed="0"/>
-    <w:lsdException w:name="Medium List 1 Accent 2" w:semiHidden="0" w:uiPriority="65" w:unhideWhenUsed="0"/>
-    <w:lsdException w:name="Medium List 2 Accent 2" w:semiHidden="0" w:uiPriority="66" w:unhideWhenUsed="0"/>
-    <w:lsdException w:name="Medium Grid 1 Accent 2" w:semiHidden="0" w:uiPriority="67" w:unhideWhenUsed="0"/>
-    <w:lsdException w:name="Medium Grid 2 Accent 2" w:semiHidden="0" w:uiPriority="68" w:unhideWhenUsed="0"/>
-    <w:lsdException w:name="Medium Grid 3 Accent 2" w:semiHidden="0" w:uiPriority="69" w:unhideWhenUsed="0"/>
-    <w:lsdException w:name="Dark List Accent 2" w:semiHidden="0" w:uiPriority="70" w:unhideWhenUsed="0"/>
-    <w:lsdException w:name="Colorful Shading Accent 2" w:semiHidden="0" w:uiPriority="71" w:unhideWhenUsed="0"/>
-    <w:lsdException w:name="Colorful List Accent 2" w:semiHidden="0" w:uiPriority="72" w:unhideWhenUsed="0"/>
-    <w:lsdException w:name="Colorful Grid Accent 2" w:semiHidden="0" w:uiPriority="73" w:unhideWhenUsed="0"/>
-    <w:lsdException w:name="Light Shading Accent 3" w:semiHidden="0" w:uiPriority="60" w:unhideWhenUsed="0"/>
-    <w:lsdException w:name="Light List Accent 3" w:semiHidden="0" w:uiPriority="61" w:unhideWhenUsed="0"/>
-    <w:lsdException w:name="Light Grid Accent 3" w:semiHidden="0" w:uiPriority="62" w:unhideWhenUsed="0"/>
-    <w:lsdException w:name="Medium Shading 1 Accent 3" w:semiHidden="0" w:uiPriority="63" w:unhideWhenUsed="0"/>
-    <w:lsdException w:name="Medium Shading 2 Accent 3" w:semiHidden="0" w:uiPriority="64" w:unhideWhenUsed="0"/>
-    <w:lsdException w:name="Medium List 1 Accent 3" w:semiHidden="0" w:uiPriority="65" w:unhideWhenUsed="0"/>
-    <w:lsdException w:name="Medium List 2 Accent 3" w:semiHidden="0" w:uiPriority="66" w:unhideWhenUsed="0"/>
-    <w:lsdException w:name="Medium Grid 1 Accent 3" w:semiHidden="0" w:uiPriority="67" w:unhideWhenUsed="0"/>
-    <w:lsdException w:name="Medium Grid 2 Accent 3" w:semiHidden="0" w:uiPriority="68" w:unhideWhenUsed="0"/>
-    <w:lsdException w:name="Medium Grid 3 Accent 3" w:semiHidden="0" w:uiPriority="69" w:unhideWhenUsed="0"/>
-    <w:lsdException w:name="Dark List Accent 3" w:semiHidden="0" w:uiPriority="70" w:unhideWhenUsed="0"/>
-    <w:lsdException w:name="Colorful Shading Accent 3" w:semiHidden="0" w:uiPriority="71" w:unhideWhenUsed="0"/>
-    <w:lsdException w:name="Colorful List Accent 3" w:semiHidden="0" w:uiPriority="72" w:unhideWhenUsed="0"/>
-    <w:lsdException w:name="Colorful Grid Accent 3" w:semiHidden="0" w:uiPriority="73" w:unhideWhenUsed="0"/>
-    <w:lsdException w:name="Light Shading Accent 4" w:semiHidden="0" w:uiPriority="60" w:unhideWhenUsed="0"/>
-    <w:lsdException w:name="Light List Accent 4" w:semiHidden="0" w:uiPriority="61" w:unhideWhenUsed="0"/>
-    <w:lsdException w:name="Light Grid Accent 4" w:semiHidden="0" w:uiPriority="62" w:unhideWhenUsed="0"/>
-    <w:lsdException w:name="Medium Shading 1 Accent 4" w:semiHidden="0" w:uiPriority="63" w:unhideWhenUsed="0"/>
-    <w:lsdException w:name="Medium Shading 2 Accent 4" w:semiHidden="0" w:uiPriority="64" w:unhideWhenUsed="0"/>
-    <w:lsdException w:name="Medium List 1 Accent 4" w:semiHidden="0" w:uiPriority="65" w:unhideWhenUsed="0"/>
-    <w:lsdException w:name="Medium List 2 Accent 4" w:semiHidden="0" w:uiPriority="66" w:unhideWhenUsed="0"/>
-    <w:lsdException w:name="Medium Grid 1 Accent 4" w:semiHidden="0" w:uiPriority="67" w:unhideWhenUsed="0"/>
-    <w:lsdException w:name="Medium Grid 2 Accent 4" w:semiHidden="0" w:uiPriority="68" w:unhideWhenUsed="0"/>
-    <w:lsdException w:name="Medium Grid 3 Accent 4" w:semiHidden="0" w:uiPriority="69" w:unhideWhenUsed="0"/>
-    <w:lsdException w:name="Dark List Accent 4" w:semiHidden="0" w:uiPriority="70" w:unhideWhenUsed="0"/>
-    <w:lsdException w:name="Colorful Shading Accent 4" w:semiHidden="0" w:uiPriority="71" w:unhideWhenUsed="0"/>
-    <w:lsdException w:name="Colorful List Accent 4" w:semiHidden="0" w:uiPriority="72" w:unhideWhenUsed="0"/>
-    <w:lsdException w:name="Colorful Grid Accent 4" w:semiHidden="0" w:uiPriority="73" w:unhideWhenUsed="0"/>
-    <w:lsdException w:name="Light Shading Accent 5" w:semiHidden="0" w:uiPriority="60" w:unhideWhenUsed="0"/>
-    <w:lsdException w:name="Light List Accent 5" w:semiHidden="0" w:uiPriority="61" w:unhideWhenUsed="0"/>
-    <w:lsdException w:name="Light Grid Accent 5" w:semiHidden="0" w:uiPriority="62" w:unhideWhenUsed="0"/>
-    <w:lsdException w:name="Medium Shading 1 Accent 5" w:semiHidden="0" w:uiPriority="63" w:unhideWhenUsed="0"/>
-    <w:lsdException w:name="Medium Shading 2 Accent 5" w:semiHidden="0" w:uiPriority="64" w:unhideWhenUsed="0"/>
-    <w:lsdException w:name="Medium List 1 Accent 5" w:semiHidden="0" w:uiPriority="65" w:unhideWhenUsed="0"/>
-    <w:lsdException w:name="Medium List 2 Accent 5" w:semiHidden="0" w:uiPriority="66" w:unhideWhenUsed="0"/>
-    <w:lsdException w:name="Medium Grid 1 Accent 5" w:semiHidden="0" w:uiPriority="67" w:unhideWhenUsed="0"/>
-    <w:lsdException w:name="Medium Grid 2 Accent 5" w:semiHidden="0" w:uiPriority="68" w:unhideWhenUsed="0"/>
-    <w:lsdException w:name="Medium Grid 3 Accent 5" w:semiHidden="0" w:uiPriority="69" w:unhideWhenUsed="0"/>
-    <w:lsdException w:name="Dark List Accent 5" w:semiHidden="0" w:uiPriority="70" w:unhideWhenUsed="0"/>
-    <w:lsdException w:name="Colorful Shading Accent 5" w:semiHidden="0" w:uiPriority="71" w:unhideWhenUsed="0"/>
-    <w:lsdException w:name="Colorful List Accent 5" w:semiHidden="0" w:uiPriority="72" w:unhideWhenUsed="0"/>
-    <w:lsdException w:name="Colorful Grid Accent 5" w:semiHidden="0" w:uiPriority="73" w:unhideWhenUsed="0"/>
-    <w:lsdException w:name="Light Shading Accent 6" w:semiHidden="0" w:uiPriority="60" w:unhideWhenUsed="0"/>
-    <w:lsdException w:name="Light List Accent 6" w:semiHidden="0" w:uiPriority="61" w:unhideWhenUsed="0"/>
-    <w:lsdException w:name="Light Grid Accent 6" w:semiHidden="0" w:uiPriority="62" w:unhideWhenUsed="0"/>
-    <w:lsdException w:name="Medium Shading 1 Accent 6" w:semiHidden="0" w:uiPriority="63" w:unhideWhenUsed="0"/>
-    <w:lsdException w:name="Medium Shading 2 Accent 6" w:semiHidden="0" w:uiPriority="64" w:unhideWhenUsed="0"/>
-    <w:lsdException w:name="Medium List 1 Accent 6" w:semiHidden="0" w:uiPriority="65" w:unhideWhenUsed="0"/>
-    <w:lsdException w:name="Medium List 2 Accent 6" w:semiHidden="0" w:uiPriority="66" w:unhideWhenUsed="0"/>
-    <w:lsdException w:name="Medium Grid 1 Accent 6" w:semiHidden="0" w:uiPriority="67" w:unhideWhenUsed="0"/>
-    <w:lsdException w:name="Medium Grid 2 Accent 6" w:semiHidden="0" w:uiPriority="68" w:unhideWhenUsed="0"/>
-    <w:lsdException w:name="Medium Grid 3 Accent 6" w:semiHidden="0" w:uiPriority="69" w:unhideWhenUsed="0"/>
-    <w:lsdException w:name="Dark List Accent 6" w:semiHidden="0" w:uiPriority="70" w:unhideWhenUsed="0"/>
-    <w:lsdException w:name="Colorful Shading Accent 6" w:semiHidden="0" w:uiPriority="71" w:unhideWhenUsed="0"/>
-    <w:lsdException w:name="Colorful List Accent 6" w:semiHidden="0" w:uiPriority="72" w:unhideWhenUsed="0"/>
-    <w:lsdException w:name="Colorful Grid Accent 6" w:semiHidden="0" w:uiPriority="73" w:unhideWhenUsed="0"/>
-    <w:lsdException w:name="Subtle Emphasis" w:semiHidden="0" w:uiPriority="19" w:unhideWhenUsed="0" w:qFormat="1"/>
-    <w:lsdException w:name="Intense Emphasis" w:semiHidden="0" w:uiPriority="21" w:unhideWhenUsed="0" w:qFormat="1"/>
-    <w:lsdException w:name="Subtle Reference" w:semiHidden="0" w:uiPriority="31" w:unhideWhenUsed="0" w:qFormat="1"/>
-    <w:lsdException w:name="Intense Reference" w:semiHidden="0" w:uiPriority="32" w:unhideWhenUsed="0" w:qFormat="1"/>
-    <w:lsdException w:name="Book Title" w:semiHidden="0" w:uiPriority="33" w:unhideWhenUsed="0" w:qFormat="1"/>
-    <w:lsdException w:name="Bibliography" w:uiPriority="37"/>
-    <w:lsdException w:name="TOC Heading" w:uiPriority="39" w:qFormat="1"/>
+  <w:latentStyles w:defLockedState="0" w:defUIPriority="99" w:defSemiHidden="0" w:defUnhideWhenUsed="0" w:defQFormat="0" w:count="376">
+    <w:lsdException w:name="Normal" w:uiPriority="0" w:qFormat="1"/>
+    <w:lsdException w:name="heading 1" w:uiPriority="9" w:qFormat="1"/>
+    <w:lsdException w:name="heading 2" w:semiHidden="1" w:uiPriority="9" w:unhideWhenUsed="1" w:qFormat="1"/>
+    <w:lsdException w:name="heading 3" w:semiHidden="1" w:uiPriority="9" w:unhideWhenUsed="1" w:qFormat="1"/>
+    <w:lsdException w:name="heading 4" w:semiHidden="1" w:uiPriority="9" w:unhideWhenUsed="1" w:qFormat="1"/>
+    <w:lsdException w:name="heading 5" w:semiHidden="1" w:uiPriority="9" w:unhideWhenUsed="1" w:qFormat="1"/>
+    <w:lsdException w:name="heading 6" w:semiHidden="1" w:uiPriority="9" w:unhideWhenUsed="1" w:qFormat="1"/>
+    <w:lsdException w:name="heading 7" w:semiHidden="1" w:uiPriority="9" w:unhideWhenUsed="1" w:qFormat="1"/>
+    <w:lsdException w:name="heading 8" w:semiHidden="1" w:uiPriority="9" w:unhideWhenUsed="1" w:qFormat="1"/>
+    <w:lsdException w:name="heading 9" w:semiHidden="1" w:uiPriority="9" w:unhideWhenUsed="1" w:qFormat="1"/>
+    <w:lsdException w:name="index 1" w:semiHidden="1" w:unhideWhenUsed="1"/>
+    <w:lsdException w:name="index 2" w:semiHidden="1" w:unhideWhenUsed="1"/>
+    <w:lsdException w:name="index 3" w:semiHidden="1" w:unhideWhenUsed="1"/>
+    <w:lsdException w:name="index 4" w:semiHidden="1" w:unhideWhenUsed="1"/>
+    <w:lsdException w:name="index 5" w:semiHidden="1" w:unhideWhenUsed="1"/>
+    <w:lsdException w:name="index 6" w:semiHidden="1" w:unhideWhenUsed="1"/>
+    <w:lsdException w:name="index 7" w:semiHidden="1" w:unhideWhenUsed="1"/>
+    <w:lsdException w:name="index 8" w:semiHidden="1" w:unhideWhenUsed="1"/>
+    <w:lsdException w:name="index 9" w:semiHidden="1" w:unhideWhenUsed="1"/>
+    <w:lsdException w:name="toc 1" w:semiHidden="1" w:uiPriority="39" w:unhideWhenUsed="1"/>
+    <w:lsdException w:name="toc 2" w:semiHidden="1" w:uiPriority="39" w:unhideWhenUsed="1"/>
+    <w:lsdException w:name="toc 3" w:semiHidden="1" w:uiPriority="39" w:unhideWhenUsed="1"/>
+    <w:lsdException w:name="toc 4" w:semiHidden="1" w:uiPriority="39" w:unhideWhenUsed="1"/>
+    <w:lsdException w:name="toc 5" w:semiHidden="1" w:uiPriority="39" w:unhideWhenUsed="1"/>
+    <w:lsdException w:name="toc 6" w:semiHidden="1" w:uiPriority="39" w:unhideWhenUsed="1"/>
+    <w:lsdException w:name="toc 7" w:semiHidden="1" w:uiPriority="39" w:unhideWhenUsed="1"/>
+    <w:lsdException w:name="toc 8" w:semiHidden="1" w:uiPriority="39" w:unhideWhenUsed="1"/>
+    <w:lsdException w:name="toc 9" w:semiHidden="1" w:uiPriority="39" w:unhideWhenUsed="1"/>
+    <w:lsdException w:name="Normal Indent" w:semiHidden="1" w:unhideWhenUsed="1"/>
+    <w:lsdException w:name="footnote text" w:semiHidden="1" w:unhideWhenUsed="1"/>
+    <w:lsdException w:name="annotation text" w:semiHidden="1" w:unhideWhenUsed="1"/>
+    <w:lsdException w:name="header" w:semiHidden="1" w:unhideWhenUsed="1"/>
+    <w:lsdException w:name="footer" w:semiHidden="1" w:unhideWhenUsed="1"/>
+    <w:lsdException w:name="index heading" w:semiHidden="1" w:unhideWhenUsed="1"/>
+    <w:lsdException w:name="caption" w:semiHidden="1" w:uiPriority="35" w:unhideWhenUsed="1" w:qFormat="1"/>
+    <w:lsdException w:name="table of figures" w:semiHidden="1" w:unhideWhenUsed="1"/>
+    <w:lsdException w:name="envelope address" w:semiHidden="1" w:unhideWhenUsed="1"/>
+    <w:lsdException w:name="envelope return" w:semiHidden="1" w:unhideWhenUsed="1"/>
+    <w:lsdException w:name="footnote reference" w:semiHidden="1" w:unhideWhenUsed="1"/>
+    <w:lsdException w:name="annotation reference" w:semiHidden="1" w:unhideWhenUsed="1"/>
+    <w:lsdException w:name="line number" w:semiHidden="1" w:unhideWhenUsed="1"/>
+    <w:lsdException w:name="page number" w:semiHidden="1" w:unhideWhenUsed="1"/>
+    <w:lsdException w:name="endnote reference" w:semiHidden="1" w:unhideWhenUsed="1"/>
+    <w:lsdException w:name="endnote text" w:semiHidden="1" w:unhideWhenUsed="1"/>
+    <w:lsdException w:name="table of authorities" w:semiHidden="1" w:unhideWhenUsed="1"/>
+    <w:lsdException w:name="macro" w:semiHidden="1" w:unhideWhenUsed="1"/>
+    <w:lsdException w:name="toa heading" w:semiHidden="1" w:unhideWhenUsed="1"/>
+    <w:lsdException w:name="List" w:semiHidden="1" w:unhideWhenUsed="1"/>
+    <w:lsdException w:name="List Bullet" w:semiHidden="1" w:unhideWhenUsed="1"/>
+    <w:lsdException w:name="List Number" w:semiHidden="1" w:unhideWhenUsed="1"/>
+    <w:lsdException w:name="List 2" w:semiHidden="1" w:unhideWhenUsed="1"/>
+    <w:lsdException w:name="List 3" w:semiHidden="1" w:unhideWhenUsed="1"/>
+    <w:lsdException w:name="List 4" w:semiHidden="1" w:unhideWhenUsed="1"/>
+    <w:lsdException w:name="List 5" w:semiHidden="1" w:unhideWhenUsed="1"/>
+    <w:lsdException w:name="List Bullet 2" w:semiHidden="1" w:unhideWhenUsed="1"/>
+    <w:lsdException w:name="List Bullet 3" w:semiHidden="1" w:unhideWhenUsed="1"/>
+    <w:lsdException w:name="List Bullet 4" w:semiHidden="1" w:unhideWhenUsed="1"/>
+    <w:lsdException w:name="List Bullet 5" w:semiHidden="1" w:unhideWhenUsed="1"/>
+    <w:lsdException w:name="List Number 2" w:semiHidden="1" w:unhideWhenUsed="1"/>
+    <w:lsdException w:name="List Number 3" w:semiHidden="1" w:unhideWhenUsed="1"/>
+    <w:lsdException w:name="List Number 4" w:semiHidden="1" w:unhideWhenUsed="1"/>
+    <w:lsdException w:name="List Number 5" w:semiHidden="1" w:unhideWhenUsed="1"/>
+    <w:lsdException w:name="Title" w:uiPriority="10" w:qFormat="1"/>
+    <w:lsdException w:name="Closing" w:semiHidden="1" w:unhideWhenUsed="1"/>
+    <w:lsdException w:name="Signature" w:semiHidden="1" w:unhideWhenUsed="1"/>
+    <w:lsdException w:name="Default Paragraph Font" w:semiHidden="1" w:uiPriority="1" w:unhideWhenUsed="1"/>
+    <w:lsdException w:name="Body Text" w:semiHidden="1" w:unhideWhenUsed="1"/>
+    <w:lsdException w:name="Body Text Indent" w:semiHidden="1" w:unhideWhenUsed="1"/>
+    <w:lsdException w:name="List Continue" w:semiHidden="1" w:unhideWhenUsed="1"/>
+    <w:lsdException w:name="List Continue 2" w:semiHidden="1" w:unhideWhenUsed="1"/>
+    <w:lsdException w:name="List Continue 3" w:semiHidden="1" w:unhideWhenUsed="1"/>
+    <w:lsdException w:name="List Continue 4" w:semiHidden="1" w:unhideWhenUsed="1"/>
+    <w:lsdException w:name="List Continue 5" w:semiHidden="1" w:unhideWhenUsed="1"/>
+    <w:lsdException w:name="Message Header" w:semiHidden="1" w:unhideWhenUsed="1"/>
+    <w:lsdException w:name="Subtitle" w:uiPriority="11" w:qFormat="1"/>
+    <w:lsdException w:name="Salutation" w:semiHidden="1" w:unhideWhenUsed="1"/>
+    <w:lsdException w:name="Date" w:semiHidden="1" w:unhideWhenUsed="1"/>
+    <w:lsdException w:name="Body Text First Indent" w:semiHidden="1" w:unhideWhenUsed="1"/>
+    <w:lsdException w:name="Body Text First Indent 2" w:semiHidden="1" w:unhideWhenUsed="1"/>
+    <w:lsdException w:name="Note Heading" w:semiHidden="1" w:unhideWhenUsed="1"/>
+    <w:lsdException w:name="Body Text 2" w:semiHidden="1" w:unhideWhenUsed="1"/>
+    <w:lsdException w:name="Body Text 3" w:semiHidden="1" w:unhideWhenUsed="1"/>
+    <w:lsdException w:name="Body Text Indent 2" w:semiHidden="1" w:unhideWhenUsed="1"/>
+    <w:lsdException w:name="Body Text Indent 3" w:semiHidden="1" w:unhideWhenUsed="1"/>
+    <w:lsdException w:name="Block Text" w:semiHidden="1" w:unhideWhenUsed="1"/>
+    <w:lsdException w:name="Hyperlink" w:semiHidden="1" w:unhideWhenUsed="1"/>
+    <w:lsdException w:name="FollowedHyperlink" w:semiHidden="1" w:unhideWhenUsed="1"/>
+    <w:lsdException w:name="Strong" w:uiPriority="22" w:qFormat="1"/>
+    <w:lsdException w:name="Emphasis" w:uiPriority="20" w:qFormat="1"/>
+    <w:lsdException w:name="Document Map" w:semiHidden="1" w:unhideWhenUsed="1"/>
+    <w:lsdException w:name="Plain Text" w:semiHidden="1" w:unhideWhenUsed="1"/>
+    <w:lsdException w:name="E-mail Signature" w:semiHidden="1" w:unhideWhenUsed="1"/>
+    <w:lsdException w:name="HTML Top of Form" w:semiHidden="1" w:unhideWhenUsed="1"/>
+    <w:lsdException w:name="HTML Bottom of Form" w:semiHidden="1" w:unhideWhenUsed="1"/>
+    <w:lsdException w:name="Normal (Web)" w:semiHidden="1" w:unhideWhenUsed="1"/>
+    <w:lsdException w:name="HTML Acronym" w:semiHidden="1" w:unhideWhenUsed="1"/>
+    <w:lsdException w:name="HTML Address" w:semiHidden="1" w:unhideWhenUsed="1"/>
+    <w:lsdException w:name="HTML Cite" w:semiHidden="1" w:unhideWhenUsed="1"/>
+    <w:lsdException w:name="HTML Code" w:semiHidden="1" w:unhideWhenUsed="1"/>
+    <w:lsdException w:name="HTML Definition" w:semiHidden="1" w:unhideWhenUsed="1"/>
+    <w:lsdException w:name="HTML Keyboard" w:semiHidden="1" w:unhideWhenUsed="1"/>
+    <w:lsdException w:name="HTML Preformatted" w:semiHidden="1" w:unhideWhenUsed="1"/>
+    <w:lsdException w:name="HTML Sample" w:semiHidden="1" w:unhideWhenUsed="1"/>
+    <w:lsdException w:name="HTML Typewriter" w:semiHidden="1" w:unhideWhenUsed="1"/>
+    <w:lsdException w:name="HTML Variable" w:semiHidden="1" w:unhideWhenUsed="1"/>
+    <w:lsdException w:name="Normal Table" w:semiHidden="1" w:unhideWhenUsed="1"/>
+    <w:lsdException w:name="annotation subject" w:semiHidden="1" w:unhideWhenUsed="1"/>
+    <w:lsdException w:name="No List" w:semiHidden="1" w:unhideWhenUsed="1"/>
+    <w:lsdException w:name="Outline List 1" w:semiHidden="1" w:unhideWhenUsed="1"/>
+    <w:lsdException w:name="Outline List 2" w:semiHidden="1" w:unhideWhenUsed="1"/>
+    <w:lsdException w:name="Outline List 3" w:semiHidden="1" w:unhideWhenUsed="1"/>
+    <w:lsdException w:name="Table Simple 1" w:semiHidden="1" w:unhideWhenUsed="1"/>
+    <w:lsdException w:name="Table Simple 2" w:semiHidden="1" w:unhideWhenUsed="1"/>
+    <w:lsdException w:name="Table Simple 3" w:semiHidden="1" w:unhideWhenUsed="1"/>
+    <w:lsdException w:name="Table Classic 1" w:semiHidden="1" w:unhideWhenUsed="1"/>
+    <w:lsdException w:name="Table Classic 2" w:semiHidden="1" w:unhideWhenUsed="1"/>
+    <w:lsdException w:name="Table Classic 3" w:semiHidden="1" w:unhideWhenUsed="1"/>
+    <w:lsdException w:name="Table Classic 4" w:semiHidden="1" w:unhideWhenUsed="1"/>
+    <w:lsdException w:name="Table Colorful 1" w:semiHidden="1" w:unhideWhenUsed="1"/>
+    <w:lsdException w:name="Table Colorful 2" w:semiHidden="1" w:unhideWhenUsed="1"/>
+    <w:lsdException w:name="Table Colorful 3" w:semiHidden="1" w:unhideWhenUsed="1"/>
+    <w:lsdException w:name="Table Columns 1" w:semiHidden="1" w:unhideWhenUsed="1"/>
+    <w:lsdException w:name="Table Columns 2" w:semiHidden="1" w:unhideWhenUsed="1"/>
+    <w:lsdException w:name="Table Columns 3" w:semiHidden="1" w:unhideWhenUsed="1"/>
+    <w:lsdException w:name="Table Columns 4" w:semiHidden="1" w:unhideWhenUsed="1"/>
+    <w:lsdException w:name="Table Columns 5" w:semiHidden="1" w:unhideWhenUsed="1"/>
+    <w:lsdException w:name="Table Grid 1" w:semiHidden="1" w:unhideWhenUsed="1"/>
+    <w:lsdException w:name="Table Grid 2" w:semiHidden="1" w:unhideWhenUsed="1"/>
+    <w:lsdException w:name="Table Grid 3" w:semiHidden="1" w:unhideWhenUsed="1"/>
+    <w:lsdException w:name="Table Grid 4" w:semiHidden="1" w:unhideWhenUsed="1"/>
+    <w:lsdException w:name="Table Grid 5" w:semiHidden="1" w:unhideWhenUsed="1"/>
+    <w:lsdException w:name="Table Grid 6" w:semiHidden="1" w:unhideWhenUsed="1"/>
+    <w:lsdException w:name="Table Grid 7" w:semiHidden="1" w:unhideWhenUsed="1"/>
+    <w:lsdException w:name="Table Grid 8" w:semiHidden="1" w:unhideWhenUsed="1"/>
+    <w:lsdException w:name="Table List 1" w:semiHidden="1" w:unhideWhenUsed="1"/>
+    <w:lsdException w:name="Table List 2" w:semiHidden="1" w:unhideWhenUsed="1"/>
+    <w:lsdException w:name="Table List 3" w:semiHidden="1" w:unhideWhenUsed="1"/>
+    <w:lsdException w:name="Table List 4" w:semiHidden="1" w:unhideWhenUsed="1"/>
+    <w:lsdException w:name="Table List 5" w:semiHidden="1" w:unhideWhenUsed="1"/>
+    <w:lsdException w:name="Table List 6" w:semiHidden="1" w:unhideWhenUsed="1"/>
+    <w:lsdException w:name="Table List 7" w:semiHidden="1" w:unhideWhenUsed="1"/>
+    <w:lsdException w:name="Table List 8" w:semiHidden="1" w:unhideWhenUsed="1"/>
+    <w:lsdException w:name="Table 3D effects 1" w:semiHidden="1" w:unhideWhenUsed="1"/>
+    <w:lsdException w:name="Table 3D effects 2" w:semiHidden="1" w:unhideWhenUsed="1"/>
+    <w:lsdException w:name="Table 3D effects 3" w:semiHidden="1" w:unhideWhenUsed="1"/>
+    <w:lsdException w:name="Table Contemporary" w:semiHidden="1" w:unhideWhenUsed="1"/>
+    <w:lsdException w:name="Table Elegant" w:semiHidden="1" w:unhideWhenUsed="1"/>
+    <w:lsdException w:name="Table Professional" w:semiHidden="1" w:unhideWhenUsed="1"/>
+    <w:lsdException w:name="Table Subtle 1" w:semiHidden="1" w:unhideWhenUsed="1"/>
+    <w:lsdException w:name="Table Subtle 2" w:semiHidden="1" w:unhideWhenUsed="1"/>
+    <w:lsdException w:name="Table Web 1" w:semiHidden="1" w:unhideWhenUsed="1"/>
+    <w:lsdException w:name="Table Web 2" w:semiHidden="1" w:unhideWhenUsed="1"/>
+    <w:lsdException w:name="Table Web 3" w:semiHidden="1" w:unhideWhenUsed="1"/>
+    <w:lsdException w:name="Balloon Text" w:semiHidden="1" w:unhideWhenUsed="1"/>
+    <w:lsdException w:name="Table Grid" w:uiPriority="59"/>
+    <w:lsdException w:name="Table Theme" w:semiHidden="1" w:unhideWhenUsed="1"/>
+    <w:lsdException w:name="Placeholder Text" w:semiHidden="1"/>
+    <w:lsdException w:name="No Spacing" w:uiPriority="1" w:qFormat="1"/>
+    <w:lsdException w:name="Light Shading" w:uiPriority="60"/>
+    <w:lsdException w:name="Light List" w:uiPriority="61"/>
+    <w:lsdException w:name="Light Grid" w:uiPriority="62"/>
+    <w:lsdException w:name="Medium Shading 1" w:uiPriority="63"/>
+    <w:lsdException w:name="Medium Shading 2" w:uiPriority="64"/>
+    <w:lsdException w:name="Medium List 1" w:uiPriority="65"/>
+    <w:lsdException w:name="Medium List 2" w:uiPriority="66"/>
+    <w:lsdException w:name="Medium Grid 1" w:uiPriority="67"/>
+    <w:lsdException w:name="Medium Grid 2" w:uiPriority="68"/>
+    <w:lsdException w:name="Medium Grid 3" w:uiPriority="69"/>
+    <w:lsdException w:name="Dark List" w:uiPriority="70"/>
+    <w:lsdException w:name="Colorful Shading" w:uiPriority="71"/>
+    <w:lsdException w:name="Colorful List" w:uiPriority="72"/>
+    <w:lsdException w:name="Colorful Grid" w:uiPriority="73"/>
+    <w:lsdException w:name="Light Shading Accent 1" w:uiPriority="60"/>
+    <w:lsdException w:name="Light List Accent 1" w:uiPriority="61"/>
+    <w:lsdException w:name="Light Grid Accent 1" w:uiPriority="62"/>
+    <w:lsdException w:name="Medium Shading 1 Accent 1" w:uiPriority="63"/>
+    <w:lsdException w:name="Medium Shading 2 Accent 1" w:uiPriority="64"/>
+    <w:lsdException w:name="Medium List 1 Accent 1" w:uiPriority="65"/>
+    <w:lsdException w:name="Revision" w:semiHidden="1"/>
+    <w:lsdException w:name="List Paragraph" w:uiPriority="34" w:qFormat="1"/>
+    <w:lsdException w:name="Quote" w:uiPriority="29" w:qFormat="1"/>
+    <w:lsdException w:name="Intense Quote" w:uiPriority="30" w:qFormat="1"/>
+    <w:lsdException w:name="Medium List 2 Accent 1" w:uiPriority="66"/>
+    <w:lsdException w:name="Medium Grid 1 Accent 1" w:uiPriority="67"/>
+    <w:lsdException w:name="Medium Grid 2 Accent 1" w:uiPriority="68"/>
+    <w:lsdException w:name="Medium Grid 3 Accent 1" w:uiPriority="69"/>
+    <w:lsdException w:name="Dark List Accent 1" w:uiPriority="70"/>
+    <w:lsdException w:name="Colorful Shading Accent 1" w:uiPriority="71"/>
+    <w:lsdException w:name="Colorful List Accent 1" w:uiPriority="72"/>
+    <w:lsdException w:name="Colorful Grid Accent 1" w:uiPriority="73"/>
+    <w:lsdException w:name="Light Shading Accent 2" w:uiPriority="60"/>
+    <w:lsdException w:name="Light List Accent 2" w:uiPriority="61"/>
+    <w:lsdException w:name="Light Grid Accent 2" w:uiPriority="62"/>
+    <w:lsdException w:name="Medium Shading 1 Accent 2" w:uiPriority="63"/>
+    <w:lsdException w:name="Medium Shading 2 Accent 2" w:uiPriority="64"/>
+    <w:lsdException w:name="Medium List 1 Accent 2" w:uiPriority="65"/>
+    <w:lsdException w:name="Medium List 2 Accent 2" w:uiPriority="66"/>
+    <w:lsdException w:name="Medium Grid 1 Accent 2" w:uiPriority="67"/>
+    <w:lsdException w:name="Medium Grid 2 Accent 2" w:uiPriority="68"/>
+    <w:lsdException w:name="Medium Grid 3 Accent 2" w:uiPriority="69"/>
+    <w:lsdException w:name="Dark List Accent 2" w:uiPriority="70"/>
+    <w:lsdException w:name="Colorful Shading Accent 2" w:uiPriority="71"/>
+    <w:lsdException w:name="Colorful List Accent 2" w:uiPriority="72"/>
+    <w:lsdException w:name="Colorful Grid Accent 2" w:uiPriority="73"/>
+    <w:lsdException w:name="Light Shading Accent 3" w:uiPriority="60"/>
+    <w:lsdException w:name="Light List Accent 3" w:uiPriority="61"/>
+    <w:lsdException w:name="Light Grid Accent 3" w:uiPriority="62"/>
+    <w:lsdException w:name="Medium Shading 1 Accent 3" w:uiPriority="63"/>
+    <w:lsdException w:name="Medium Shading 2 Accent 3" w:uiPriority="64"/>
+    <w:lsdException w:name="Medium List 1 Accent 3" w:uiPriority="65"/>
+    <w:lsdException w:name="Medium List 2 Accent 3" w:uiPriority="66"/>
+    <w:lsdException w:name="Medium Grid 1 Accent 3" w:uiPriority="67"/>
+    <w:lsdException w:name="Medium Grid 2 Accent 3" w:uiPriority="68"/>
+    <w:lsdException w:name="Medium Grid 3 Accent 3" w:uiPriority="69"/>
+    <w:lsdException w:name="Dark List Accent 3" w:uiPriority="70"/>
+    <w:lsdException w:name="Colorful Shading Accent 3" w:uiPriority="71"/>
+    <w:lsdException w:name="Colorful List Accent 3" w:uiPriority="72"/>
+    <w:lsdException w:name="Colorful Grid Accent 3" w:uiPriority="73"/>
+    <w:lsdException w:name="Light Shading Accent 4" w:uiPriority="60"/>
+    <w:lsdException w:name="Light List Accent 4" w:uiPriority="61"/>
+    <w:lsdException w:name="Light Grid Accent 4" w:uiPriority="62"/>
+    <w:lsdException w:name="Medium Shading 1 Accent 4" w:uiPriority="63"/>
+    <w:lsdException w:name="Medium Shading 2 Accent 4" w:uiPriority="64"/>
+    <w:lsdException w:name="Medium List 1 Accent 4" w:uiPriority="65"/>
+    <w:lsdException w:name="Medium List 2 Accent 4" w:uiPriority="66"/>
+    <w:lsdException w:name="Medium Grid 1 Accent 4" w:uiPriority="67"/>
+    <w:lsdException w:name="Medium Grid 2 Accent 4" w:uiPriority="68"/>
+    <w:lsdException w:name="Medium Grid 3 Accent 4" w:uiPriority="69"/>
+    <w:lsdException w:name="Dark List Accent 4" w:uiPriority="70"/>
+    <w:lsdException w:name="Colorful Shading Accent 4" w:uiPriority="71"/>
+    <w:lsdException w:name="Colorful List Accent 4" w:uiPriority="72"/>
+    <w:lsdException w:name="Colorful Grid Accent 4" w:uiPriority="73"/>
+    <w:lsdException w:name="Light Shading Accent 5" w:uiPriority="60"/>
+    <w:lsdException w:name="Light List Accent 5" w:uiPriority="61"/>
+    <w:lsdException w:name="Light Grid Accent 5" w:uiPriority="62"/>
+    <w:lsdException w:name="Medium Shading 1 Accent 5" w:uiPriority="63"/>
+    <w:lsdException w:name="Medium Shading 2 Accent 5" w:uiPriority="64"/>
+    <w:lsdException w:name="Medium List 1 Accent 5" w:uiPriority="65"/>
+    <w:lsdException w:name="Medium List 2 Accent 5" w:uiPriority="66"/>
+    <w:lsdException w:name="Medium Grid 1 Accent 5" w:uiPriority="67"/>
+    <w:lsdException w:name="Medium Grid 2 Accent 5" w:uiPriority="68"/>
+    <w:lsdException w:name="Medium Grid 3 Accent 5" w:uiPriority="69"/>
+    <w:lsdException w:name="Dark List Accent 5" w:uiPriority="70"/>
+    <w:lsdException w:name="Colorful Shading Accent 5" w:uiPriority="71"/>
+    <w:lsdException w:name="Colorful List Accent 5" w:uiPriority="72"/>
+    <w:lsdException w:name="Colorful Grid Accent 5" w:uiPriority="73"/>
+    <w:lsdException w:name="Light Shading Accent 6" w:uiPriority="60"/>
+    <w:lsdException w:name="Light List Accent 6" w:uiPriority="61"/>
+    <w:lsdException w:name="Light Grid Accent 6" w:uiPriority="62"/>
+    <w:lsdException w:name="Medium Shading 1 Accent 6" w:uiPriority="63"/>
+    <w:lsdException w:name="Medium Shading 2 Accent 6" w:uiPriority="64"/>
+    <w:lsdException w:name="Medium List 1 Accent 6" w:uiPriority="65"/>
+    <w:lsdException w:name="Medium List 2 Accent 6" w:uiPriority="66"/>
+    <w:lsdException w:name="Medium Grid 1 Accent 6" w:uiPriority="67"/>
+    <w:lsdException w:name="Medium Grid 2 Accent 6" w:uiPriority="68"/>
+    <w:lsdException w:name="Medium Grid 3 Accent 6" w:uiPriority="69"/>
+    <w:lsdException w:name="Dark List Accent 6" w:uiPriority="70"/>
+    <w:lsdException w:name="Colorful Shading Accent 6" w:uiPriority="71"/>
+    <w:lsdException w:name="Colorful List Accent 6" w:uiPriority="72"/>
+    <w:lsdException w:name="Colorful Grid Accent 6" w:uiPriority="73"/>
+    <w:lsdException w:name="Subtle Emphasis" w:uiPriority="19" w:qFormat="1"/>
+    <w:lsdException w:name="Intense Emphasis" w:uiPriority="21" w:qFormat="1"/>
+    <w:lsdException w:name="Subtle Reference" w:uiPriority="31" w:qFormat="1"/>
+    <w:lsdException w:name="Intense Reference" w:uiPriority="32" w:qFormat="1"/>
+    <w:lsdException w:name="Book Title" w:uiPriority="33" w:qFormat="1"/>
+    <w:lsdException w:name="Bibliography" w:semiHidden="1" w:uiPriority="37" w:unhideWhenUsed="1"/>
+    <w:lsdException w:name="TOC Heading" w:semiHidden="1" w:uiPriority="39" w:unhideWhenUsed="1" w:qFormat="1"/>
+    <w:lsdException w:name="Plain Table 1" w:uiPriority="41"/>
+    <w:lsdException w:name="Plain Table 2" w:uiPriority="42"/>
+    <w:lsdException w:name="Plain Table 3" w:uiPriority="43"/>
+    <w:lsdException w:name="Plain Table 4" w:uiPriority="44"/>
+    <w:lsdException w:name="Plain Table 5" w:uiPriority="45"/>
+    <w:lsdException w:name="Grid Table Light" w:uiPriority="40"/>
+    <w:lsdException w:name="Grid Table 1 Light" w:uiPriority="46"/>
+    <w:lsdException w:name="Grid Table 2" w:uiPriority="47"/>
+    <w:lsdException w:name="Grid Table 3" w:uiPriority="48"/>
+    <w:lsdException w:name="Grid Table 4" w:uiPriority="49"/>
+    <w:lsdException w:name="Grid Table 5 Dark" w:uiPriority="50"/>
+    <w:lsdException w:name="Grid Table 6 Colorful" w:uiPriority="51"/>
+    <w:lsdException w:name="Grid Table 7 Colorful" w:uiPriority="52"/>
+    <w:lsdException w:name="Grid Table 1 Light Accent 1" w:uiPriority="46"/>
+    <w:lsdException w:name="Grid Table 2 Accent 1" w:uiPriority="47"/>
+    <w:lsdException w:name="Grid Table 3 Accent 1" w:uiPriority="48"/>
+    <w:lsdException w:name="Grid Table 4 Accent 1" w:uiPriority="49"/>
+    <w:lsdException w:name="Grid Table 5 Dark Accent 1" w:uiPriority="50"/>
+    <w:lsdException w:name="Grid Table 6 Colorful Accent 1" w:uiPriority="51"/>
+    <w:lsdException w:name="Grid Table 7 Colorful Accent 1" w:uiPriority="52"/>
+    <w:lsdException w:name="Grid Table 1 Light Accent 2" w:uiPriority="46"/>
+    <w:lsdException w:name="Grid Table 2 Accent 2" w:uiPriority="47"/>
+    <w:lsdException w:name="Grid Table 3 Accent 2" w:uiPriority="48"/>
+    <w:lsdException w:name="Grid Table 4 Accent 2" w:uiPriority="49"/>
+    <w:lsdException w:name="Grid Table 5 Dark Accent 2" w:uiPriority="50"/>
+    <w:lsdException w:name="Grid Table 6 Colorful Accent 2" w:uiPriority="51"/>
+    <w:lsdException w:name="Grid Table 7 Colorful Accent 2" w:uiPriority="52"/>
+    <w:lsdException w:name="Grid Table 1 Light Accent 3" w:uiPriority="46"/>
+    <w:lsdException w:name="Grid Table 2 Accent 3" w:uiPriority="47"/>
+    <w:lsdException w:name="Grid Table 3 Accent 3" w:uiPriority="48"/>
+    <w:lsdException w:name="Grid Table 4 Accent 3" w:uiPriority="49"/>
+    <w:lsdException w:name="Grid Table 5 Dark Accent 3" w:uiPriority="50"/>
+    <w:lsdException w:name="Grid Table 6 Colorful Accent 3" w:uiPriority="51"/>
+    <w:lsdException w:name="Grid Table 7 Colorful Accent 3" w:uiPriority="52"/>
+    <w:lsdException w:name="Grid Table 1 Light Accent 4" w:uiPriority="46"/>
+    <w:lsdException w:name="Grid Table 2 Accent 4" w:uiPriority="47"/>
+    <w:lsdException w:name="Grid Table 3 Accent 4" w:uiPriority="48"/>
+    <w:lsdException w:name="Grid Table 4 Accent 4" w:uiPriority="49"/>
+    <w:lsdException w:name="Grid Table 5 Dark Accent 4" w:uiPriority="50"/>
+    <w:lsdException w:name="Grid Table 6 Colorful Accent 4" w:uiPriority="51"/>
+    <w:lsdException w:name="Grid Table 7 Colorful Accent 4" w:uiPriority="52"/>
+    <w:lsdException w:name="Grid Table 1 Light Accent 5" w:uiPriority="46"/>
+    <w:lsdException w:name="Grid Table 2 Accent 5" w:uiPriority="47"/>
+    <w:lsdException w:name="Grid Table 3 Accent 5" w:uiPriority="48"/>
+    <w:lsdException w:name="Grid Table 4 Accent 5" w:uiPriority="49"/>
+    <w:lsdException w:name="Grid Table 5 Dark Accent 5" w:uiPriority="50"/>
+    <w:lsdException w:name="Grid Table 6 Colorful Accent 5" w:uiPriority="51"/>
+    <w:lsdException w:name="Grid Table 7 Colorful Accent 5" w:uiPriority="52"/>
+    <w:lsdException w:name="Grid Table 1 Light Accent 6" w:uiPriority="46"/>
+    <w:lsdException w:name="Grid Table 2 Accent 6" w:uiPriority="47"/>
+    <w:lsdException w:name="Grid Table 3 Accent 6" w:uiPriority="48"/>
+    <w:lsdException w:name="Grid Table 4 Accent 6" w:uiPriority="49"/>
+    <w:lsdException w:name="Grid Table 5 Dark Accent 6" w:uiPriority="50"/>
+    <w:lsdException w:name="Grid Table 6 Colorful Accent 6" w:uiPriority="51"/>
+    <w:lsdException w:name="Grid Table 7 Colorful Accent 6" w:uiPriority="52"/>
+    <w:lsdException w:name="List Table 1 Light" w:uiPriority="46"/>
+    <w:lsdException w:name="List Table 2" w:uiPriority="47"/>
+    <w:lsdException w:name="List Table 3" w:uiPriority="48"/>
+    <w:lsdException w:name="List Table 4" w:uiPriority="49"/>
+    <w:lsdException w:name="List Table 5 Dark" w:uiPriority="50"/>
+    <w:lsdException w:name="List Table 6 Colorful" w:uiPriority="51"/>
+    <w:lsdException w:name="List Table 7 Colorful" w:uiPriority="52"/>
+    <w:lsdException w:name="List Table 1 Light Accent 1" w:uiPriority="46"/>
+    <w:lsdException w:name="List Table 2 Accent 1" w:uiPriority="47"/>
+    <w:lsdException w:name="List Table 3 Accent 1" w:uiPriority="48"/>
+    <w:lsdException w:name="List Table 4 Accent 1" w:uiPriority="49"/>
+    <w:lsdException w:name="List Table 5 Dark Accent 1" w:uiPriority="50"/>
+    <w:lsdException w:name="List Table 6 Colorful Accent 1" w:uiPriority="51"/>
+    <w:lsdException w:name="List Table 7 Colorful Accent 1" w:uiPriority="52"/>
+    <w:lsdException w:name="List Table 1 Light Accent 2" w:uiPriority="46"/>
+    <w:lsdException w:name="List Table 2 Accent 2" w:uiPriority="47"/>
+    <w:lsdException w:name="List Table 3 Accent 2" w:uiPriority="48"/>
+    <w:lsdException w:name="List Table 4 Accent 2" w:uiPriority="49"/>
+    <w:lsdException w:name="List Table 5 Dark Accent 2" w:uiPriority="50"/>
+    <w:lsdException w:name="List Table 6 Colorful Accent 2" w:uiPriority="51"/>
+    <w:lsdException w:name="List Table 7 Colorful Accent 2" w:uiPriority="52"/>
+    <w:lsdException w:name="List Table 1 Light Accent 3" w:uiPriority="46"/>
+    <w:lsdException w:name="List Table 2 Accent 3" w:uiPriority="47"/>
+    <w:lsdException w:name="List Table 3 Accent 3" w:uiPriority="48"/>
+    <w:lsdException w:name="List Table 4 Accent 3" w:uiPriority="49"/>
+    <w:lsdException w:name="List Table 5 Dark Accent 3" w:uiPriority="50"/>
+    <w:lsdException w:name="List Table 6 Colorful Accent 3" w:uiPriority="51"/>
+    <w:lsdException w:name="List Table 7 Colorful Accent 3" w:uiPriority="52"/>
+    <w:lsdException w:name="List Table 1 Light Accent 4" w:uiPriority="46"/>
+    <w:lsdException w:name="List Table 2 Accent 4" w:uiPriority="47"/>
+    <w:lsdException w:name="List Table 3 Accent 4" w:uiPriority="48"/>
+    <w:lsdException w:name="List Table 4 Accent 4" w:uiPriority="49"/>
+    <w:lsdException w:name="List Table 5 Dark Accent 4" w:uiPriority="50"/>
+    <w:lsdException w:name="List Table 6 Colorful Accent 4" w:uiPriority="51"/>
+    <w:lsdException w:name="List Table 7 Colorful Accent 4" w:uiPriority="52"/>
+    <w:lsdException w:name="List Table 1 Light Accent 5" w:uiPriority="46"/>
+    <w:lsdException w:name="List Table 2 Accent 5" w:uiPriority="47"/>
+    <w:lsdException w:name="List Table 3 Accent 5" w:uiPriority="48"/>
+    <w:lsdException w:name="List Table 4 Accent 5" w:uiPriority="49"/>
+    <w:lsdException w:name="List Table 5 Dark Accent 5" w:uiPriority="50"/>
+    <w:lsdException w:name="List Table 6 Colorful Accent 5" w:uiPriority="51"/>
+    <w:lsdException w:name="List Table 7 Colorful Accent 5" w:uiPriority="52"/>
+    <w:lsdException w:name="List Table 1 Light Accent 6" w:uiPriority="46"/>
+    <w:lsdException w:name="List Table 2 Accent 6" w:uiPriority="47"/>
+    <w:lsdException w:name="List Table 3 Accent 6" w:uiPriority="48"/>
+    <w:lsdException w:name="List Table 4 Accent 6" w:uiPriority="49"/>
+    <w:lsdException w:name="List Table 5 Dark Accent 6" w:uiPriority="50"/>
+    <w:lsdException w:name="List Table 6 Colorful Accent 6" w:uiPriority="51"/>
+    <w:lsdException w:name="List Table 7 Colorful Accent 6" w:uiPriority="52"/>
+    <w:lsdException w:name="Mention" w:semiHidden="1" w:unhideWhenUsed="1"/>
+    <w:lsdException w:name="Smart Hyperlink" w:semiHidden="1" w:unhideWhenUsed="1"/>
+    <w:lsdException w:name="Hashtag" w:semiHidden="1" w:unhideWhenUsed="1"/>
+    <w:lsdException w:name="Unresolved Mention" w:semiHidden="1" w:unhideWhenUsed="1"/>
+    <w:lsdException w:name="Smart Link" w:semiHidden="1" w:unhideWhenUsed="1"/>
   </w:latentStyles>
   <w:style w:type="paragraph" w:default="1" w:styleId="Normal">
     <w:name w:val="Normal"/>
     <w:qFormat/>
-    <w:rsid w:val="00404E37"/>
+    <w:rsid w:val="00697B0A"/>
     <w:pPr>
       <w:spacing w:after="0" w:line="240" w:lineRule="auto"/>
     </w:pPr>
@@ -10836,7 +10105,6 @@
       <w:spacing w:after="0" w:line="240" w:lineRule="auto"/>
     </w:pPr>
     <w:tblPr>
-      <w:tblInd w:w="0" w:type="dxa"/>
       <w:tblBorders>
         <w:top w:val="single" w:sz="4" w:space="0" w:color="auto"/>
         <w:left w:val="single" w:sz="4" w:space="0" w:color="auto"/>
@@ -10845,278 +10113,37 @@
         <w:insideH w:val="single" w:sz="4" w:space="0" w:color="auto"/>
         <w:insideV w:val="single" w:sz="4" w:space="0" w:color="auto"/>
       </w:tblBorders>
-      <w:tblCellMar>
-        <w:top w:w="0" w:type="dxa"/>
-        <w:left w:w="108" w:type="dxa"/>
-        <w:bottom w:w="0" w:type="dxa"/>
-        <w:right w:w="108" w:type="dxa"/>
-      </w:tblCellMar>
     </w:tblPr>
   </w:style>
-</w:styles>
-</file>
-
-<file path=word/stylesWithEffects.xml><?xml version="1.0" encoding="utf-8"?>
-<w:styles xmlns:wpc="http://schemas.microsoft.com/office/word/2010/wordprocessingCanvas" xmlns:mc="http://schemas.openxmlformats.org/markup-compatibility/2006" xmlns:o="urn:schemas-microsoft-com:office:office" xmlns:r="http://schemas.openxmlformats.org/officeDocument/2006/relationships" xmlns:m="http://schemas.openxmlformats.org/officeDocument/2006/math" xmlns:v="urn:schemas-microsoft-com:vml" xmlns:wp14="http://schemas.microsoft.com/office/word/2010/wordprocessingDrawing" xmlns:wp="http://schemas.openxmlformats.org/drawingml/2006/wordprocessingDrawing" xmlns:w10="urn:schemas-microsoft-com:office:word" xmlns:w="http://schemas.openxmlformats.org/wordprocessingml/2006/main" xmlns:w14="http://schemas.microsoft.com/office/word/2010/wordml" xmlns:wpg="http://schemas.microsoft.com/office/word/2010/wordprocessingGroup" xmlns:wpi="http://schemas.microsoft.com/office/word/2010/wordprocessingInk" xmlns:wne="http://schemas.microsoft.com/office/word/2006/wordml" xmlns:wps="http://schemas.microsoft.com/office/word/2010/wordprocessingShape" mc:Ignorable="w14 wp14">
-  <w:docDefaults>
-    <w:rPrDefault>
-      <w:rPr>
-        <w:rFonts w:asciiTheme="minorHAnsi" w:eastAsiaTheme="minorHAnsi" w:hAnsiTheme="minorHAnsi" w:cstheme="minorBidi"/>
-        <w:sz w:val="22"/>
-        <w:szCs w:val="22"/>
-        <w:lang w:val="en-US" w:eastAsia="en-US" w:bidi="ar-SA"/>
-      </w:rPr>
-    </w:rPrDefault>
-    <w:pPrDefault>
-      <w:pPr>
-        <w:spacing w:after="200" w:line="276" w:lineRule="auto"/>
-      </w:pPr>
-    </w:pPrDefault>
-  </w:docDefaults>
-  <w:latentStyles w:defLockedState="0" w:defUIPriority="99" w:defSemiHidden="1" w:defUnhideWhenUsed="1" w:defQFormat="0" w:count="267">
-    <w:lsdException w:name="Normal" w:semiHidden="0" w:uiPriority="0" w:unhideWhenUsed="0" w:qFormat="1"/>
-    <w:lsdException w:name="heading 1" w:semiHidden="0" w:uiPriority="9" w:unhideWhenUsed="0" w:qFormat="1"/>
-    <w:lsdException w:name="heading 2" w:uiPriority="9" w:qFormat="1"/>
-    <w:lsdException w:name="heading 3" w:uiPriority="9" w:qFormat="1"/>
-    <w:lsdException w:name="heading 4" w:uiPriority="9" w:qFormat="1"/>
-    <w:lsdException w:name="heading 5" w:uiPriority="9" w:qFormat="1"/>
-    <w:lsdException w:name="heading 6" w:uiPriority="9" w:qFormat="1"/>
-    <w:lsdException w:name="heading 7" w:uiPriority="9" w:qFormat="1"/>
-    <w:lsdException w:name="heading 8" w:uiPriority="9" w:qFormat="1"/>
-    <w:lsdException w:name="heading 9" w:uiPriority="9" w:qFormat="1"/>
-    <w:lsdException w:name="toc 1" w:uiPriority="39"/>
-    <w:lsdException w:name="toc 2" w:uiPriority="39"/>
-    <w:lsdException w:name="toc 3" w:uiPriority="39"/>
-    <w:lsdException w:name="toc 4" w:uiPriority="39"/>
-    <w:lsdException w:name="toc 5" w:uiPriority="39"/>
-    <w:lsdException w:name="toc 6" w:uiPriority="39"/>
-    <w:lsdException w:name="toc 7" w:uiPriority="39"/>
-    <w:lsdException w:name="toc 8" w:uiPriority="39"/>
-    <w:lsdException w:name="toc 9" w:uiPriority="39"/>
-    <w:lsdException w:name="caption" w:uiPriority="35" w:qFormat="1"/>
-    <w:lsdException w:name="Title" w:semiHidden="0" w:uiPriority="10" w:unhideWhenUsed="0" w:qFormat="1"/>
-    <w:lsdException w:name="Default Paragraph Font" w:uiPriority="1"/>
-    <w:lsdException w:name="Subtitle" w:semiHidden="0" w:uiPriority="11" w:unhideWhenUsed="0" w:qFormat="1"/>
-    <w:lsdException w:name="Strong" w:semiHidden="0" w:uiPriority="22" w:unhideWhenUsed="0" w:qFormat="1"/>
-    <w:lsdException w:name="Emphasis" w:semiHidden="0" w:uiPriority="20" w:unhideWhenUsed="0" w:qFormat="1"/>
-    <w:lsdException w:name="Table Grid" w:semiHidden="0" w:uiPriority="59" w:unhideWhenUsed="0"/>
-    <w:lsdException w:name="Placeholder Text" w:unhideWhenUsed="0"/>
-    <w:lsdException w:name="No Spacing" w:semiHidden="0" w:uiPriority="1" w:unhideWhenUsed="0" w:qFormat="1"/>
-    <w:lsdException w:name="Light Shading" w:semiHidden="0" w:uiPriority="60" w:unhideWhenUsed="0"/>
-    <w:lsdException w:name="Light List" w:semiHidden="0" w:uiPriority="61" w:unhideWhenUsed="0"/>
-    <w:lsdException w:name="Light Grid" w:semiHidden="0" w:uiPriority="62" w:unhideWhenUsed="0"/>
-    <w:lsdException w:name="Medium Shading 1" w:semiHidden="0" w:uiPriority="63" w:unhideWhenUsed="0"/>
-    <w:lsdException w:name="Medium Shading 2" w:semiHidden="0" w:uiPriority="64" w:unhideWhenUsed="0"/>
-    <w:lsdException w:name="Medium List 1" w:semiHidden="0" w:uiPriority="65" w:unhideWhenUsed="0"/>
-    <w:lsdException w:name="Medium List 2" w:semiHidden="0" w:uiPriority="66" w:unhideWhenUsed="0"/>
-    <w:lsdException w:name="Medium Grid 1" w:semiHidden="0" w:uiPriority="67" w:unhideWhenUsed="0"/>
-    <w:lsdException w:name="Medium Grid 2" w:semiHidden="0" w:uiPriority="68" w:unhideWhenUsed="0"/>
-    <w:lsdException w:name="Medium Grid 3" w:semiHidden="0" w:uiPriority="69" w:unhideWhenUsed="0"/>
-    <w:lsdException w:name="Dark List" w:semiHidden="0" w:uiPriority="70" w:unhideWhenUsed="0"/>
-    <w:lsdException w:name="Colorful Shading" w:semiHidden="0" w:uiPriority="71" w:unhideWhenUsed="0"/>
-    <w:lsdException w:name="Colorful List" w:semiHidden="0" w:uiPriority="72" w:unhideWhenUsed="0"/>
-    <w:lsdException w:name="Colorful Grid" w:semiHidden="0" w:uiPriority="73" w:unhideWhenUsed="0"/>
-    <w:lsdException w:name="Light Shading Accent 1" w:semiHidden="0" w:uiPriority="60" w:unhideWhenUsed="0"/>
-    <w:lsdException w:name="Light List Accent 1" w:semiHidden="0" w:uiPriority="61" w:unhideWhenUsed="0"/>
-    <w:lsdException w:name="Light Grid Accent 1" w:semiHidden="0" w:uiPriority="62" w:unhideWhenUsed="0"/>
-    <w:lsdException w:name="Medium Shading 1 Accent 1" w:semiHidden="0" w:uiPriority="63" w:unhideWhenUsed="0"/>
-    <w:lsdException w:name="Medium Shading 2 Accent 1" w:semiHidden="0" w:uiPriority="64" w:unhideWhenUsed="0"/>
-    <w:lsdException w:name="Medium List 1 Accent 1" w:semiHidden="0" w:uiPriority="65" w:unhideWhenUsed="0"/>
-    <w:lsdException w:name="Revision" w:unhideWhenUsed="0"/>
-    <w:lsdException w:name="List Paragraph" w:semiHidden="0" w:uiPriority="34" w:unhideWhenUsed="0" w:qFormat="1"/>
-    <w:lsdException w:name="Quote" w:semiHidden="0" w:uiPriority="29" w:unhideWhenUsed="0" w:qFormat="1"/>
-    <w:lsdException w:name="Intense Quote" w:semiHidden="0" w:uiPriority="30" w:unhideWhenUsed="0" w:qFormat="1"/>
-    <w:lsdException w:name="Medium List 2 Accent 1" w:semiHidden="0" w:uiPriority="66" w:unhideWhenUsed="0"/>
-    <w:lsdException w:name="Medium Grid 1 Accent 1" w:semiHidden="0" w:uiPriority="67" w:unhideWhenUsed="0"/>
-    <w:lsdException w:name="Medium Grid 2 Accent 1" w:semiHidden="0" w:uiPriority="68" w:unhideWhenUsed="0"/>
-    <w:lsdException w:name="Medium Grid 3 Accent 1" w:semiHidden="0" w:uiPriority="69" w:unhideWhenUsed="0"/>
-    <w:lsdException w:name="Dark List Accent 1" w:semiHidden="0" w:uiPriority="70" w:unhideWhenUsed="0"/>
-    <w:lsdException w:name="Colorful Shading Accent 1" w:semiHidden="0" w:uiPriority="71" w:unhideWhenUsed="0"/>
-    <w:lsdException w:name="Colorful List Accent 1" w:semiHidden="0" w:uiPriority="72" w:unhideWhenUsed="0"/>
-    <w:lsdException w:name="Colorful Grid Accent 1" w:semiHidden="0" w:uiPriority="73" w:unhideWhenUsed="0"/>
-    <w:lsdException w:name="Light Shading Accent 2" w:semiHidden="0" w:uiPriority="60" w:unhideWhenUsed="0"/>
-    <w:lsdException w:name="Light List Accent 2" w:semiHidden="0" w:uiPriority="61" w:unhideWhenUsed="0"/>
-    <w:lsdException w:name="Light Grid Accent 2" w:semiHidden="0" w:uiPriority="62" w:unhideWhenUsed="0"/>
-    <w:lsdException w:name="Medium Shading 1 Accent 2" w:semiHidden="0" w:uiPriority="63" w:unhideWhenUsed="0"/>
-    <w:lsdException w:name="Medium Shading 2 Accent 2" w:semiHidden="0" w:uiPriority="64" w:unhideWhenUsed="0"/>
-    <w:lsdException w:name="Medium List 1 Accent 2" w:semiHidden="0" w:uiPriority="65" w:unhideWhenUsed="0"/>
-    <w:lsdException w:name="Medium List 2 Accent 2" w:semiHidden="0" w:uiPriority="66" w:unhideWhenUsed="0"/>
-    <w:lsdException w:name="Medium Grid 1 Accent 2" w:semiHidden="0" w:uiPriority="67" w:unhideWhenUsed="0"/>
-    <w:lsdException w:name="Medium Grid 2 Accent 2" w:semiHidden="0" w:uiPriority="68" w:unhideWhenUsed="0"/>
-    <w:lsdException w:name="Medium Grid 3 Accent 2" w:semiHidden="0" w:uiPriority="69" w:unhideWhenUsed="0"/>
-    <w:lsdException w:name="Dark List Accent 2" w:semiHidden="0" w:uiPriority="70" w:unhideWhenUsed="0"/>
-    <w:lsdException w:name="Colorful Shading Accent 2" w:semiHidden="0" w:uiPriority="71" w:unhideWhenUsed="0"/>
-    <w:lsdException w:name="Colorful List Accent 2" w:semiHidden="0" w:uiPriority="72" w:unhideWhenUsed="0"/>
-    <w:lsdException w:name="Colorful Grid Accent 2" w:semiHidden="0" w:uiPriority="73" w:unhideWhenUsed="0"/>
-    <w:lsdException w:name="Light Shading Accent 3" w:semiHidden="0" w:uiPriority="60" w:unhideWhenUsed="0"/>
-    <w:lsdException w:name="Light List Accent 3" w:semiHidden="0" w:uiPriority="61" w:unhideWhenUsed="0"/>
-    <w:lsdException w:name="Light Grid Accent 3" w:semiHidden="0" w:uiPriority="62" w:unhideWhenUsed="0"/>
-    <w:lsdException w:name="Medium Shading 1 Accent 3" w:semiHidden="0" w:uiPriority="63" w:unhideWhenUsed="0"/>
-    <w:lsdException w:name="Medium Shading 2 Accent 3" w:semiHidden="0" w:uiPriority="64" w:unhideWhenUsed="0"/>
-    <w:lsdException w:name="Medium List 1 Accent 3" w:semiHidden="0" w:uiPriority="65" w:unhideWhenUsed="0"/>
-    <w:lsdException w:name="Medium List 2 Accent 3" w:semiHidden="0" w:uiPriority="66" w:unhideWhenUsed="0"/>
-    <w:lsdException w:name="Medium Grid 1 Accent 3" w:semiHidden="0" w:uiPriority="67" w:unhideWhenUsed="0"/>
-    <w:lsdException w:name="Medium Grid 2 Accent 3" w:semiHidden="0" w:uiPriority="68" w:unhideWhenUsed="0"/>
-    <w:lsdException w:name="Medium Grid 3 Accent 3" w:semiHidden="0" w:uiPriority="69" w:unhideWhenUsed="0"/>
-    <w:lsdException w:name="Dark List Accent 3" w:semiHidden="0" w:uiPriority="70" w:unhideWhenUsed="0"/>
-    <w:lsdException w:name="Colorful Shading Accent 3" w:semiHidden="0" w:uiPriority="71" w:unhideWhenUsed="0"/>
-    <w:lsdException w:name="Colorful List Accent 3" w:semiHidden="0" w:uiPriority="72" w:unhideWhenUsed="0"/>
-    <w:lsdException w:name="Colorful Grid Accent 3" w:semiHidden="0" w:uiPriority="73" w:unhideWhenUsed="0"/>
-    <w:lsdException w:name="Light Shading Accent 4" w:semiHidden="0" w:uiPriority="60" w:unhideWhenUsed="0"/>
-    <w:lsdException w:name="Light List Accent 4" w:semiHidden="0" w:uiPriority="61" w:unhideWhenUsed="0"/>
-    <w:lsdException w:name="Light Grid Accent 4" w:semiHidden="0" w:uiPriority="62" w:unhideWhenUsed="0"/>
-    <w:lsdException w:name="Medium Shading 1 Accent 4" w:semiHidden="0" w:uiPriority="63" w:unhideWhenUsed="0"/>
-    <w:lsdException w:name="Medium Shading 2 Accent 4" w:semiHidden="0" w:uiPriority="64" w:unhideWhenUsed="0"/>
-    <w:lsdException w:name="Medium List 1 Accent 4" w:semiHidden="0" w:uiPriority="65" w:unhideWhenUsed="0"/>
-    <w:lsdException w:name="Medium List 2 Accent 4" w:semiHidden="0" w:uiPriority="66" w:unhideWhenUsed="0"/>
-    <w:lsdException w:name="Medium Grid 1 Accent 4" w:semiHidden="0" w:uiPriority="67" w:unhideWhenUsed="0"/>
-    <w:lsdException w:name="Medium Grid 2 Accent 4" w:semiHidden="0" w:uiPriority="68" w:unhideWhenUsed="0"/>
-    <w:lsdException w:name="Medium Grid 3 Accent 4" w:semiHidden="0" w:uiPriority="69" w:unhideWhenUsed="0"/>
-    <w:lsdException w:name="Dark List Accent 4" w:semiHidden="0" w:uiPriority="70" w:unhideWhenUsed="0"/>
-    <w:lsdException w:name="Colorful Shading Accent 4" w:semiHidden="0" w:uiPriority="71" w:unhideWhenUsed="0"/>
-    <w:lsdException w:name="Colorful List Accent 4" w:semiHidden="0" w:uiPriority="72" w:unhideWhenUsed="0"/>
-    <w:lsdException w:name="Colorful Grid Accent 4" w:semiHidden="0" w:uiPriority="73" w:unhideWhenUsed="0"/>
-    <w:lsdException w:name="Light Shading Accent 5" w:semiHidden="0" w:uiPriority="60" w:unhideWhenUsed="0"/>
-    <w:lsdException w:name="Light List Accent 5" w:semiHidden="0" w:uiPriority="61" w:unhideWhenUsed="0"/>
-    <w:lsdException w:name="Light Grid Accent 5" w:semiHidden="0" w:uiPriority="62" w:unhideWhenUsed="0"/>
-    <w:lsdException w:name="Medium Shading 1 Accent 5" w:semiHidden="0" w:uiPriority="63" w:unhideWhenUsed="0"/>
-    <w:lsdException w:name="Medium Shading 2 Accent 5" w:semiHidden="0" w:uiPriority="64" w:unhideWhenUsed="0"/>
-    <w:lsdException w:name="Medium List 1 Accent 5" w:semiHidden="0" w:uiPriority="65" w:unhideWhenUsed="0"/>
-    <w:lsdException w:name="Medium List 2 Accent 5" w:semiHidden="0" w:uiPriority="66" w:unhideWhenUsed="0"/>
-    <w:lsdException w:name="Medium Grid 1 Accent 5" w:semiHidden="0" w:uiPriority="67" w:unhideWhenUsed="0"/>
-    <w:lsdException w:name="Medium Grid 2 Accent 5" w:semiHidden="0" w:uiPriority="68" w:unhideWhenUsed="0"/>
-    <w:lsdException w:name="Medium Grid 3 Accent 5" w:semiHidden="0" w:uiPriority="69" w:unhideWhenUsed="0"/>
-    <w:lsdException w:name="Dark List Accent 5" w:semiHidden="0" w:uiPriority="70" w:unhideWhenUsed="0"/>
-    <w:lsdException w:name="Colorful Shading Accent 5" w:semiHidden="0" w:uiPriority="71" w:unhideWhenUsed="0"/>
-    <w:lsdException w:name="Colorful List Accent 5" w:semiHidden="0" w:uiPriority="72" w:unhideWhenUsed="0"/>
-    <w:lsdException w:name="Colorful Grid Accent 5" w:semiHidden="0" w:uiPriority="73" w:unhideWhenUsed="0"/>
-    <w:lsdException w:name="Light Shading Accent 6" w:semiHidden="0" w:uiPriority="60" w:unhideWhenUsed="0"/>
-    <w:lsdException w:name="Light List Accent 6" w:semiHidden="0" w:uiPriority="61" w:unhideWhenUsed="0"/>
-    <w:lsdException w:name="Light Grid Accent 6" w:semiHidden="0" w:uiPriority="62" w:unhideWhenUsed="0"/>
-    <w:lsdException w:name="Medium Shading 1 Accent 6" w:semiHidden="0" w:uiPriority="63" w:unhideWhenUsed="0"/>
-    <w:lsdException w:name="Medium Shading 2 Accent 6" w:semiHidden="0" w:uiPriority="64" w:unhideWhenUsed="0"/>
-    <w:lsdException w:name="Medium List 1 Accent 6" w:semiHidden="0" w:uiPriority="65" w:unhideWhenUsed="0"/>
-    <w:lsdException w:name="Medium List 2 Accent 6" w:semiHidden="0" w:uiPriority="66" w:unhideWhenUsed="0"/>
-    <w:lsdException w:name="Medium Grid 1 Accent 6" w:semiHidden="0" w:uiPriority="67" w:unhideWhenUsed="0"/>
-    <w:lsdException w:name="Medium Grid 2 Accent 6" w:semiHidden="0" w:uiPriority="68" w:unhideWhenUsed="0"/>
-    <w:lsdException w:name="Medium Grid 3 Accent 6" w:semiHidden="0" w:uiPriority="69" w:unhideWhenUsed="0"/>
-    <w:lsdException w:name="Dark List Accent 6" w:semiHidden="0" w:uiPriority="70" w:unhideWhenUsed="0"/>
-    <w:lsdException w:name="Colorful Shading Accent 6" w:semiHidden="0" w:uiPriority="71" w:unhideWhenUsed="0"/>
-    <w:lsdException w:name="Colorful List Accent 6" w:semiHidden="0" w:uiPriority="72" w:unhideWhenUsed="0"/>
-    <w:lsdException w:name="Colorful Grid Accent 6" w:semiHidden="0" w:uiPriority="73" w:unhideWhenUsed="0"/>
-    <w:lsdException w:name="Subtle Emphasis" w:semiHidden="0" w:uiPriority="19" w:unhideWhenUsed="0" w:qFormat="1"/>
-    <w:lsdException w:name="Intense Emphasis" w:semiHidden="0" w:uiPriority="21" w:unhideWhenUsed="0" w:qFormat="1"/>
-    <w:lsdException w:name="Subtle Reference" w:semiHidden="0" w:uiPriority="31" w:unhideWhenUsed="0" w:qFormat="1"/>
-    <w:lsdException w:name="Intense Reference" w:semiHidden="0" w:uiPriority="32" w:unhideWhenUsed="0" w:qFormat="1"/>
-    <w:lsdException w:name="Book Title" w:semiHidden="0" w:uiPriority="33" w:unhideWhenUsed="0" w:qFormat="1"/>
-    <w:lsdException w:name="Bibliography" w:uiPriority="37"/>
-    <w:lsdException w:name="TOC Heading" w:uiPriority="39" w:qFormat="1"/>
-  </w:latentStyles>
-  <w:style w:type="paragraph" w:default="1" w:styleId="Normal">
-    <w:name w:val="Normal"/>
-    <w:qFormat/>
-    <w:rsid w:val="00404E37"/>
+  <w:style w:type="paragraph" w:customStyle="1" w:styleId="HeaderSurat">
+    <w:name w:val="Header Surat"/>
+    <w:basedOn w:val="Normal"/>
+    <w:rsid w:val="00C0690A"/>
     <w:pPr>
-      <w:spacing w:after="0" w:line="240" w:lineRule="auto"/>
+      <w:suppressAutoHyphens/>
+      <w:autoSpaceDN w:val="0"/>
+      <w:ind w:left="1560"/>
+      <w:jc w:val="center"/>
+      <w:textAlignment w:val="baseline"/>
     </w:pPr>
     <w:rPr>
-      <w:rFonts w:ascii="Times New Roman" w:eastAsia="Times New Roman" w:hAnsi="Times New Roman" w:cs="Times New Roman"/>
-      <w:sz w:val="24"/>
-      <w:szCs w:val="24"/>
-      <w:lang w:val="en-GB" w:eastAsia="en-GB"/>
+      <w:rFonts w:ascii="Bookman Old Style" w:hAnsi="Bookman Old Style"/>
+      <w:caps/>
+      <w:sz w:val="36"/>
+      <w:szCs w:val="36"/>
+      <w:lang w:val="en-US" w:eastAsia="en-US"/>
     </w:rPr>
   </w:style>
-  <w:style w:type="character" w:default="1" w:styleId="DefaultParagraphFont">
-    <w:name w:val="Default Paragraph Font"/>
-    <w:uiPriority w:val="1"/>
-    <w:semiHidden/>
+  <w:style w:type="character" w:styleId="Hyperlink">
+    <w:name w:val="Hyperlink"/>
+    <w:basedOn w:val="DefaultParagraphFont"/>
+    <w:uiPriority w:val="99"/>
     <w:unhideWhenUsed/>
-  </w:style>
-  <w:style w:type="table" w:default="1" w:styleId="TableNormal">
-    <w:name w:val="Normal Table"/>
-    <w:uiPriority w:val="99"/>
-    <w:semiHidden/>
-    <w:unhideWhenUsed/>
-    <w:tblPr>
-      <w:tblInd w:w="0" w:type="dxa"/>
-      <w:tblCellMar>
-        <w:top w:w="0" w:type="dxa"/>
-        <w:left w:w="108" w:type="dxa"/>
-        <w:bottom w:w="0" w:type="dxa"/>
-        <w:right w:w="108" w:type="dxa"/>
-      </w:tblCellMar>
-    </w:tblPr>
-  </w:style>
-  <w:style w:type="numbering" w:default="1" w:styleId="NoList">
-    <w:name w:val="No List"/>
-    <w:uiPriority w:val="99"/>
-    <w:semiHidden/>
-    <w:unhideWhenUsed/>
-  </w:style>
-  <w:style w:type="paragraph" w:styleId="ListParagraph">
-    <w:name w:val="List Paragraph"/>
-    <w:basedOn w:val="Normal"/>
-    <w:uiPriority w:val="34"/>
-    <w:qFormat/>
-    <w:rsid w:val="00404E37"/>
-    <w:pPr>
-      <w:ind w:left="720"/>
-      <w:contextualSpacing/>
-    </w:pPr>
-  </w:style>
-  <w:style w:type="paragraph" w:styleId="BalloonText">
-    <w:name w:val="Balloon Text"/>
-    <w:basedOn w:val="Normal"/>
-    <w:link w:val="BalloonTextChar"/>
-    <w:uiPriority w:val="99"/>
-    <w:semiHidden/>
-    <w:unhideWhenUsed/>
-    <w:rsid w:val="000B125C"/>
+    <w:rsid w:val="00C0690A"/>
     <w:rPr>
-      <w:rFonts w:ascii="Tahoma" w:hAnsi="Tahoma" w:cs="Tahoma"/>
-      <w:sz w:val="16"/>
-      <w:szCs w:val="16"/>
+      <w:color w:val="0000FF" w:themeColor="hyperlink"/>
+      <w:u w:val="single"/>
     </w:rPr>
-  </w:style>
-  <w:style w:type="character" w:customStyle="1" w:styleId="BalloonTextChar">
-    <w:name w:val="Balloon Text Char"/>
-    <w:basedOn w:val="DefaultParagraphFont"/>
-    <w:link w:val="BalloonText"/>
-    <w:uiPriority w:val="99"/>
-    <w:semiHidden/>
-    <w:rsid w:val="000B125C"/>
-    <w:rPr>
-      <w:rFonts w:ascii="Tahoma" w:eastAsia="Times New Roman" w:hAnsi="Tahoma" w:cs="Tahoma"/>
-      <w:sz w:val="16"/>
-      <w:szCs w:val="16"/>
-      <w:lang w:val="en-GB" w:eastAsia="en-GB"/>
-    </w:rPr>
-  </w:style>
-  <w:style w:type="table" w:styleId="TableGrid">
-    <w:name w:val="Table Grid"/>
-    <w:basedOn w:val="TableNormal"/>
-    <w:uiPriority w:val="59"/>
-    <w:rsid w:val="00A22156"/>
-    <w:pPr>
-      <w:spacing w:after="0" w:line="240" w:lineRule="auto"/>
-    </w:pPr>
-    <w:tblPr>
-      <w:tblInd w:w="0" w:type="dxa"/>
-      <w:tblBorders>
-        <w:top w:val="single" w:sz="4" w:space="0" w:color="auto"/>
-        <w:left w:val="single" w:sz="4" w:space="0" w:color="auto"/>
-        <w:bottom w:val="single" w:sz="4" w:space="0" w:color="auto"/>
-        <w:right w:val="single" w:sz="4" w:space="0" w:color="auto"/>
-        <w:insideH w:val="single" w:sz="4" w:space="0" w:color="auto"/>
-        <w:insideV w:val="single" w:sz="4" w:space="0" w:color="auto"/>
-      </w:tblBorders>
-      <w:tblCellMar>
-        <w:top w:w="0" w:type="dxa"/>
-        <w:left w:w="108" w:type="dxa"/>
-        <w:bottom w:w="0" w:type="dxa"/>
-        <w:right w:w="108" w:type="dxa"/>
-      </w:tblCellMar>
-    </w:tblPr>
   </w:style>
 </w:styles>
 </file>

</xml_diff>

<commit_message>
feat: implement premium dashboard UI with custom CSS and document template support
</commit_message>
<xml_diff>
--- a/templates/keterangan_ahli_waris_template.docx
+++ b/templates/keterangan_ahli_waris_template.docx
@@ -15,13 +15,13 @@
           <w:noProof/>
         </w:rPr>
         <w:drawing>
-          <wp:anchor distT="0" distB="0" distL="114300" distR="114300" simplePos="0" relativeHeight="251659264" behindDoc="1" locked="0" layoutInCell="1" allowOverlap="1" wp14:anchorId="7F0529E4" wp14:editId="0424FA4E">
+          <wp:anchor distT="0" distB="0" distL="114300" distR="114300" simplePos="0" relativeHeight="251658752" behindDoc="1" locked="0" layoutInCell="1" allowOverlap="1" wp14:anchorId="7F0529E4" wp14:editId="33059D04">
             <wp:simplePos x="0" y="0"/>
             <wp:positionH relativeFrom="column">
-              <wp:posOffset>-327804</wp:posOffset>
+              <wp:posOffset>-22860</wp:posOffset>
             </wp:positionH>
             <wp:positionV relativeFrom="paragraph">
-              <wp:posOffset>0</wp:posOffset>
+              <wp:posOffset>6350</wp:posOffset>
             </wp:positionV>
             <wp:extent cx="975360" cy="975360"/>
             <wp:effectExtent l="0" t="0" r="0" b="0"/>
@@ -679,6 +679,20 @@
     <w:p>
       <w:pPr>
         <w:pStyle w:val="ListParagraph"/>
+        <w:spacing w:line="276" w:lineRule="auto"/>
+        <w:ind w:left="284"/>
+        <w:jc w:val="both"/>
+        <w:rPr>
+          <w:rFonts w:ascii="Arial" w:hAnsi="Arial" w:cs="Arial"/>
+          <w:sz w:val="20"/>
+          <w:szCs w:val="20"/>
+          <w:lang w:val="fi-FI"/>
+        </w:rPr>
+      </w:pPr>
+    </w:p>
+    <w:p>
+      <w:pPr>
+        <w:pStyle w:val="ListParagraph"/>
         <w:numPr>
           <w:ilvl w:val="0"/>
           <w:numId w:val="4"/>
@@ -737,25 +751,7 @@
           <w:szCs w:val="20"/>
           <w:lang w:val="fi-FI"/>
         </w:rPr>
-        <w:t>{nama_saksi_</w:t>
-      </w:r>
-      <w:r>
-        <w:rPr>
-          <w:rFonts w:ascii="Arial" w:hAnsi="Arial" w:cs="Arial"/>
-          <w:sz w:val="20"/>
-          <w:szCs w:val="20"/>
-          <w:lang w:val="fi-FI"/>
-        </w:rPr>
-        <w:t>2</w:t>
-      </w:r>
-      <w:r>
-        <w:rPr>
-          <w:rFonts w:ascii="Arial" w:hAnsi="Arial" w:cs="Arial"/>
-          <w:sz w:val="20"/>
-          <w:szCs w:val="20"/>
-          <w:lang w:val="fi-FI"/>
-        </w:rPr>
-        <w:t>}</w:t>
+        <w:t>{nama_saksi_2}</w:t>
       </w:r>
     </w:p>
     <w:p>
@@ -797,25 +793,7 @@
           <w:szCs w:val="20"/>
           <w:lang w:val="fi-FI"/>
         </w:rPr>
-        <w:t>{tempat_lahir_saksi_2}, {tanggal_lahir_saksi_</w:t>
-      </w:r>
-      <w:r>
-        <w:rPr>
-          <w:rFonts w:ascii="Arial" w:hAnsi="Arial" w:cs="Arial"/>
-          <w:sz w:val="20"/>
-          <w:szCs w:val="20"/>
-          <w:lang w:val="fi-FI"/>
-        </w:rPr>
-        <w:t>2</w:t>
-      </w:r>
-      <w:r>
-        <w:rPr>
-          <w:rFonts w:ascii="Arial" w:hAnsi="Arial" w:cs="Arial"/>
-          <w:sz w:val="20"/>
-          <w:szCs w:val="20"/>
-          <w:lang w:val="fi-FI"/>
-        </w:rPr>
-        <w:t>}</w:t>
+        <w:t>{tempat_lahir_saksi_2}, {tanggal_lahir_saksi_2}</w:t>
       </w:r>
       <w:r>
         <w:rPr>
@@ -893,25 +871,7 @@
           <w:szCs w:val="20"/>
           <w:lang w:val="fi-FI"/>
         </w:rPr>
-        <w:t>{nik_saksi_</w:t>
-      </w:r>
-      <w:r>
-        <w:rPr>
-          <w:rFonts w:ascii="Arial" w:hAnsi="Arial" w:cs="Arial"/>
-          <w:sz w:val="20"/>
-          <w:szCs w:val="20"/>
-          <w:lang w:val="fi-FI"/>
-        </w:rPr>
-        <w:t>2</w:t>
-      </w:r>
-      <w:r>
-        <w:rPr>
-          <w:rFonts w:ascii="Arial" w:hAnsi="Arial" w:cs="Arial"/>
-          <w:sz w:val="20"/>
-          <w:szCs w:val="20"/>
-          <w:lang w:val="fi-FI"/>
-        </w:rPr>
-        <w:t>}</w:t>
+        <w:t>{nik_saksi_2}</w:t>
       </w:r>
     </w:p>
     <w:p>
@@ -971,25 +931,7 @@
           <w:szCs w:val="20"/>
           <w:lang w:val="fi-FI"/>
         </w:rPr>
-        <w:t xml:space="preserve"> {pekerjaan_saksi_</w:t>
-      </w:r>
-      <w:r>
-        <w:rPr>
-          <w:rFonts w:ascii="Arial" w:hAnsi="Arial" w:cs="Arial"/>
-          <w:sz w:val="20"/>
-          <w:szCs w:val="20"/>
-          <w:lang w:val="fi-FI"/>
-        </w:rPr>
-        <w:t>2</w:t>
-      </w:r>
-      <w:r>
-        <w:rPr>
-          <w:rFonts w:ascii="Arial" w:hAnsi="Arial" w:cs="Arial"/>
-          <w:sz w:val="20"/>
-          <w:szCs w:val="20"/>
-          <w:lang w:val="fi-FI"/>
-        </w:rPr>
-        <w:t>}</w:t>
+        <w:t xml:space="preserve"> {pekerjaan_saksi_2}</w:t>
       </w:r>
     </w:p>
     <w:p>
@@ -1049,26 +991,22 @@
           <w:szCs w:val="20"/>
           <w:lang w:val="fi-FI"/>
         </w:rPr>
-        <w:t>{alamat_saksi_</w:t>
-      </w:r>
-      <w:r>
-        <w:rPr>
-          <w:rFonts w:ascii="Arial" w:hAnsi="Arial" w:cs="Arial"/>
-          <w:sz w:val="20"/>
-          <w:szCs w:val="20"/>
-          <w:lang w:val="fi-FI"/>
-        </w:rPr>
-        <w:t>2</w:t>
-      </w:r>
-      <w:r>
-        <w:rPr>
-          <w:rFonts w:ascii="Arial" w:hAnsi="Arial" w:cs="Arial"/>
-          <w:sz w:val="20"/>
-          <w:szCs w:val="20"/>
-          <w:lang w:val="fi-FI"/>
-        </w:rPr>
-        <w:t>}</w:t>
-      </w:r>
+        <w:t>{alamat_saksi_2}</w:t>
+      </w:r>
+    </w:p>
+    <w:p>
+      <w:pPr>
+        <w:pStyle w:val="ListParagraph"/>
+        <w:spacing w:line="276" w:lineRule="auto"/>
+        <w:ind w:left="284"/>
+        <w:jc w:val="both"/>
+        <w:rPr>
+          <w:rFonts w:ascii="Arial" w:hAnsi="Arial" w:cs="Arial"/>
+          <w:sz w:val="20"/>
+          <w:szCs w:val="20"/>
+          <w:lang w:val="fi-FI"/>
+        </w:rPr>
+      </w:pPr>
     </w:p>
     <w:p>
       <w:pPr>
@@ -1551,6 +1489,18 @@
         </w:rPr>
         <w:t>{alamat_almarhum}</w:t>
       </w:r>
+    </w:p>
+    <w:p>
+      <w:pPr>
+        <w:spacing w:line="276" w:lineRule="auto"/>
+        <w:jc w:val="both"/>
+        <w:rPr>
+          <w:rFonts w:ascii="Arial" w:hAnsi="Arial" w:cs="Arial"/>
+          <w:sz w:val="20"/>
+          <w:szCs w:val="20"/>
+          <w:lang w:val="fi-FI"/>
+        </w:rPr>
+      </w:pPr>
       <w:r>
         <w:rPr>
           <w:rFonts w:ascii="Arial" w:hAnsi="Arial" w:cs="Arial"/>
@@ -2008,25 +1958,7 @@
           <w:szCs w:val="20"/>
           <w:lang w:val="fi-FI"/>
         </w:rPr>
-        <w:t>{nama_</w:t>
-      </w:r>
-      <w:r>
-        <w:rPr>
-          <w:rFonts w:ascii="Arial" w:hAnsi="Arial" w:cs="Arial"/>
-          <w:sz w:val="20"/>
-          <w:szCs w:val="20"/>
-          <w:lang w:val="fi-FI"/>
-        </w:rPr>
-        <w:t>ibu</w:t>
-      </w:r>
-      <w:r>
-        <w:rPr>
-          <w:rFonts w:ascii="Arial" w:hAnsi="Arial" w:cs="Arial"/>
-          <w:sz w:val="20"/>
-          <w:szCs w:val="20"/>
-          <w:lang w:val="fi-FI"/>
-        </w:rPr>
-        <w:t>_almarhum}</w:t>
+        <w:t>{nama_ibu_almarhum}</w:t>
       </w:r>
     </w:p>
     <w:p>
@@ -2086,25 +2018,7 @@
           <w:szCs w:val="20"/>
           <w:lang w:val="fi-FI"/>
         </w:rPr>
-        <w:t>ibu_almarhum}, {tanggal_lahir_</w:t>
-      </w:r>
-      <w:r>
-        <w:rPr>
-          <w:rFonts w:ascii="Arial" w:hAnsi="Arial" w:cs="Arial"/>
-          <w:sz w:val="20"/>
-          <w:szCs w:val="20"/>
-          <w:lang w:val="fi-FI"/>
-        </w:rPr>
-        <w:t>ibu</w:t>
-      </w:r>
-      <w:r>
-        <w:rPr>
-          <w:rFonts w:ascii="Arial" w:hAnsi="Arial" w:cs="Arial"/>
-          <w:sz w:val="20"/>
-          <w:szCs w:val="20"/>
-          <w:lang w:val="fi-FI"/>
-        </w:rPr>
-        <w:t>_almarhum}</w:t>
+        <w:t>ibu_almarhum}, {tanggal_lahir_ibu_almarhum}</w:t>
       </w:r>
     </w:p>
     <w:p>
@@ -2295,6 +2209,19 @@
         </w:rPr>
         <w:t>ibu_almarhum}</w:t>
       </w:r>
+    </w:p>
+    <w:p>
+      <w:pPr>
+        <w:spacing w:line="276" w:lineRule="auto"/>
+        <w:ind w:left="284"/>
+        <w:jc w:val="both"/>
+        <w:rPr>
+          <w:rFonts w:ascii="Arial" w:hAnsi="Arial" w:cs="Arial"/>
+          <w:sz w:val="20"/>
+          <w:szCs w:val="20"/>
+          <w:lang w:val="fi-FI"/>
+        </w:rPr>
+      </w:pPr>
       <w:r>
         <w:rPr>
           <w:rFonts w:ascii="Arial" w:hAnsi="Arial" w:cs="Arial"/>
@@ -3013,6 +2940,18 @@
         </w:rPr>
         <w:t>}</w:t>
       </w:r>
+    </w:p>
+    <w:p>
+      <w:pPr>
+        <w:spacing w:line="276" w:lineRule="auto"/>
+        <w:jc w:val="both"/>
+        <w:rPr>
+          <w:rFonts w:ascii="Arial" w:hAnsi="Arial" w:cs="Arial"/>
+          <w:sz w:val="20"/>
+          <w:szCs w:val="20"/>
+          <w:lang w:val="fi-FI"/>
+        </w:rPr>
+      </w:pPr>
       <w:r>
         <w:rPr>
           <w:rFonts w:ascii="Arial" w:hAnsi="Arial" w:cs="Arial"/>
@@ -3418,25 +3357,7 @@
           <w:szCs w:val="20"/>
           <w:lang w:val="fi-FI"/>
         </w:rPr>
-        <w:t>{</w:t>
-      </w:r>
-      <w:r>
-        <w:rPr>
-          <w:rFonts w:ascii="Arial" w:hAnsi="Arial" w:cs="Arial"/>
-          <w:sz w:val="20"/>
-          <w:szCs w:val="20"/>
-          <w:lang w:val="fi-FI"/>
-        </w:rPr>
-        <w:t>alamat_anak_1</w:t>
-      </w:r>
-      <w:r>
-        <w:rPr>
-          <w:rFonts w:ascii="Arial" w:hAnsi="Arial" w:cs="Arial"/>
-          <w:sz w:val="20"/>
-          <w:szCs w:val="20"/>
-          <w:lang w:val="fi-FI"/>
-        </w:rPr>
-        <w:t>}</w:t>
+        <w:t>{alamat_anak_1}</w:t>
       </w:r>
     </w:p>
     <w:p>
@@ -3463,6 +3384,7 @@
           <w:szCs w:val="20"/>
           <w:lang w:val="fi-FI"/>
         </w:rPr>
+        <w:lastRenderedPageBreak/>
         <w:t>Nama</w:t>
       </w:r>
       <w:r>
@@ -3500,25 +3422,7 @@
           <w:szCs w:val="20"/>
           <w:lang w:val="fi-FI"/>
         </w:rPr>
-        <w:t>{nama_anak_</w:t>
-      </w:r>
-      <w:r>
-        <w:rPr>
-          <w:rFonts w:ascii="Arial" w:hAnsi="Arial" w:cs="Arial"/>
-          <w:sz w:val="20"/>
-          <w:szCs w:val="20"/>
-          <w:lang w:val="fi-FI"/>
-        </w:rPr>
-        <w:t>2</w:t>
-      </w:r>
-      <w:r>
-        <w:rPr>
-          <w:rFonts w:ascii="Arial" w:hAnsi="Arial" w:cs="Arial"/>
-          <w:sz w:val="20"/>
-          <w:szCs w:val="20"/>
-          <w:lang w:val="fi-FI"/>
-        </w:rPr>
-        <w:t>}</w:t>
+        <w:t>{nama_anak_2}</w:t>
       </w:r>
     </w:p>
     <w:p>
@@ -3560,43 +3464,7 @@
           <w:szCs w:val="20"/>
           <w:lang w:val="fi-FI"/>
         </w:rPr>
-        <w:t>{tempat_lahir_anak_</w:t>
-      </w:r>
-      <w:r>
-        <w:rPr>
-          <w:rFonts w:ascii="Arial" w:hAnsi="Arial" w:cs="Arial"/>
-          <w:sz w:val="20"/>
-          <w:szCs w:val="20"/>
-          <w:lang w:val="fi-FI"/>
-        </w:rPr>
-        <w:t>2</w:t>
-      </w:r>
-      <w:r>
-        <w:rPr>
-          <w:rFonts w:ascii="Arial" w:hAnsi="Arial" w:cs="Arial"/>
-          <w:sz w:val="20"/>
-          <w:szCs w:val="20"/>
-          <w:lang w:val="fi-FI"/>
-        </w:rPr>
-        <w:t>}, {tanggal_lahir_anak_</w:t>
-      </w:r>
-      <w:r>
-        <w:rPr>
-          <w:rFonts w:ascii="Arial" w:hAnsi="Arial" w:cs="Arial"/>
-          <w:sz w:val="20"/>
-          <w:szCs w:val="20"/>
-          <w:lang w:val="fi-FI"/>
-        </w:rPr>
-        <w:t>2</w:t>
-      </w:r>
-      <w:r>
-        <w:rPr>
-          <w:rFonts w:ascii="Arial" w:hAnsi="Arial" w:cs="Arial"/>
-          <w:sz w:val="20"/>
-          <w:szCs w:val="20"/>
-          <w:lang w:val="fi-FI"/>
-        </w:rPr>
-        <w:t>}</w:t>
+        <w:t>{tempat_lahir_anak_2}, {tanggal_lahir_anak_2}</w:t>
       </w:r>
     </w:p>
     <w:p>
@@ -3665,25 +3533,7 @@
           <w:szCs w:val="20"/>
           <w:lang w:val="fi-FI"/>
         </w:rPr>
-        <w:t>{nik_anak_</w:t>
-      </w:r>
-      <w:r>
-        <w:rPr>
-          <w:rFonts w:ascii="Arial" w:hAnsi="Arial" w:cs="Arial"/>
-          <w:sz w:val="20"/>
-          <w:szCs w:val="20"/>
-          <w:lang w:val="fi-FI"/>
-        </w:rPr>
-        <w:t>2</w:t>
-      </w:r>
-      <w:r>
-        <w:rPr>
-          <w:rFonts w:ascii="Arial" w:hAnsi="Arial" w:cs="Arial"/>
-          <w:sz w:val="20"/>
-          <w:szCs w:val="20"/>
-          <w:lang w:val="fi-FI"/>
-        </w:rPr>
-        <w:t>}</w:t>
+        <w:t>{nik_anak_2}</w:t>
       </w:r>
     </w:p>
     <w:p>
@@ -3743,25 +3593,7 @@
           <w:szCs w:val="20"/>
           <w:lang w:val="fi-FI"/>
         </w:rPr>
-        <w:t xml:space="preserve"> {pekerjaan_anak_</w:t>
-      </w:r>
-      <w:r>
-        <w:rPr>
-          <w:rFonts w:ascii="Arial" w:hAnsi="Arial" w:cs="Arial"/>
-          <w:sz w:val="20"/>
-          <w:szCs w:val="20"/>
-          <w:lang w:val="fi-FI"/>
-        </w:rPr>
-        <w:t>2</w:t>
-      </w:r>
-      <w:r>
-        <w:rPr>
-          <w:rFonts w:ascii="Arial" w:hAnsi="Arial" w:cs="Arial"/>
-          <w:sz w:val="20"/>
-          <w:szCs w:val="20"/>
-          <w:lang w:val="fi-FI"/>
-        </w:rPr>
-        <w:t>}</w:t>
+        <w:t xml:space="preserve"> {pekerjaan_anak_2}</w:t>
       </w:r>
     </w:p>
     <w:p>
@@ -3821,26 +3653,22 @@
           <w:szCs w:val="20"/>
           <w:lang w:val="fi-FI"/>
         </w:rPr>
-        <w:t>{alamat_anak_</w:t>
-      </w:r>
-      <w:r>
-        <w:rPr>
-          <w:rFonts w:ascii="Arial" w:hAnsi="Arial" w:cs="Arial"/>
-          <w:sz w:val="20"/>
-          <w:szCs w:val="20"/>
-          <w:lang w:val="fi-FI"/>
-        </w:rPr>
-        <w:t>2</w:t>
-      </w:r>
-      <w:r>
-        <w:rPr>
-          <w:rFonts w:ascii="Arial" w:hAnsi="Arial" w:cs="Arial"/>
-          <w:sz w:val="20"/>
-          <w:szCs w:val="20"/>
-          <w:lang w:val="fi-FI"/>
-        </w:rPr>
-        <w:t>}</w:t>
-      </w:r>
+        <w:t>{alamat_anak_2}</w:t>
+      </w:r>
+    </w:p>
+    <w:p>
+      <w:pPr>
+        <w:pStyle w:val="ListParagraph"/>
+        <w:spacing w:line="276" w:lineRule="auto"/>
+        <w:ind w:left="284"/>
+        <w:jc w:val="both"/>
+        <w:rPr>
+          <w:rFonts w:ascii="Arial" w:hAnsi="Arial" w:cs="Arial"/>
+          <w:sz w:val="20"/>
+          <w:szCs w:val="20"/>
+          <w:lang w:val="fi-FI"/>
+        </w:rPr>
+      </w:pPr>
     </w:p>
     <w:p>
       <w:pPr>
@@ -3894,51 +3722,34 @@
           <w:lang w:val="fi-FI"/>
         </w:rPr>
         <w:tab/>
-      </w:r>
-      <w:r>
-        <w:rPr>
-          <w:rFonts w:ascii="Arial" w:hAnsi="Arial" w:cs="Arial"/>
-          <w:sz w:val="20"/>
-          <w:szCs w:val="20"/>
-          <w:lang w:val="fi-FI"/>
-        </w:rPr>
-        <w:t>:  ...............................................................................................</w:t>
-      </w:r>
-      <w:r>
-        <w:rPr>
-          <w:rFonts w:ascii="Arial" w:hAnsi="Arial" w:cs="Arial"/>
-          <w:sz w:val="20"/>
-          <w:szCs w:val="20"/>
-          <w:lang w:val="id-ID"/>
-        </w:rPr>
-        <w:t>.</w:t>
-      </w:r>
-      <w:r>
-        <w:rPr>
-          <w:rFonts w:ascii="Arial" w:hAnsi="Arial" w:cs="Arial"/>
-          <w:sz w:val="20"/>
-          <w:szCs w:val="20"/>
-          <w:lang w:val="en-US"/>
-        </w:rPr>
-        <w:t>................................</w:t>
-      </w:r>
-      <w:r>
-        <w:rPr>
-          <w:rFonts w:ascii="Arial" w:hAnsi="Arial" w:cs="Arial"/>
-          <w:sz w:val="20"/>
-          <w:szCs w:val="20"/>
-          <w:lang w:val="en-US"/>
-        </w:rPr>
-        <w:t>.</w:t>
-      </w:r>
-      <w:r>
-        <w:rPr>
-          <w:rFonts w:ascii="Arial" w:hAnsi="Arial" w:cs="Arial"/>
-          <w:sz w:val="20"/>
-          <w:szCs w:val="20"/>
-          <w:lang w:val="fi-FI"/>
-        </w:rPr>
-        <w:t>.</w:t>
+        <w:t xml:space="preserve">:  </w:t>
+      </w:r>
+      <w:r>
+        <w:rPr>
+          <w:rFonts w:ascii="Arial" w:hAnsi="Arial" w:cs="Arial"/>
+          <w:sz w:val="20"/>
+          <w:szCs w:val="20"/>
+          <w:lang w:val="fi-FI"/>
+        </w:rPr>
+        <w:t>{nama_anak_</w:t>
+      </w:r>
+      <w:r>
+        <w:rPr>
+          <w:rFonts w:ascii="Arial" w:hAnsi="Arial" w:cs="Arial"/>
+          <w:sz w:val="20"/>
+          <w:szCs w:val="20"/>
+          <w:lang w:val="fi-FI"/>
+        </w:rPr>
+        <w:t>3</w:t>
+      </w:r>
+      <w:r>
+        <w:rPr>
+          <w:rFonts w:ascii="Arial" w:hAnsi="Arial" w:cs="Arial"/>
+          <w:sz w:val="20"/>
+          <w:szCs w:val="20"/>
+          <w:lang w:val="fi-FI"/>
+        </w:rPr>
+        <w:t>}</w:t>
       </w:r>
     </w:p>
     <w:p>
@@ -3971,43 +3782,52 @@
           <w:lang w:val="fi-FI"/>
         </w:rPr>
         <w:tab/>
-        <w:t>:  ...............................................................................................</w:t>
-      </w:r>
-      <w:r>
-        <w:rPr>
-          <w:rFonts w:ascii="Arial" w:hAnsi="Arial" w:cs="Arial"/>
-          <w:sz w:val="20"/>
-          <w:szCs w:val="20"/>
-          <w:lang w:val="id-ID"/>
-        </w:rPr>
-        <w:t>.</w:t>
-      </w:r>
-      <w:r>
-        <w:rPr>
-          <w:rFonts w:ascii="Arial" w:hAnsi="Arial" w:cs="Arial"/>
-          <w:sz w:val="20"/>
-          <w:szCs w:val="20"/>
-          <w:lang w:val="en-US"/>
-        </w:rPr>
-        <w:t>................................</w:t>
-      </w:r>
-      <w:r>
-        <w:rPr>
-          <w:rFonts w:ascii="Arial" w:hAnsi="Arial" w:cs="Arial"/>
-          <w:sz w:val="20"/>
-          <w:szCs w:val="20"/>
-          <w:lang w:val="en-US"/>
-        </w:rPr>
-        <w:t>.</w:t>
-      </w:r>
-      <w:r>
-        <w:rPr>
-          <w:rFonts w:ascii="Arial" w:hAnsi="Arial" w:cs="Arial"/>
-          <w:sz w:val="20"/>
-          <w:szCs w:val="20"/>
-          <w:lang w:val="fi-FI"/>
-        </w:rPr>
-        <w:t xml:space="preserve">.                            </w:t>
+        <w:t xml:space="preserve">:  </w:t>
+      </w:r>
+      <w:r>
+        <w:rPr>
+          <w:rFonts w:ascii="Arial" w:hAnsi="Arial" w:cs="Arial"/>
+          <w:sz w:val="20"/>
+          <w:szCs w:val="20"/>
+          <w:lang w:val="fi-FI"/>
+        </w:rPr>
+        <w:t>{tempat_lahir_anak_</w:t>
+      </w:r>
+      <w:r>
+        <w:rPr>
+          <w:rFonts w:ascii="Arial" w:hAnsi="Arial" w:cs="Arial"/>
+          <w:sz w:val="20"/>
+          <w:szCs w:val="20"/>
+          <w:lang w:val="fi-FI"/>
+        </w:rPr>
+        <w:t>3</w:t>
+      </w:r>
+      <w:r>
+        <w:rPr>
+          <w:rFonts w:ascii="Arial" w:hAnsi="Arial" w:cs="Arial"/>
+          <w:sz w:val="20"/>
+          <w:szCs w:val="20"/>
+          <w:lang w:val="fi-FI"/>
+        </w:rPr>
+        <w:t>}, {tanggal_lahir_anak_</w:t>
+      </w:r>
+      <w:r>
+        <w:rPr>
+          <w:rFonts w:ascii="Arial" w:hAnsi="Arial" w:cs="Arial"/>
+          <w:sz w:val="20"/>
+          <w:szCs w:val="20"/>
+          <w:lang w:val="fi-FI"/>
+        </w:rPr>
+        <w:t>3</w:t>
+      </w:r>
+      <w:r>
+        <w:rPr>
+          <w:rFonts w:ascii="Arial" w:hAnsi="Arial" w:cs="Arial"/>
+          <w:sz w:val="20"/>
+          <w:szCs w:val="20"/>
+          <w:lang w:val="fi-FI"/>
+        </w:rPr>
+        <w:t>}</w:t>
       </w:r>
     </w:p>
     <w:p>
@@ -4067,51 +3887,34 @@
           <w:lang w:val="fi-FI"/>
         </w:rPr>
         <w:tab/>
-      </w:r>
-      <w:r>
-        <w:rPr>
-          <w:rFonts w:ascii="Arial" w:hAnsi="Arial" w:cs="Arial"/>
-          <w:sz w:val="20"/>
-          <w:szCs w:val="20"/>
-          <w:lang w:val="fi-FI"/>
-        </w:rPr>
-        <w:t>:  ...............................................................................................</w:t>
-      </w:r>
-      <w:r>
-        <w:rPr>
-          <w:rFonts w:ascii="Arial" w:hAnsi="Arial" w:cs="Arial"/>
-          <w:sz w:val="20"/>
-          <w:szCs w:val="20"/>
-          <w:lang w:val="id-ID"/>
-        </w:rPr>
-        <w:t>.</w:t>
-      </w:r>
-      <w:r>
-        <w:rPr>
-          <w:rFonts w:ascii="Arial" w:hAnsi="Arial" w:cs="Arial"/>
-          <w:sz w:val="20"/>
-          <w:szCs w:val="20"/>
-          <w:lang w:val="en-US"/>
-        </w:rPr>
-        <w:t>................................</w:t>
-      </w:r>
-      <w:r>
-        <w:rPr>
-          <w:rFonts w:ascii="Arial" w:hAnsi="Arial" w:cs="Arial"/>
-          <w:sz w:val="20"/>
-          <w:szCs w:val="20"/>
-          <w:lang w:val="en-US"/>
-        </w:rPr>
-        <w:t>.</w:t>
-      </w:r>
-      <w:r>
-        <w:rPr>
-          <w:rFonts w:ascii="Arial" w:hAnsi="Arial" w:cs="Arial"/>
-          <w:sz w:val="20"/>
-          <w:szCs w:val="20"/>
-          <w:lang w:val="fi-FI"/>
-        </w:rPr>
-        <w:t>.</w:t>
+        <w:t xml:space="preserve">:  </w:t>
+      </w:r>
+      <w:r>
+        <w:rPr>
+          <w:rFonts w:ascii="Arial" w:hAnsi="Arial" w:cs="Arial"/>
+          <w:sz w:val="20"/>
+          <w:szCs w:val="20"/>
+          <w:lang w:val="fi-FI"/>
+        </w:rPr>
+        <w:t>{nik_anak_</w:t>
+      </w:r>
+      <w:r>
+        <w:rPr>
+          <w:rFonts w:ascii="Arial" w:hAnsi="Arial" w:cs="Arial"/>
+          <w:sz w:val="20"/>
+          <w:szCs w:val="20"/>
+          <w:lang w:val="fi-FI"/>
+        </w:rPr>
+        <w:t>3</w:t>
+      </w:r>
+      <w:r>
+        <w:rPr>
+          <w:rFonts w:ascii="Arial" w:hAnsi="Arial" w:cs="Arial"/>
+          <w:sz w:val="20"/>
+          <w:szCs w:val="20"/>
+          <w:lang w:val="fi-FI"/>
+        </w:rPr>
+        <w:t>}</w:t>
       </w:r>
     </w:p>
     <w:p>
@@ -4162,14 +3965,6 @@
           <w:lang w:val="fi-FI"/>
         </w:rPr>
         <w:tab/>
-      </w:r>
-      <w:r>
-        <w:rPr>
-          <w:rFonts w:ascii="Arial" w:hAnsi="Arial" w:cs="Arial"/>
-          <w:sz w:val="20"/>
-          <w:szCs w:val="20"/>
-          <w:lang w:val="fi-FI"/>
-        </w:rPr>
         <w:t xml:space="preserve">: </w:t>
       </w:r>
       <w:r>
@@ -4179,52 +3974,25 @@
           <w:szCs w:val="20"/>
           <w:lang w:val="fi-FI"/>
         </w:rPr>
-        <w:t xml:space="preserve"> </w:t>
-      </w:r>
-      <w:r>
-        <w:rPr>
-          <w:rFonts w:ascii="Arial" w:hAnsi="Arial" w:cs="Arial"/>
-          <w:sz w:val="20"/>
-          <w:szCs w:val="20"/>
-          <w:lang w:val="fi-FI"/>
-        </w:rPr>
-        <w:t>...............................................................................................</w:t>
-      </w:r>
-      <w:r>
-        <w:rPr>
-          <w:rFonts w:ascii="Arial" w:hAnsi="Arial" w:cs="Arial"/>
-          <w:sz w:val="20"/>
-          <w:szCs w:val="20"/>
-          <w:lang w:val="id-ID"/>
-        </w:rPr>
-        <w:t>.</w:t>
-      </w:r>
-      <w:r>
-        <w:rPr>
-          <w:rFonts w:ascii="Arial" w:hAnsi="Arial" w:cs="Arial"/>
-          <w:sz w:val="20"/>
-          <w:szCs w:val="20"/>
-          <w:lang w:val="en-US"/>
-        </w:rPr>
-        <w:t>................................</w:t>
-      </w:r>
-      <w:r>
-        <w:rPr>
-          <w:rFonts w:ascii="Arial" w:hAnsi="Arial" w:cs="Arial"/>
-          <w:sz w:val="20"/>
-          <w:szCs w:val="20"/>
-          <w:lang w:val="en-US"/>
-        </w:rPr>
-        <w:t>.</w:t>
-      </w:r>
-      <w:r>
-        <w:rPr>
-          <w:rFonts w:ascii="Arial" w:hAnsi="Arial" w:cs="Arial"/>
-          <w:sz w:val="20"/>
-          <w:szCs w:val="20"/>
-          <w:lang w:val="fi-FI"/>
-        </w:rPr>
-        <w:t>.</w:t>
+        <w:t xml:space="preserve"> {pekerjaan_anak_</w:t>
+      </w:r>
+      <w:r>
+        <w:rPr>
+          <w:rFonts w:ascii="Arial" w:hAnsi="Arial" w:cs="Arial"/>
+          <w:sz w:val="20"/>
+          <w:szCs w:val="20"/>
+          <w:lang w:val="fi-FI"/>
+        </w:rPr>
+        <w:t>3</w:t>
+      </w:r>
+      <w:r>
+        <w:rPr>
+          <w:rFonts w:ascii="Arial" w:hAnsi="Arial" w:cs="Arial"/>
+          <w:sz w:val="20"/>
+          <w:szCs w:val="20"/>
+          <w:lang w:val="fi-FI"/>
+        </w:rPr>
+        <w:t>}</w:t>
       </w:r>
     </w:p>
     <w:p>
@@ -4275,33 +4043,34 @@
           <w:lang w:val="fi-FI"/>
         </w:rPr>
         <w:tab/>
-      </w:r>
-      <w:r>
-        <w:rPr>
-          <w:rFonts w:ascii="Arial" w:hAnsi="Arial" w:cs="Arial"/>
-          <w:sz w:val="20"/>
-          <w:szCs w:val="20"/>
-          <w:lang w:val="fi-FI"/>
-        </w:rPr>
-        <w:t>:  ................................................................................................</w:t>
-      </w:r>
-      <w:r>
-        <w:rPr>
-          <w:rFonts w:ascii="Arial" w:hAnsi="Arial" w:cs="Arial"/>
-          <w:sz w:val="20"/>
-          <w:szCs w:val="20"/>
-          <w:lang w:val="id-ID"/>
-        </w:rPr>
-        <w:t>.</w:t>
-      </w:r>
-      <w:r>
-        <w:rPr>
-          <w:rFonts w:ascii="Arial" w:hAnsi="Arial" w:cs="Arial"/>
-          <w:sz w:val="20"/>
-          <w:szCs w:val="20"/>
-          <w:lang w:val="en-US"/>
-        </w:rPr>
-        <w:t>.................................</w:t>
+        <w:t xml:space="preserve">:  </w:t>
+      </w:r>
+      <w:r>
+        <w:rPr>
+          <w:rFonts w:ascii="Arial" w:hAnsi="Arial" w:cs="Arial"/>
+          <w:sz w:val="20"/>
+          <w:szCs w:val="20"/>
+          <w:lang w:val="fi-FI"/>
+        </w:rPr>
+        <w:t>{alamat_anak_</w:t>
+      </w:r>
+      <w:r>
+        <w:rPr>
+          <w:rFonts w:ascii="Arial" w:hAnsi="Arial" w:cs="Arial"/>
+          <w:sz w:val="20"/>
+          <w:szCs w:val="20"/>
+          <w:lang w:val="fi-FI"/>
+        </w:rPr>
+        <w:t>3</w:t>
+      </w:r>
+      <w:r>
+        <w:rPr>
+          <w:rFonts w:ascii="Arial" w:hAnsi="Arial" w:cs="Arial"/>
+          <w:sz w:val="20"/>
+          <w:szCs w:val="20"/>
+          <w:lang w:val="fi-FI"/>
+        </w:rPr>
+        <w:t>}</w:t>
       </w:r>
     </w:p>
     <w:p>
@@ -4320,20 +4089,6 @@
     </w:p>
     <w:p>
       <w:pPr>
-        <w:pStyle w:val="ListParagraph"/>
-        <w:spacing w:line="276" w:lineRule="auto"/>
-        <w:ind w:left="284"/>
-        <w:jc w:val="both"/>
-        <w:rPr>
-          <w:rFonts w:ascii="Arial" w:hAnsi="Arial" w:cs="Arial"/>
-          <w:sz w:val="20"/>
-          <w:szCs w:val="20"/>
-          <w:lang w:val="en-US"/>
-        </w:rPr>
-      </w:pPr>
-    </w:p>
-    <w:p>
-      <w:pPr>
         <w:spacing w:line="276" w:lineRule="auto"/>
         <w:jc w:val="both"/>
         <w:rPr>
@@ -4350,8 +4105,16 @@
           <w:szCs w:val="20"/>
           <w:lang w:val="fi-FI"/>
         </w:rPr>
-        <w:lastRenderedPageBreak/>
-        <w:t xml:space="preserve">Bahwa anak tersebut </w:t>
+        <w:t>Bahwa anak</w:t>
+      </w:r>
+      <w:r>
+        <w:rPr>
+          <w:rFonts w:ascii="Arial" w:hAnsi="Arial" w:cs="Arial"/>
+          <w:sz w:val="20"/>
+          <w:szCs w:val="20"/>
+          <w:lang w:val="fi-FI"/>
+        </w:rPr>
+        <w:t xml:space="preserve"> </w:t>
       </w:r>
       <w:r>
         <w:rPr>
@@ -4387,46 +4150,52 @@
           <w:szCs w:val="20"/>
           <w:lang w:val="fi-FI"/>
         </w:rPr>
-        <w:t xml:space="preserve">....... ( </w:t>
-      </w:r>
-      <w:r>
-        <w:rPr>
-          <w:rFonts w:ascii="Arial" w:hAnsi="Arial" w:cs="Arial"/>
-          <w:sz w:val="20"/>
-          <w:szCs w:val="20"/>
-          <w:lang w:val="fi-FI"/>
-        </w:rPr>
-        <w:t>......</w:t>
-      </w:r>
-      <w:r>
-        <w:rPr>
-          <w:rFonts w:ascii="Arial" w:hAnsi="Arial" w:cs="Arial"/>
-          <w:sz w:val="20"/>
-          <w:szCs w:val="20"/>
-          <w:lang w:val="fi-FI"/>
-        </w:rPr>
-        <w:t>.......... ) orang anak</w:t>
-      </w:r>
-    </w:p>
-    <w:p>
-      <w:pPr>
-        <w:spacing w:line="276" w:lineRule="auto"/>
-        <w:jc w:val="both"/>
-        <w:rPr>
-          <w:rFonts w:ascii="Arial" w:hAnsi="Arial" w:cs="Arial"/>
-          <w:sz w:val="20"/>
-          <w:szCs w:val="20"/>
-          <w:lang w:val="fi-FI"/>
-        </w:rPr>
-      </w:pPr>
-      <w:r>
-        <w:rPr>
-          <w:rFonts w:ascii="Arial" w:hAnsi="Arial" w:cs="Arial"/>
-          <w:sz w:val="20"/>
-          <w:szCs w:val="20"/>
-          <w:lang w:val="fi-FI"/>
-        </w:rPr>
-        <w:t>Bahwa anak tersebut angka</w:t>
+        <w:t>{jumlah_anak_hidup}</w:t>
+      </w:r>
+      <w:r>
+        <w:rPr>
+          <w:rFonts w:ascii="Arial" w:hAnsi="Arial" w:cs="Arial"/>
+          <w:sz w:val="20"/>
+          <w:szCs w:val="20"/>
+          <w:lang w:val="fi-FI"/>
+        </w:rPr>
+        <w:t xml:space="preserve"> ( </w:t>
+      </w:r>
+      <w:r>
+        <w:rPr>
+          <w:rFonts w:ascii="Arial" w:hAnsi="Arial" w:cs="Arial"/>
+          <w:sz w:val="20"/>
+          <w:szCs w:val="20"/>
+          <w:lang w:val="fi-FI"/>
+        </w:rPr>
+        <w:t>{jumlah_anak_hidup}</w:t>
+      </w:r>
+      <w:r>
+        <w:rPr>
+          <w:rFonts w:ascii="Arial" w:hAnsi="Arial" w:cs="Arial"/>
+          <w:sz w:val="20"/>
+          <w:szCs w:val="20"/>
+          <w:lang w:val="fi-FI"/>
+        </w:rPr>
+        <w:t xml:space="preserve"> ) orang anak</w:t>
+      </w:r>
+      <w:r>
+        <w:rPr>
+          <w:rFonts w:ascii="Arial" w:hAnsi="Arial" w:cs="Arial"/>
+          <w:sz w:val="20"/>
+          <w:szCs w:val="20"/>
+          <w:lang w:val="fi-FI"/>
+        </w:rPr>
+        <w:t>,</w:t>
+      </w:r>
+      <w:r>
+        <w:rPr>
+          <w:rFonts w:ascii="Arial" w:hAnsi="Arial" w:cs="Arial"/>
+          <w:sz w:val="20"/>
+          <w:szCs w:val="20"/>
+          <w:lang w:val="fi-FI"/>
+        </w:rPr>
+        <w:t xml:space="preserve"> dan {jumlah_anak_meninggal}</w:t>
       </w:r>
       <w:r>
         <w:rPr>
@@ -4444,16 +4213,7 @@
           <w:szCs w:val="20"/>
           <w:lang w:val="fi-FI"/>
         </w:rPr>
-        <w:t>......</w:t>
-      </w:r>
-      <w:r>
-        <w:rPr>
-          <w:rFonts w:ascii="Arial" w:hAnsi="Arial" w:cs="Arial"/>
-          <w:sz w:val="20"/>
-          <w:szCs w:val="20"/>
-          <w:lang w:val="fi-FI"/>
-        </w:rPr>
-        <w:t>......</w:t>
+        <w:t>(</w:t>
       </w:r>
       <w:r>
         <w:rPr>
@@ -4471,7 +4231,7 @@
           <w:szCs w:val="20"/>
           <w:lang w:val="fi-FI"/>
         </w:rPr>
-        <w:t>(</w:t>
+        <w:t>{jumlah_anak_meninggal}</w:t>
       </w:r>
       <w:r>
         <w:rPr>
@@ -4489,25 +4249,16 @@
           <w:szCs w:val="20"/>
           <w:lang w:val="fi-FI"/>
         </w:rPr>
-        <w:t>.....</w:t>
-      </w:r>
-      <w:r>
-        <w:rPr>
-          <w:rFonts w:ascii="Arial" w:hAnsi="Arial" w:cs="Arial"/>
-          <w:sz w:val="20"/>
-          <w:szCs w:val="20"/>
-          <w:lang w:val="fi-FI"/>
-        </w:rPr>
-        <w:t>..........</w:t>
-      </w:r>
-      <w:r>
-        <w:rPr>
-          <w:rFonts w:ascii="Arial" w:hAnsi="Arial" w:cs="Arial"/>
-          <w:sz w:val="20"/>
-          <w:szCs w:val="20"/>
-          <w:lang w:val="fi-FI"/>
-        </w:rPr>
-        <w:t>..........</w:t>
+        <w:t>)</w:t>
+      </w:r>
+      <w:r>
+        <w:rPr>
+          <w:rFonts w:ascii="Arial" w:hAnsi="Arial" w:cs="Arial"/>
+          <w:sz w:val="20"/>
+          <w:szCs w:val="20"/>
+          <w:lang w:val="fi-FI"/>
+        </w:rPr>
+        <w:t xml:space="preserve"> anak</w:t>
       </w:r>
       <w:r>
         <w:rPr>
@@ -4525,7 +4276,7 @@
           <w:szCs w:val="20"/>
           <w:lang w:val="fi-FI"/>
         </w:rPr>
-        <w:t>)</w:t>
+        <w:t>telah meninggal dunia</w:t>
       </w:r>
       <w:r>
         <w:rPr>
@@ -4543,7 +4294,7 @@
           <w:szCs w:val="20"/>
           <w:lang w:val="fi-FI"/>
         </w:rPr>
-        <w:t>telah meninggal dunia</w:t>
+        <w:t>di</w:t>
       </w:r>
       <w:r>
         <w:rPr>
@@ -4561,14 +4312,14 @@
           <w:szCs w:val="20"/>
           <w:lang w:val="fi-FI"/>
         </w:rPr>
-        <w:t>di</w:t>
-      </w:r>
-      <w:r>
-        <w:rPr>
-          <w:rFonts w:ascii="Arial" w:hAnsi="Arial" w:cs="Arial"/>
-          <w:sz w:val="20"/>
-          <w:szCs w:val="20"/>
-          <w:lang w:val="fi-FI"/>
+        <w:t>{tempat_anak_meninggal}</w:t>
+      </w:r>
+      <w:r>
+        <w:rPr>
+          <w:rFonts w:ascii="Arial" w:hAnsi="Arial" w:cs="Arial"/>
+          <w:sz w:val="20"/>
+          <w:szCs w:val="20"/>
+          <w:lang w:val="sv-SE"/>
         </w:rPr>
         <w:t xml:space="preserve"> </w:t>
       </w:r>
@@ -4579,50 +4330,23 @@
           <w:szCs w:val="20"/>
           <w:lang w:val="fi-FI"/>
         </w:rPr>
-        <w:t>..........................................................</w:t>
-      </w:r>
-      <w:r>
-        <w:rPr>
-          <w:rFonts w:ascii="Arial" w:hAnsi="Arial" w:cs="Arial"/>
-          <w:sz w:val="20"/>
-          <w:szCs w:val="20"/>
-          <w:lang w:val="fi-FI"/>
-        </w:rPr>
-        <w:t>.................</w:t>
-      </w:r>
-      <w:r>
-        <w:rPr>
-          <w:rFonts w:ascii="Arial" w:hAnsi="Arial" w:cs="Arial"/>
-          <w:sz w:val="20"/>
-          <w:szCs w:val="20"/>
-          <w:lang w:val="fi-FI"/>
-        </w:rPr>
-        <w:t>........</w:t>
-      </w:r>
-      <w:r>
-        <w:rPr>
-          <w:rFonts w:ascii="Arial" w:hAnsi="Arial" w:cs="Arial"/>
-          <w:sz w:val="20"/>
-          <w:szCs w:val="20"/>
-          <w:lang w:val="fi-FI"/>
-        </w:rPr>
-        <w:t>................</w:t>
-      </w:r>
-      <w:r>
-        <w:rPr>
-          <w:rFonts w:ascii="Arial" w:hAnsi="Arial" w:cs="Arial"/>
-          <w:sz w:val="20"/>
-          <w:szCs w:val="20"/>
-          <w:lang w:val="fi-FI"/>
-        </w:rPr>
-        <w:t>................</w:t>
-      </w:r>
-      <w:r>
-        <w:rPr>
-          <w:rFonts w:ascii="Arial" w:hAnsi="Arial" w:cs="Arial"/>
-          <w:sz w:val="20"/>
-          <w:szCs w:val="20"/>
-          <w:lang w:val="sv-SE"/>
+        <w:t xml:space="preserve">pada tanggal </w:t>
+      </w:r>
+      <w:r>
+        <w:rPr>
+          <w:rFonts w:ascii="Arial" w:hAnsi="Arial" w:cs="Arial"/>
+          <w:sz w:val="20"/>
+          <w:szCs w:val="20"/>
+          <w:lang w:val="fi-FI"/>
+        </w:rPr>
+        <w:t>{tanggal_anak_meninggal}</w:t>
+      </w:r>
+      <w:r>
+        <w:rPr>
+          <w:rFonts w:ascii="Arial" w:hAnsi="Arial" w:cs="Arial"/>
+          <w:sz w:val="20"/>
+          <w:szCs w:val="20"/>
+          <w:lang w:val="fi-FI"/>
         </w:rPr>
         <w:t xml:space="preserve"> </w:t>
       </w:r>
@@ -4633,7 +4357,7 @@
           <w:szCs w:val="20"/>
           <w:lang w:val="fi-FI"/>
         </w:rPr>
-        <w:t>pada tanggal .........................................</w:t>
+        <w:t>dengan Surat</w:t>
       </w:r>
       <w:r>
         <w:rPr>
@@ -4651,7 +4375,7 @@
           <w:szCs w:val="20"/>
           <w:lang w:val="fi-FI"/>
         </w:rPr>
-        <w:t>dengan Surat/</w:t>
+        <w:t>/</w:t>
       </w:r>
       <w:r>
         <w:rPr>
@@ -4705,7 +4429,7 @@
           <w:szCs w:val="20"/>
           <w:lang w:val="fi-FI"/>
         </w:rPr>
-        <w:t>........................................</w:t>
+        <w:t>{akta_kematian_anak_meninggal}</w:t>
       </w:r>
       <w:r>
         <w:rPr>
@@ -4741,7 +4465,16 @@
           <w:szCs w:val="20"/>
           <w:lang w:val="fi-FI"/>
         </w:rPr>
-        <w:t xml:space="preserve">......................................... </w:t>
+        <w:t>{tanggal_akta_meninggal_anak}</w:t>
+      </w:r>
+      <w:r>
+        <w:rPr>
+          <w:rFonts w:ascii="Arial" w:hAnsi="Arial" w:cs="Arial"/>
+          <w:sz w:val="20"/>
+          <w:szCs w:val="20"/>
+          <w:lang w:val="fi-FI"/>
+        </w:rPr>
+        <w:t xml:space="preserve"> </w:t>
       </w:r>
       <w:r>
         <w:rPr>
@@ -4828,34 +4561,7 @@
           <w:szCs w:val="20"/>
           <w:lang w:val="fi-FI"/>
         </w:rPr>
-        <w:t>................................................................................................</w:t>
-      </w:r>
-      <w:r>
-        <w:rPr>
-          <w:rFonts w:ascii="Arial" w:hAnsi="Arial" w:cs="Arial"/>
-          <w:sz w:val="20"/>
-          <w:szCs w:val="20"/>
-          <w:lang w:val="id-ID"/>
-        </w:rPr>
-        <w:t>.</w:t>
-      </w:r>
-      <w:r>
-        <w:rPr>
-          <w:rFonts w:ascii="Arial" w:hAnsi="Arial" w:cs="Arial"/>
-          <w:sz w:val="20"/>
-          <w:szCs w:val="20"/>
-          <w:lang w:val="en-US"/>
-        </w:rPr>
-        <w:t>................................</w:t>
-      </w:r>
-      <w:r>
-        <w:rPr>
-          <w:rFonts w:ascii="Arial" w:hAnsi="Arial" w:cs="Arial"/>
-          <w:sz w:val="20"/>
-          <w:szCs w:val="20"/>
-          <w:lang w:val="en-US"/>
-        </w:rPr>
-        <w:t>.</w:t>
+        <w:t>{nama_istri_anak_meninggal}</w:t>
       </w:r>
     </w:p>
     <w:p>
@@ -4914,43 +4620,7 @@
           <w:szCs w:val="20"/>
           <w:lang w:val="fi-FI"/>
         </w:rPr>
-        <w:t>................................................................................................</w:t>
-      </w:r>
-      <w:r>
-        <w:rPr>
-          <w:rFonts w:ascii="Arial" w:hAnsi="Arial" w:cs="Arial"/>
-          <w:sz w:val="20"/>
-          <w:szCs w:val="20"/>
-          <w:lang w:val="id-ID"/>
-        </w:rPr>
-        <w:t>.</w:t>
-      </w:r>
-      <w:r>
-        <w:rPr>
-          <w:rFonts w:ascii="Arial" w:hAnsi="Arial" w:cs="Arial"/>
-          <w:sz w:val="20"/>
-          <w:szCs w:val="20"/>
-          <w:lang w:val="en-US"/>
-        </w:rPr>
-        <w:t>................................</w:t>
-      </w:r>
-      <w:r>
-        <w:rPr>
-          <w:rFonts w:ascii="Arial" w:hAnsi="Arial" w:cs="Arial"/>
-          <w:sz w:val="20"/>
-          <w:szCs w:val="20"/>
-          <w:lang w:val="en-US"/>
-        </w:rPr>
-        <w:t>.</w:t>
-      </w:r>
-      <w:r>
-        <w:rPr>
-          <w:rFonts w:ascii="Arial" w:hAnsi="Arial" w:cs="Arial"/>
-          <w:sz w:val="20"/>
-          <w:szCs w:val="20"/>
-          <w:lang w:val="fi-FI"/>
-        </w:rPr>
-        <w:t xml:space="preserve">                            </w:t>
+        <w:t>{tempat_lahir_istri_anak_meninggal},{tanggal_lahir_istri_anak_meninggal}</w:t>
       </w:r>
     </w:p>
     <w:p>
@@ -5019,34 +4689,7 @@
           <w:szCs w:val="20"/>
           <w:lang w:val="fi-FI"/>
         </w:rPr>
-        <w:t>................................................................................................</w:t>
-      </w:r>
-      <w:r>
-        <w:rPr>
-          <w:rFonts w:ascii="Arial" w:hAnsi="Arial" w:cs="Arial"/>
-          <w:sz w:val="20"/>
-          <w:szCs w:val="20"/>
-          <w:lang w:val="id-ID"/>
-        </w:rPr>
-        <w:t>.</w:t>
-      </w:r>
-      <w:r>
-        <w:rPr>
-          <w:rFonts w:ascii="Arial" w:hAnsi="Arial" w:cs="Arial"/>
-          <w:sz w:val="20"/>
-          <w:szCs w:val="20"/>
-          <w:lang w:val="en-US"/>
-        </w:rPr>
-        <w:t>................................</w:t>
-      </w:r>
-      <w:r>
-        <w:rPr>
-          <w:rFonts w:ascii="Arial" w:hAnsi="Arial" w:cs="Arial"/>
-          <w:sz w:val="20"/>
-          <w:szCs w:val="20"/>
-          <w:lang w:val="en-US"/>
-        </w:rPr>
-        <w:t>.</w:t>
+        <w:t>{nik_istri_anak_meninggal}</w:t>
       </w:r>
     </w:p>
     <w:p>
@@ -5124,34 +4767,7 @@
           <w:szCs w:val="20"/>
           <w:lang w:val="fi-FI"/>
         </w:rPr>
-        <w:t>................................................................................................</w:t>
-      </w:r>
-      <w:r>
-        <w:rPr>
-          <w:rFonts w:ascii="Arial" w:hAnsi="Arial" w:cs="Arial"/>
-          <w:sz w:val="20"/>
-          <w:szCs w:val="20"/>
-          <w:lang w:val="id-ID"/>
-        </w:rPr>
-        <w:t>.</w:t>
-      </w:r>
-      <w:r>
-        <w:rPr>
-          <w:rFonts w:ascii="Arial" w:hAnsi="Arial" w:cs="Arial"/>
-          <w:sz w:val="20"/>
-          <w:szCs w:val="20"/>
-          <w:lang w:val="en-US"/>
-        </w:rPr>
-        <w:t>................................</w:t>
-      </w:r>
-      <w:r>
-        <w:rPr>
-          <w:rFonts w:ascii="Arial" w:hAnsi="Arial" w:cs="Arial"/>
-          <w:sz w:val="20"/>
-          <w:szCs w:val="20"/>
-          <w:lang w:val="en-US"/>
-        </w:rPr>
-        <w:t>.</w:t>
+        <w:t>{pekerjaan_istri_anak_meninggal}</w:t>
       </w:r>
     </w:p>
     <w:p>
@@ -5209,43 +4825,16 @@
           <w:lang w:val="fi-FI"/>
         </w:rPr>
         <w:tab/>
-        <w:t>:  ................................................................................................</w:t>
-      </w:r>
-      <w:r>
-        <w:rPr>
-          <w:rFonts w:ascii="Arial" w:hAnsi="Arial" w:cs="Arial"/>
-          <w:sz w:val="20"/>
-          <w:szCs w:val="20"/>
-          <w:lang w:val="id-ID"/>
-        </w:rPr>
-        <w:t>.</w:t>
-      </w:r>
-      <w:r>
-        <w:rPr>
-          <w:rFonts w:ascii="Arial" w:hAnsi="Arial" w:cs="Arial"/>
-          <w:sz w:val="20"/>
-          <w:szCs w:val="20"/>
-          <w:lang w:val="en-US"/>
-        </w:rPr>
-        <w:t>................................</w:t>
-      </w:r>
-      <w:r>
-        <w:rPr>
-          <w:rFonts w:ascii="Arial" w:hAnsi="Arial" w:cs="Arial"/>
-          <w:sz w:val="20"/>
-          <w:szCs w:val="20"/>
-          <w:lang w:val="en-US"/>
-        </w:rPr>
-        <w:t>.</w:t>
-      </w:r>
-      <w:r>
-        <w:rPr>
-          <w:rFonts w:ascii="Arial" w:hAnsi="Arial" w:cs="Arial"/>
-          <w:sz w:val="20"/>
-          <w:szCs w:val="20"/>
-          <w:lang w:val="fi-FI"/>
-        </w:rPr>
-        <w:t xml:space="preserve">  </w:t>
+        <w:t xml:space="preserve">:  </w:t>
+      </w:r>
+      <w:r>
+        <w:rPr>
+          <w:rFonts w:ascii="Arial" w:hAnsi="Arial" w:cs="Arial"/>
+          <w:sz w:val="20"/>
+          <w:szCs w:val="20"/>
+          <w:lang w:val="fi-FI"/>
+        </w:rPr>
+        <w:t>{alamat_istri_anak_meninggal}</w:t>
       </w:r>
     </w:p>
     <w:p>
@@ -5294,25 +4883,7 @@
           <w:lang w:val="fi-FI"/>
         </w:rPr>
         <w:tab/>
-        <w:t xml:space="preserve">   ..................................................................................................</w:t>
-      </w:r>
-      <w:r>
-        <w:rPr>
-          <w:rFonts w:ascii="Arial" w:hAnsi="Arial" w:cs="Arial"/>
-          <w:sz w:val="20"/>
-          <w:szCs w:val="20"/>
-          <w:lang w:val="fi-FI"/>
-        </w:rPr>
-        <w:t>................................</w:t>
-      </w:r>
-      <w:r>
-        <w:rPr>
-          <w:rFonts w:ascii="Arial" w:hAnsi="Arial" w:cs="Arial"/>
-          <w:sz w:val="20"/>
-          <w:szCs w:val="20"/>
-          <w:lang w:val="fi-FI"/>
-        </w:rPr>
-        <w:t xml:space="preserve">  </w:t>
+        <w:t xml:space="preserve">   </w:t>
       </w:r>
     </w:p>
     <w:p>
@@ -5360,25 +4931,16 @@
           <w:szCs w:val="20"/>
           <w:lang w:val="fi-FI"/>
         </w:rPr>
-        <w:t>dilahirkan ...</w:t>
-      </w:r>
-      <w:r>
-        <w:rPr>
-          <w:rFonts w:ascii="Arial" w:hAnsi="Arial" w:cs="Arial"/>
-          <w:sz w:val="20"/>
-          <w:szCs w:val="20"/>
-          <w:lang w:val="fi-FI"/>
-        </w:rPr>
-        <w:t>.</w:t>
-      </w:r>
-      <w:r>
-        <w:rPr>
-          <w:rFonts w:ascii="Arial" w:hAnsi="Arial" w:cs="Arial"/>
-          <w:sz w:val="20"/>
-          <w:szCs w:val="20"/>
-          <w:lang w:val="fi-FI"/>
-        </w:rPr>
-        <w:t>..</w:t>
+        <w:t xml:space="preserve">dilahirkan </w:t>
+      </w:r>
+      <w:r>
+        <w:rPr>
+          <w:rFonts w:ascii="Arial" w:hAnsi="Arial" w:cs="Arial"/>
+          <w:sz w:val="20"/>
+          <w:szCs w:val="20"/>
+          <w:lang w:val="fi-FI"/>
+        </w:rPr>
+        <w:t>{jumlah_anak_dari_anak_almarhum_yang meninggal}</w:t>
       </w:r>
       <w:r>
         <w:rPr>
@@ -5414,25 +4976,7 @@
           <w:szCs w:val="20"/>
           <w:lang w:val="fi-FI"/>
         </w:rPr>
-        <w:t>.......</w:t>
-      </w:r>
-      <w:r>
-        <w:rPr>
-          <w:rFonts w:ascii="Arial" w:hAnsi="Arial" w:cs="Arial"/>
-          <w:sz w:val="20"/>
-          <w:szCs w:val="20"/>
-          <w:lang w:val="fi-FI"/>
-        </w:rPr>
-        <w:t>....</w:t>
-      </w:r>
-      <w:r>
-        <w:rPr>
-          <w:rFonts w:ascii="Arial" w:hAnsi="Arial" w:cs="Arial"/>
-          <w:sz w:val="20"/>
-          <w:szCs w:val="20"/>
-          <w:lang w:val="fi-FI"/>
-        </w:rPr>
-        <w:t>.....</w:t>
+        <w:t>{</w:t>
       </w:r>
       <w:r>
         <w:rPr>
@@ -5450,6 +4994,33 @@
           <w:szCs w:val="20"/>
           <w:lang w:val="fi-FI"/>
         </w:rPr>
+        <w:t>jumlah_anak_dari_anak_almarhum_yang meninggal</w:t>
+      </w:r>
+      <w:r>
+        <w:rPr>
+          <w:rFonts w:ascii="Arial" w:hAnsi="Arial" w:cs="Arial"/>
+          <w:sz w:val="20"/>
+          <w:szCs w:val="20"/>
+          <w:lang w:val="fi-FI"/>
+        </w:rPr>
+        <w:t>}</w:t>
+      </w:r>
+      <w:r>
+        <w:rPr>
+          <w:rFonts w:ascii="Arial" w:hAnsi="Arial" w:cs="Arial"/>
+          <w:sz w:val="20"/>
+          <w:szCs w:val="20"/>
+          <w:lang w:val="fi-FI"/>
+        </w:rPr>
+        <w:t xml:space="preserve"> </w:t>
+      </w:r>
+      <w:r>
+        <w:rPr>
+          <w:rFonts w:ascii="Arial" w:hAnsi="Arial" w:cs="Arial"/>
+          <w:sz w:val="20"/>
+          <w:szCs w:val="20"/>
+          <w:lang w:val="fi-FI"/>
+        </w:rPr>
         <w:t xml:space="preserve">) orang anak </w:t>
       </w:r>
       <w:r>
@@ -5460,472 +5031,6 @@
           <w:lang w:val="sv-SE"/>
         </w:rPr>
         <w:t>yaitu :</w:t>
-      </w:r>
-    </w:p>
-    <w:p>
-      <w:pPr>
-        <w:pStyle w:val="ListParagraph"/>
-        <w:numPr>
-          <w:ilvl w:val="0"/>
-          <w:numId w:val="7"/>
-        </w:numPr>
-        <w:spacing w:line="276" w:lineRule="auto"/>
-        <w:ind w:left="284"/>
-        <w:jc w:val="both"/>
-        <w:rPr>
-          <w:rFonts w:ascii="Arial" w:hAnsi="Arial" w:cs="Arial"/>
-          <w:sz w:val="20"/>
-          <w:szCs w:val="20"/>
-          <w:lang w:val="fi-FI"/>
-        </w:rPr>
-      </w:pPr>
-      <w:r>
-        <w:rPr>
-          <w:rFonts w:ascii="Arial" w:hAnsi="Arial" w:cs="Arial"/>
-          <w:sz w:val="20"/>
-          <w:szCs w:val="20"/>
-          <w:lang w:val="fi-FI"/>
-        </w:rPr>
-        <w:t>Nama</w:t>
-      </w:r>
-      <w:r>
-        <w:rPr>
-          <w:rFonts w:ascii="Arial" w:hAnsi="Arial" w:cs="Arial"/>
-          <w:sz w:val="20"/>
-          <w:szCs w:val="20"/>
-          <w:lang w:val="fi-FI"/>
-        </w:rPr>
-        <w:tab/>
-      </w:r>
-      <w:r>
-        <w:rPr>
-          <w:rFonts w:ascii="Arial" w:hAnsi="Arial" w:cs="Arial"/>
-          <w:sz w:val="20"/>
-          <w:szCs w:val="20"/>
-          <w:lang w:val="fi-FI"/>
-        </w:rPr>
-        <w:tab/>
-      </w:r>
-      <w:r>
-        <w:rPr>
-          <w:rFonts w:ascii="Arial" w:hAnsi="Arial" w:cs="Arial"/>
-          <w:sz w:val="20"/>
-          <w:szCs w:val="20"/>
-          <w:lang w:val="fi-FI"/>
-        </w:rPr>
-        <w:tab/>
-        <w:t xml:space="preserve">:  </w:t>
-      </w:r>
-      <w:r>
-        <w:rPr>
-          <w:rFonts w:ascii="Arial" w:hAnsi="Arial" w:cs="Arial"/>
-          <w:sz w:val="20"/>
-          <w:szCs w:val="20"/>
-          <w:lang w:val="fi-FI"/>
-        </w:rPr>
-        <w:t>................................................................................................</w:t>
-      </w:r>
-      <w:r>
-        <w:rPr>
-          <w:rFonts w:ascii="Arial" w:hAnsi="Arial" w:cs="Arial"/>
-          <w:sz w:val="20"/>
-          <w:szCs w:val="20"/>
-          <w:lang w:val="id-ID"/>
-        </w:rPr>
-        <w:t>.</w:t>
-      </w:r>
-      <w:r>
-        <w:rPr>
-          <w:rFonts w:ascii="Arial" w:hAnsi="Arial" w:cs="Arial"/>
-          <w:sz w:val="20"/>
-          <w:szCs w:val="20"/>
-          <w:lang w:val="en-US"/>
-        </w:rPr>
-        <w:t>................................</w:t>
-      </w:r>
-      <w:r>
-        <w:rPr>
-          <w:rFonts w:ascii="Arial" w:hAnsi="Arial" w:cs="Arial"/>
-          <w:sz w:val="20"/>
-          <w:szCs w:val="20"/>
-          <w:lang w:val="en-US"/>
-        </w:rPr>
-        <w:t>.</w:t>
-      </w:r>
-    </w:p>
-    <w:p>
-      <w:pPr>
-        <w:pStyle w:val="ListParagraph"/>
-        <w:spacing w:line="276" w:lineRule="auto"/>
-        <w:ind w:left="284"/>
-        <w:jc w:val="both"/>
-        <w:rPr>
-          <w:rFonts w:ascii="Arial" w:hAnsi="Arial" w:cs="Arial"/>
-          <w:sz w:val="20"/>
-          <w:szCs w:val="20"/>
-          <w:lang w:val="fi-FI"/>
-        </w:rPr>
-      </w:pPr>
-      <w:r>
-        <w:rPr>
-          <w:rFonts w:ascii="Arial" w:hAnsi="Arial" w:cs="Arial"/>
-          <w:sz w:val="20"/>
-          <w:szCs w:val="20"/>
-          <w:lang w:val="fi-FI"/>
-        </w:rPr>
-        <w:t>Tempat, tanggal lahir</w:t>
-      </w:r>
-      <w:r>
-        <w:rPr>
-          <w:rFonts w:ascii="Arial" w:hAnsi="Arial" w:cs="Arial"/>
-          <w:sz w:val="20"/>
-          <w:szCs w:val="20"/>
-          <w:lang w:val="fi-FI"/>
-        </w:rPr>
-        <w:tab/>
-        <w:t xml:space="preserve">:  </w:t>
-      </w:r>
-      <w:r>
-        <w:rPr>
-          <w:rFonts w:ascii="Arial" w:hAnsi="Arial" w:cs="Arial"/>
-          <w:sz w:val="20"/>
-          <w:szCs w:val="20"/>
-          <w:lang w:val="fi-FI"/>
-        </w:rPr>
-        <w:t>................................................................................................</w:t>
-      </w:r>
-      <w:r>
-        <w:rPr>
-          <w:rFonts w:ascii="Arial" w:hAnsi="Arial" w:cs="Arial"/>
-          <w:sz w:val="20"/>
-          <w:szCs w:val="20"/>
-          <w:lang w:val="id-ID"/>
-        </w:rPr>
-        <w:t>.</w:t>
-      </w:r>
-      <w:r>
-        <w:rPr>
-          <w:rFonts w:ascii="Arial" w:hAnsi="Arial" w:cs="Arial"/>
-          <w:sz w:val="20"/>
-          <w:szCs w:val="20"/>
-          <w:lang w:val="en-US"/>
-        </w:rPr>
-        <w:t>................................</w:t>
-      </w:r>
-      <w:r>
-        <w:rPr>
-          <w:rFonts w:ascii="Arial" w:hAnsi="Arial" w:cs="Arial"/>
-          <w:sz w:val="20"/>
-          <w:szCs w:val="20"/>
-          <w:lang w:val="en-US"/>
-        </w:rPr>
-        <w:t>.</w:t>
-      </w:r>
-      <w:r>
-        <w:rPr>
-          <w:rFonts w:ascii="Arial" w:hAnsi="Arial" w:cs="Arial"/>
-          <w:sz w:val="20"/>
-          <w:szCs w:val="20"/>
-          <w:lang w:val="fi-FI"/>
-        </w:rPr>
-        <w:t xml:space="preserve">.                            </w:t>
-      </w:r>
-    </w:p>
-    <w:p>
-      <w:pPr>
-        <w:pStyle w:val="ListParagraph"/>
-        <w:spacing w:line="276" w:lineRule="auto"/>
-        <w:ind w:left="284"/>
-        <w:jc w:val="both"/>
-        <w:rPr>
-          <w:rFonts w:ascii="Arial" w:hAnsi="Arial" w:cs="Arial"/>
-          <w:sz w:val="20"/>
-          <w:szCs w:val="20"/>
-          <w:lang w:val="fi-FI"/>
-        </w:rPr>
-      </w:pPr>
-      <w:r>
-        <w:rPr>
-          <w:rFonts w:ascii="Arial" w:hAnsi="Arial" w:cs="Arial"/>
-          <w:sz w:val="20"/>
-          <w:szCs w:val="20"/>
-          <w:lang w:val="fi-FI"/>
-        </w:rPr>
-        <w:t>NIK</w:t>
-      </w:r>
-      <w:r>
-        <w:rPr>
-          <w:rFonts w:ascii="Arial" w:hAnsi="Arial" w:cs="Arial"/>
-          <w:sz w:val="20"/>
-          <w:szCs w:val="20"/>
-          <w:lang w:val="fi-FI"/>
-        </w:rPr>
-        <w:tab/>
-      </w:r>
-      <w:r>
-        <w:rPr>
-          <w:rFonts w:ascii="Arial" w:hAnsi="Arial" w:cs="Arial"/>
-          <w:sz w:val="20"/>
-          <w:szCs w:val="20"/>
-          <w:lang w:val="fi-FI"/>
-        </w:rPr>
-        <w:tab/>
-      </w:r>
-      <w:r>
-        <w:rPr>
-          <w:rFonts w:ascii="Arial" w:hAnsi="Arial" w:cs="Arial"/>
-          <w:sz w:val="20"/>
-          <w:szCs w:val="20"/>
-          <w:lang w:val="fi-FI"/>
-        </w:rPr>
-        <w:tab/>
-      </w:r>
-      <w:r>
-        <w:rPr>
-          <w:rFonts w:ascii="Arial" w:hAnsi="Arial" w:cs="Arial"/>
-          <w:sz w:val="20"/>
-          <w:szCs w:val="20"/>
-          <w:lang w:val="fi-FI"/>
-        </w:rPr>
-        <w:tab/>
-        <w:t xml:space="preserve">:  </w:t>
-      </w:r>
-      <w:r>
-        <w:rPr>
-          <w:rFonts w:ascii="Arial" w:hAnsi="Arial" w:cs="Arial"/>
-          <w:sz w:val="20"/>
-          <w:szCs w:val="20"/>
-          <w:lang w:val="fi-FI"/>
-        </w:rPr>
-        <w:t>................................................................................................</w:t>
-      </w:r>
-      <w:r>
-        <w:rPr>
-          <w:rFonts w:ascii="Arial" w:hAnsi="Arial" w:cs="Arial"/>
-          <w:sz w:val="20"/>
-          <w:szCs w:val="20"/>
-          <w:lang w:val="id-ID"/>
-        </w:rPr>
-        <w:t>.</w:t>
-      </w:r>
-      <w:r>
-        <w:rPr>
-          <w:rFonts w:ascii="Arial" w:hAnsi="Arial" w:cs="Arial"/>
-          <w:sz w:val="20"/>
-          <w:szCs w:val="20"/>
-          <w:lang w:val="en-US"/>
-        </w:rPr>
-        <w:t>................................</w:t>
-      </w:r>
-      <w:r>
-        <w:rPr>
-          <w:rFonts w:ascii="Arial" w:hAnsi="Arial" w:cs="Arial"/>
-          <w:sz w:val="20"/>
-          <w:szCs w:val="20"/>
-          <w:lang w:val="en-US"/>
-        </w:rPr>
-        <w:t>.</w:t>
-      </w:r>
-      <w:r>
-        <w:rPr>
-          <w:rFonts w:ascii="Arial" w:hAnsi="Arial" w:cs="Arial"/>
-          <w:sz w:val="20"/>
-          <w:szCs w:val="20"/>
-          <w:lang w:val="fi-FI"/>
-        </w:rPr>
-        <w:t>.</w:t>
-      </w:r>
-    </w:p>
-    <w:p>
-      <w:pPr>
-        <w:pStyle w:val="ListParagraph"/>
-        <w:spacing w:line="276" w:lineRule="auto"/>
-        <w:ind w:left="284"/>
-        <w:jc w:val="both"/>
-        <w:rPr>
-          <w:rFonts w:ascii="Arial" w:hAnsi="Arial" w:cs="Arial"/>
-          <w:sz w:val="20"/>
-          <w:szCs w:val="20"/>
-          <w:lang w:val="fi-FI"/>
-        </w:rPr>
-      </w:pPr>
-      <w:r>
-        <w:rPr>
-          <w:rFonts w:ascii="Arial" w:hAnsi="Arial" w:cs="Arial"/>
-          <w:sz w:val="20"/>
-          <w:szCs w:val="20"/>
-          <w:lang w:val="fi-FI"/>
-        </w:rPr>
-        <w:t>Pekerjaan</w:t>
-      </w:r>
-      <w:r>
-        <w:rPr>
-          <w:rFonts w:ascii="Arial" w:hAnsi="Arial" w:cs="Arial"/>
-          <w:sz w:val="20"/>
-          <w:szCs w:val="20"/>
-          <w:lang w:val="fi-FI"/>
-        </w:rPr>
-        <w:tab/>
-      </w:r>
-      <w:r>
-        <w:rPr>
-          <w:rFonts w:ascii="Arial" w:hAnsi="Arial" w:cs="Arial"/>
-          <w:sz w:val="20"/>
-          <w:szCs w:val="20"/>
-          <w:lang w:val="fi-FI"/>
-        </w:rPr>
-        <w:tab/>
-      </w:r>
-      <w:r>
-        <w:rPr>
-          <w:rFonts w:ascii="Arial" w:hAnsi="Arial" w:cs="Arial"/>
-          <w:sz w:val="20"/>
-          <w:szCs w:val="20"/>
-          <w:lang w:val="fi-FI"/>
-        </w:rPr>
-        <w:tab/>
-        <w:t xml:space="preserve">: </w:t>
-      </w:r>
-      <w:r>
-        <w:rPr>
-          <w:rFonts w:ascii="Arial" w:hAnsi="Arial" w:cs="Arial"/>
-          <w:sz w:val="20"/>
-          <w:szCs w:val="20"/>
-          <w:lang w:val="fi-FI"/>
-        </w:rPr>
-        <w:t xml:space="preserve"> </w:t>
-      </w:r>
-      <w:r>
-        <w:rPr>
-          <w:rFonts w:ascii="Arial" w:hAnsi="Arial" w:cs="Arial"/>
-          <w:sz w:val="20"/>
-          <w:szCs w:val="20"/>
-          <w:lang w:val="fi-FI"/>
-        </w:rPr>
-        <w:t>.</w:t>
-      </w:r>
-      <w:r>
-        <w:rPr>
-          <w:rFonts w:ascii="Arial" w:hAnsi="Arial" w:cs="Arial"/>
-          <w:sz w:val="20"/>
-          <w:szCs w:val="20"/>
-          <w:lang w:val="fi-FI"/>
-        </w:rPr>
-        <w:t>................................................................................................</w:t>
-      </w:r>
-      <w:r>
-        <w:rPr>
-          <w:rFonts w:ascii="Arial" w:hAnsi="Arial" w:cs="Arial"/>
-          <w:sz w:val="20"/>
-          <w:szCs w:val="20"/>
-          <w:lang w:val="id-ID"/>
-        </w:rPr>
-        <w:t>.</w:t>
-      </w:r>
-      <w:r>
-        <w:rPr>
-          <w:rFonts w:ascii="Arial" w:hAnsi="Arial" w:cs="Arial"/>
-          <w:sz w:val="20"/>
-          <w:szCs w:val="20"/>
-          <w:lang w:val="en-US"/>
-        </w:rPr>
-        <w:t>................................</w:t>
-      </w:r>
-      <w:r>
-        <w:rPr>
-          <w:rFonts w:ascii="Arial" w:hAnsi="Arial" w:cs="Arial"/>
-          <w:sz w:val="20"/>
-          <w:szCs w:val="20"/>
-          <w:lang w:val="en-US"/>
-        </w:rPr>
-        <w:t>.</w:t>
-      </w:r>
-    </w:p>
-    <w:p>
-      <w:pPr>
-        <w:pStyle w:val="ListParagraph"/>
-        <w:spacing w:line="276" w:lineRule="auto"/>
-        <w:ind w:left="284"/>
-        <w:jc w:val="both"/>
-        <w:rPr>
-          <w:rFonts w:ascii="Arial" w:hAnsi="Arial" w:cs="Arial"/>
-          <w:sz w:val="20"/>
-          <w:szCs w:val="20"/>
-          <w:lang w:val="fi-FI"/>
-        </w:rPr>
-      </w:pPr>
-      <w:r>
-        <w:rPr>
-          <w:rFonts w:ascii="Arial" w:hAnsi="Arial" w:cs="Arial"/>
-          <w:sz w:val="20"/>
-          <w:szCs w:val="20"/>
-          <w:lang w:val="fi-FI"/>
-        </w:rPr>
-        <w:t>Alamat</w:t>
-      </w:r>
-      <w:r>
-        <w:rPr>
-          <w:rFonts w:ascii="Arial" w:hAnsi="Arial" w:cs="Arial"/>
-          <w:sz w:val="20"/>
-          <w:szCs w:val="20"/>
-          <w:lang w:val="fi-FI"/>
-        </w:rPr>
-        <w:tab/>
-      </w:r>
-      <w:r>
-        <w:rPr>
-          <w:rFonts w:ascii="Arial" w:hAnsi="Arial" w:cs="Arial"/>
-          <w:sz w:val="20"/>
-          <w:szCs w:val="20"/>
-          <w:lang w:val="fi-FI"/>
-        </w:rPr>
-        <w:tab/>
-      </w:r>
-      <w:r>
-        <w:rPr>
-          <w:rFonts w:ascii="Arial" w:hAnsi="Arial" w:cs="Arial"/>
-          <w:sz w:val="20"/>
-          <w:szCs w:val="20"/>
-          <w:lang w:val="fi-FI"/>
-        </w:rPr>
-        <w:tab/>
-        <w:t>:  ................................................................................................</w:t>
-      </w:r>
-      <w:r>
-        <w:rPr>
-          <w:rFonts w:ascii="Arial" w:hAnsi="Arial" w:cs="Arial"/>
-          <w:sz w:val="20"/>
-          <w:szCs w:val="20"/>
-          <w:lang w:val="id-ID"/>
-        </w:rPr>
-        <w:t>.</w:t>
-      </w:r>
-      <w:r>
-        <w:rPr>
-          <w:rFonts w:ascii="Arial" w:hAnsi="Arial" w:cs="Arial"/>
-          <w:sz w:val="20"/>
-          <w:szCs w:val="20"/>
-          <w:lang w:val="en-US"/>
-        </w:rPr>
-        <w:t>................................</w:t>
-      </w:r>
-      <w:r>
-        <w:rPr>
-          <w:rFonts w:ascii="Arial" w:hAnsi="Arial" w:cs="Arial"/>
-          <w:sz w:val="20"/>
-          <w:szCs w:val="20"/>
-          <w:lang w:val="en-US"/>
-        </w:rPr>
-        <w:t>.</w:t>
-      </w:r>
-      <w:r>
-        <w:rPr>
-          <w:rFonts w:ascii="Arial" w:hAnsi="Arial" w:cs="Arial"/>
-          <w:sz w:val="20"/>
-          <w:szCs w:val="20"/>
-          <w:lang w:val="fi-FI"/>
-        </w:rPr>
-        <w:t xml:space="preserve">     </w:t>
       </w:r>
     </w:p>
     <w:p>
@@ -5980,51 +5085,34 @@
           <w:lang w:val="fi-FI"/>
         </w:rPr>
         <w:tab/>
-      </w:r>
-      <w:r>
-        <w:rPr>
-          <w:rFonts w:ascii="Arial" w:hAnsi="Arial" w:cs="Arial"/>
-          <w:sz w:val="20"/>
-          <w:szCs w:val="20"/>
-          <w:lang w:val="fi-FI"/>
-        </w:rPr>
-        <w:t xml:space="preserve">:  </w:t>
-      </w:r>
-      <w:r>
-        <w:rPr>
-          <w:rFonts w:ascii="Arial" w:hAnsi="Arial" w:cs="Arial"/>
-          <w:sz w:val="20"/>
-          <w:szCs w:val="20"/>
-          <w:lang w:val="fi-FI"/>
-        </w:rPr>
-        <w:t>................................................................................................</w:t>
-      </w:r>
-      <w:r>
-        <w:rPr>
-          <w:rFonts w:ascii="Arial" w:hAnsi="Arial" w:cs="Arial"/>
-          <w:sz w:val="20"/>
-          <w:szCs w:val="20"/>
-          <w:lang w:val="id-ID"/>
-        </w:rPr>
-        <w:t>.</w:t>
-      </w:r>
-      <w:r>
-        <w:rPr>
-          <w:rFonts w:ascii="Arial" w:hAnsi="Arial" w:cs="Arial"/>
-          <w:sz w:val="20"/>
-          <w:szCs w:val="20"/>
-          <w:lang w:val="en-US"/>
-        </w:rPr>
-        <w:t>................................</w:t>
-      </w:r>
-      <w:r>
-        <w:rPr>
-          <w:rFonts w:ascii="Arial" w:hAnsi="Arial" w:cs="Arial"/>
-          <w:sz w:val="20"/>
-          <w:szCs w:val="20"/>
-          <w:lang w:val="en-US"/>
-        </w:rPr>
-        <w:t>.</w:t>
+        <w:t>:</w:t>
+      </w:r>
+      <w:r>
+        <w:rPr>
+          <w:rFonts w:ascii="Arial" w:hAnsi="Arial" w:cs="Arial"/>
+          <w:sz w:val="20"/>
+          <w:szCs w:val="20"/>
+          <w:lang w:val="fi-FI"/>
+        </w:rPr>
+        <w:t>{nama_anak_</w:t>
+      </w:r>
+      <w:r>
+        <w:rPr>
+          <w:rFonts w:ascii="Arial" w:hAnsi="Arial" w:cs="Arial"/>
+          <w:sz w:val="20"/>
+          <w:szCs w:val="20"/>
+          <w:lang w:val="fi-FI"/>
+        </w:rPr>
+        <w:t>1</w:t>
+      </w:r>
+      <w:r>
+        <w:rPr>
+          <w:rFonts w:ascii="Arial" w:hAnsi="Arial" w:cs="Arial"/>
+          <w:sz w:val="20"/>
+          <w:szCs w:val="20"/>
+          <w:lang w:val="fi-FI"/>
+        </w:rPr>
+        <w:t>_dari_anak_yang_sudah_almarhum}</w:t>
       </w:r>
     </w:p>
     <w:p>
@@ -6057,52 +5145,106 @@
           <w:lang w:val="fi-FI"/>
         </w:rPr>
         <w:tab/>
-        <w:t xml:space="preserve">:  </w:t>
-      </w:r>
-      <w:r>
-        <w:rPr>
-          <w:rFonts w:ascii="Arial" w:hAnsi="Arial" w:cs="Arial"/>
-          <w:sz w:val="20"/>
-          <w:szCs w:val="20"/>
-          <w:lang w:val="fi-FI"/>
-        </w:rPr>
-        <w:t>................................................................................................</w:t>
-      </w:r>
-      <w:r>
-        <w:rPr>
-          <w:rFonts w:ascii="Arial" w:hAnsi="Arial" w:cs="Arial"/>
-          <w:sz w:val="20"/>
-          <w:szCs w:val="20"/>
-          <w:lang w:val="id-ID"/>
-        </w:rPr>
-        <w:t>.</w:t>
-      </w:r>
-      <w:r>
-        <w:rPr>
-          <w:rFonts w:ascii="Arial" w:hAnsi="Arial" w:cs="Arial"/>
-          <w:sz w:val="20"/>
-          <w:szCs w:val="20"/>
-          <w:lang w:val="en-US"/>
-        </w:rPr>
-        <w:t>................................</w:t>
-      </w:r>
-      <w:r>
-        <w:rPr>
-          <w:rFonts w:ascii="Arial" w:hAnsi="Arial" w:cs="Arial"/>
-          <w:sz w:val="20"/>
-          <w:szCs w:val="20"/>
-          <w:lang w:val="en-US"/>
-        </w:rPr>
-        <w:t>.</w:t>
-      </w:r>
-      <w:r>
-        <w:rPr>
-          <w:rFonts w:ascii="Arial" w:hAnsi="Arial" w:cs="Arial"/>
-          <w:sz w:val="20"/>
-          <w:szCs w:val="20"/>
-          <w:lang w:val="fi-FI"/>
-        </w:rPr>
-        <w:t xml:space="preserve">                            </w:t>
+        <w:t>:</w:t>
+      </w:r>
+      <w:r>
+        <w:rPr>
+          <w:rFonts w:ascii="Arial" w:hAnsi="Arial" w:cs="Arial"/>
+          <w:sz w:val="20"/>
+          <w:szCs w:val="20"/>
+          <w:lang w:val="fi-FI"/>
+        </w:rPr>
+        <w:t>{</w:t>
+      </w:r>
+      <w:r>
+        <w:rPr>
+          <w:rFonts w:ascii="Arial" w:hAnsi="Arial" w:cs="Arial"/>
+          <w:sz w:val="20"/>
+          <w:szCs w:val="20"/>
+          <w:lang w:val="fi-FI"/>
+        </w:rPr>
+        <w:t>tempat_lahir</w:t>
+      </w:r>
+      <w:r>
+        <w:rPr>
+          <w:rFonts w:ascii="Arial" w:hAnsi="Arial" w:cs="Arial"/>
+          <w:sz w:val="20"/>
+          <w:szCs w:val="20"/>
+          <w:lang w:val="fi-FI"/>
+        </w:rPr>
+        <w:t>_anak_</w:t>
+      </w:r>
+      <w:r>
+        <w:rPr>
+          <w:rFonts w:ascii="Arial" w:hAnsi="Arial" w:cs="Arial"/>
+          <w:sz w:val="20"/>
+          <w:szCs w:val="20"/>
+          <w:lang w:val="fi-FI"/>
+        </w:rPr>
+        <w:t>1</w:t>
+      </w:r>
+      <w:r>
+        <w:rPr>
+          <w:rFonts w:ascii="Arial" w:hAnsi="Arial" w:cs="Arial"/>
+          <w:sz w:val="20"/>
+          <w:szCs w:val="20"/>
+          <w:lang w:val="fi-FI"/>
+        </w:rPr>
+        <w:t>_dari_anak_yang_sudah_almarhum}</w:t>
+      </w:r>
+      <w:r>
+        <w:rPr>
+          <w:rFonts w:ascii="Arial" w:hAnsi="Arial" w:cs="Arial"/>
+          <w:sz w:val="20"/>
+          <w:szCs w:val="20"/>
+          <w:lang w:val="fi-FI"/>
+        </w:rPr>
+        <w:t>,</w:t>
+      </w:r>
+      <w:r>
+        <w:rPr>
+          <w:rFonts w:ascii="Arial" w:hAnsi="Arial" w:cs="Arial"/>
+          <w:sz w:val="20"/>
+          <w:szCs w:val="20"/>
+          <w:lang w:val="fi-FI"/>
+        </w:rPr>
+        <w:t>{</w:t>
+      </w:r>
+      <w:r>
+        <w:rPr>
+          <w:rFonts w:ascii="Arial" w:hAnsi="Arial" w:cs="Arial"/>
+          <w:sz w:val="20"/>
+          <w:szCs w:val="20"/>
+          <w:lang w:val="fi-FI"/>
+        </w:rPr>
+        <w:t>_anak_</w:t>
+      </w:r>
+      <w:r>
+        <w:rPr>
+          <w:rFonts w:ascii="Arial" w:hAnsi="Arial" w:cs="Arial"/>
+          <w:sz w:val="20"/>
+          <w:szCs w:val="20"/>
+          <w:lang w:val="fi-FI"/>
+        </w:rPr>
+        <w:t xml:space="preserve">1 </w:t>
+      </w:r>
+      <w:r>
+        <w:rPr>
+          <w:rFonts w:ascii="Arial" w:hAnsi="Arial" w:cs="Arial"/>
+          <w:sz w:val="20"/>
+          <w:szCs w:val="20"/>
+          <w:lang w:val="fi-FI"/>
+        </w:rPr>
+        <w:t>_dari_anak_yang_sudah_almarhum</w:t>
+      </w:r>
+      <w:r>
+        <w:rPr>
+          <w:rFonts w:ascii="Arial" w:hAnsi="Arial" w:cs="Arial"/>
+          <w:sz w:val="20"/>
+          <w:szCs w:val="20"/>
+          <w:lang w:val="fi-FI"/>
+        </w:rPr>
+        <w:t>}</w:t>
       </w:r>
     </w:p>
     <w:p>
@@ -6162,51 +5304,43 @@
           <w:lang w:val="fi-FI"/>
         </w:rPr>
         <w:tab/>
-      </w:r>
-      <w:r>
-        <w:rPr>
-          <w:rFonts w:ascii="Arial" w:hAnsi="Arial" w:cs="Arial"/>
-          <w:sz w:val="20"/>
-          <w:szCs w:val="20"/>
-          <w:lang w:val="fi-FI"/>
-        </w:rPr>
-        <w:t xml:space="preserve">:  </w:t>
-      </w:r>
-      <w:r>
-        <w:rPr>
-          <w:rFonts w:ascii="Arial" w:hAnsi="Arial" w:cs="Arial"/>
-          <w:sz w:val="20"/>
-          <w:szCs w:val="20"/>
-          <w:lang w:val="fi-FI"/>
-        </w:rPr>
-        <w:t>................................................................................................</w:t>
-      </w:r>
-      <w:r>
-        <w:rPr>
-          <w:rFonts w:ascii="Arial" w:hAnsi="Arial" w:cs="Arial"/>
-          <w:sz w:val="20"/>
-          <w:szCs w:val="20"/>
-          <w:lang w:val="id-ID"/>
-        </w:rPr>
-        <w:t>.</w:t>
-      </w:r>
-      <w:r>
-        <w:rPr>
-          <w:rFonts w:ascii="Arial" w:hAnsi="Arial" w:cs="Arial"/>
-          <w:sz w:val="20"/>
-          <w:szCs w:val="20"/>
-          <w:lang w:val="en-US"/>
-        </w:rPr>
-        <w:t>................................</w:t>
-      </w:r>
-      <w:r>
-        <w:rPr>
-          <w:rFonts w:ascii="Arial" w:hAnsi="Arial" w:cs="Arial"/>
-          <w:sz w:val="20"/>
-          <w:szCs w:val="20"/>
-          <w:lang w:val="en-US"/>
-        </w:rPr>
-        <w:t>.</w:t>
+        <w:t>:</w:t>
+      </w:r>
+      <w:r>
+        <w:rPr>
+          <w:rFonts w:ascii="Arial" w:hAnsi="Arial" w:cs="Arial"/>
+          <w:sz w:val="20"/>
+          <w:szCs w:val="20"/>
+          <w:lang w:val="fi-FI"/>
+        </w:rPr>
+        <w:t>{</w:t>
+      </w:r>
+      <w:r>
+        <w:rPr>
+          <w:rFonts w:ascii="Arial" w:hAnsi="Arial" w:cs="Arial"/>
+          <w:sz w:val="20"/>
+          <w:szCs w:val="20"/>
+          <w:lang w:val="fi-FI"/>
+        </w:rPr>
+        <w:t>nik_</w:t>
+      </w:r>
+      <w:r>
+        <w:rPr>
+          <w:rFonts w:ascii="Arial" w:hAnsi="Arial" w:cs="Arial"/>
+          <w:sz w:val="20"/>
+          <w:szCs w:val="20"/>
+          <w:lang w:val="fi-FI"/>
+        </w:rPr>
+        <w:t>anak_1_dari_anak_yang_sudah_almarhum</w:t>
+      </w:r>
+      <w:r>
+        <w:rPr>
+          <w:rFonts w:ascii="Arial" w:hAnsi="Arial" w:cs="Arial"/>
+          <w:sz w:val="20"/>
+          <w:szCs w:val="20"/>
+          <w:lang w:val="fi-FI"/>
+        </w:rPr>
+        <w:t>}</w:t>
       </w:r>
     </w:p>
     <w:p>
@@ -6257,60 +5391,43 @@
           <w:lang w:val="fi-FI"/>
         </w:rPr>
         <w:tab/>
-      </w:r>
-      <w:r>
-        <w:rPr>
-          <w:rFonts w:ascii="Arial" w:hAnsi="Arial" w:cs="Arial"/>
-          <w:sz w:val="20"/>
-          <w:szCs w:val="20"/>
-          <w:lang w:val="fi-FI"/>
-        </w:rPr>
-        <w:t xml:space="preserve">: </w:t>
-      </w:r>
-      <w:r>
-        <w:rPr>
-          <w:rFonts w:ascii="Arial" w:hAnsi="Arial" w:cs="Arial"/>
-          <w:sz w:val="20"/>
-          <w:szCs w:val="20"/>
-          <w:lang w:val="fi-FI"/>
-        </w:rPr>
-        <w:t xml:space="preserve"> </w:t>
-      </w:r>
-      <w:r>
-        <w:rPr>
-          <w:rFonts w:ascii="Arial" w:hAnsi="Arial" w:cs="Arial"/>
-          <w:sz w:val="20"/>
-          <w:szCs w:val="20"/>
-          <w:lang w:val="fi-FI"/>
-        </w:rPr>
-        <w:t>................................................................................................</w:t>
-      </w:r>
-      <w:r>
-        <w:rPr>
-          <w:rFonts w:ascii="Arial" w:hAnsi="Arial" w:cs="Arial"/>
-          <w:sz w:val="20"/>
-          <w:szCs w:val="20"/>
-          <w:lang w:val="id-ID"/>
-        </w:rPr>
-        <w:t>.</w:t>
-      </w:r>
-      <w:r>
-        <w:rPr>
-          <w:rFonts w:ascii="Arial" w:hAnsi="Arial" w:cs="Arial"/>
-          <w:sz w:val="20"/>
-          <w:szCs w:val="20"/>
-          <w:lang w:val="en-US"/>
-        </w:rPr>
-        <w:t>................................</w:t>
-      </w:r>
-      <w:r>
-        <w:rPr>
-          <w:rFonts w:ascii="Arial" w:hAnsi="Arial" w:cs="Arial"/>
-          <w:sz w:val="20"/>
-          <w:szCs w:val="20"/>
-          <w:lang w:val="en-US"/>
-        </w:rPr>
-        <w:t>.</w:t>
+        <w:t>:</w:t>
+      </w:r>
+      <w:r>
+        <w:rPr>
+          <w:rFonts w:ascii="Arial" w:hAnsi="Arial" w:cs="Arial"/>
+          <w:sz w:val="20"/>
+          <w:szCs w:val="20"/>
+          <w:lang w:val="fi-FI"/>
+        </w:rPr>
+        <w:t>{</w:t>
+      </w:r>
+      <w:r>
+        <w:rPr>
+          <w:rFonts w:ascii="Arial" w:hAnsi="Arial" w:cs="Arial"/>
+          <w:sz w:val="20"/>
+          <w:szCs w:val="20"/>
+          <w:lang w:val="fi-FI"/>
+        </w:rPr>
+        <w:t>pekerjaan_</w:t>
+      </w:r>
+      <w:r>
+        <w:rPr>
+          <w:rFonts w:ascii="Arial" w:hAnsi="Arial" w:cs="Arial"/>
+          <w:sz w:val="20"/>
+          <w:szCs w:val="20"/>
+          <w:lang w:val="fi-FI"/>
+        </w:rPr>
+        <w:t>anak_1_dari_anak_yang_sudah_almarhum</w:t>
+      </w:r>
+      <w:r>
+        <w:rPr>
+          <w:rFonts w:ascii="Arial" w:hAnsi="Arial" w:cs="Arial"/>
+          <w:sz w:val="20"/>
+          <w:szCs w:val="20"/>
+          <w:lang w:val="fi-FI"/>
+        </w:rPr>
+        <w:t>}</w:t>
       </w:r>
     </w:p>
     <w:p>
@@ -6361,43 +5478,392 @@
           <w:lang w:val="fi-FI"/>
         </w:rPr>
         <w:tab/>
-      </w:r>
-      <w:r>
-        <w:rPr>
-          <w:rFonts w:ascii="Arial" w:hAnsi="Arial" w:cs="Arial"/>
-          <w:sz w:val="20"/>
-          <w:szCs w:val="20"/>
-          <w:lang w:val="fi-FI"/>
-        </w:rPr>
-        <w:t>:  ................................................................................................</w:t>
-      </w:r>
-      <w:r>
-        <w:rPr>
-          <w:rFonts w:ascii="Arial" w:hAnsi="Arial" w:cs="Arial"/>
-          <w:sz w:val="20"/>
-          <w:szCs w:val="20"/>
-          <w:lang w:val="id-ID"/>
-        </w:rPr>
-        <w:t>.</w:t>
-      </w:r>
-      <w:r>
-        <w:rPr>
-          <w:rFonts w:ascii="Arial" w:hAnsi="Arial" w:cs="Arial"/>
-          <w:sz w:val="20"/>
-          <w:szCs w:val="20"/>
-          <w:lang w:val="en-US"/>
-        </w:rPr>
-        <w:t>.................................</w:t>
-      </w:r>
-      <w:r>
-        <w:rPr>
-          <w:rFonts w:ascii="Arial" w:hAnsi="Arial" w:cs="Arial"/>
-          <w:sz w:val="20"/>
-          <w:szCs w:val="20"/>
-          <w:lang w:val="fi-FI"/>
-        </w:rPr>
-        <w:t xml:space="preserve">          </w:t>
-      </w:r>
+        <w:t>:</w:t>
+      </w:r>
+      <w:r>
+        <w:rPr>
+          <w:rFonts w:ascii="Arial" w:hAnsi="Arial" w:cs="Arial"/>
+          <w:sz w:val="20"/>
+          <w:szCs w:val="20"/>
+          <w:lang w:val="fi-FI"/>
+        </w:rPr>
+        <w:t>{</w:t>
+      </w:r>
+      <w:r>
+        <w:rPr>
+          <w:rFonts w:ascii="Arial" w:hAnsi="Arial" w:cs="Arial"/>
+          <w:sz w:val="20"/>
+          <w:szCs w:val="20"/>
+          <w:lang w:val="fi-FI"/>
+        </w:rPr>
+        <w:t>alamat_</w:t>
+      </w:r>
+      <w:r>
+        <w:rPr>
+          <w:rFonts w:ascii="Arial" w:hAnsi="Arial" w:cs="Arial"/>
+          <w:sz w:val="20"/>
+          <w:szCs w:val="20"/>
+          <w:lang w:val="fi-FI"/>
+        </w:rPr>
+        <w:t xml:space="preserve"> </w:t>
+      </w:r>
+      <w:r>
+        <w:rPr>
+          <w:rFonts w:ascii="Arial" w:hAnsi="Arial" w:cs="Arial"/>
+          <w:sz w:val="20"/>
+          <w:szCs w:val="20"/>
+          <w:lang w:val="fi-FI"/>
+        </w:rPr>
+        <w:t>anak_1_dari_anak_yang_sudah_almarhum</w:t>
+      </w:r>
+      <w:r>
+        <w:rPr>
+          <w:rFonts w:ascii="Arial" w:hAnsi="Arial" w:cs="Arial"/>
+          <w:sz w:val="20"/>
+          <w:szCs w:val="20"/>
+          <w:lang w:val="fi-FI"/>
+        </w:rPr>
+        <w:t>}</w:t>
+      </w:r>
+    </w:p>
+    <w:p>
+      <w:pPr>
+        <w:pStyle w:val="ListParagraph"/>
+        <w:spacing w:line="276" w:lineRule="auto"/>
+        <w:ind w:left="284"/>
+        <w:jc w:val="both"/>
+        <w:rPr>
+          <w:rFonts w:ascii="Arial" w:hAnsi="Arial" w:cs="Arial"/>
+          <w:sz w:val="20"/>
+          <w:szCs w:val="20"/>
+          <w:lang w:val="fi-FI"/>
+        </w:rPr>
+      </w:pPr>
+    </w:p>
+    <w:p>
+      <w:pPr>
+        <w:pStyle w:val="ListParagraph"/>
+        <w:numPr>
+          <w:ilvl w:val="0"/>
+          <w:numId w:val="7"/>
+        </w:numPr>
+        <w:spacing w:line="276" w:lineRule="auto"/>
+        <w:ind w:left="284" w:hanging="284"/>
+        <w:jc w:val="both"/>
+        <w:rPr>
+          <w:rFonts w:ascii="Arial" w:hAnsi="Arial" w:cs="Arial"/>
+          <w:sz w:val="20"/>
+          <w:szCs w:val="20"/>
+          <w:lang w:val="fi-FI"/>
+        </w:rPr>
+      </w:pPr>
+      <w:r>
+        <w:rPr>
+          <w:rFonts w:ascii="Arial" w:hAnsi="Arial" w:cs="Arial"/>
+          <w:sz w:val="20"/>
+          <w:szCs w:val="20"/>
+          <w:lang w:val="fi-FI"/>
+        </w:rPr>
+        <w:t>Nama</w:t>
+      </w:r>
+      <w:r>
+        <w:rPr>
+          <w:rFonts w:ascii="Arial" w:hAnsi="Arial" w:cs="Arial"/>
+          <w:sz w:val="20"/>
+          <w:szCs w:val="20"/>
+          <w:lang w:val="fi-FI"/>
+        </w:rPr>
+        <w:tab/>
+      </w:r>
+      <w:r>
+        <w:rPr>
+          <w:rFonts w:ascii="Arial" w:hAnsi="Arial" w:cs="Arial"/>
+          <w:sz w:val="20"/>
+          <w:szCs w:val="20"/>
+          <w:lang w:val="fi-FI"/>
+        </w:rPr>
+        <w:tab/>
+      </w:r>
+      <w:r>
+        <w:rPr>
+          <w:rFonts w:ascii="Arial" w:hAnsi="Arial" w:cs="Arial"/>
+          <w:sz w:val="20"/>
+          <w:szCs w:val="20"/>
+          <w:lang w:val="fi-FI"/>
+        </w:rPr>
+        <w:tab/>
+        <w:t>:</w:t>
+      </w:r>
+      <w:r>
+        <w:rPr>
+          <w:rFonts w:ascii="Arial" w:hAnsi="Arial" w:cs="Arial"/>
+          <w:sz w:val="20"/>
+          <w:szCs w:val="20"/>
+          <w:lang w:val="fi-FI"/>
+        </w:rPr>
+        <w:t>{nama_anak_1_dari_anak_yang_sudah_almarhum}</w:t>
+      </w:r>
+    </w:p>
+    <w:p>
+      <w:pPr>
+        <w:pStyle w:val="ListParagraph"/>
+        <w:spacing w:line="276" w:lineRule="auto"/>
+        <w:ind w:left="284"/>
+        <w:jc w:val="both"/>
+        <w:rPr>
+          <w:rFonts w:ascii="Arial" w:hAnsi="Arial" w:cs="Arial"/>
+          <w:sz w:val="20"/>
+          <w:szCs w:val="20"/>
+          <w:lang w:val="fi-FI"/>
+        </w:rPr>
+      </w:pPr>
+      <w:r>
+        <w:rPr>
+          <w:rFonts w:ascii="Arial" w:hAnsi="Arial" w:cs="Arial"/>
+          <w:sz w:val="20"/>
+          <w:szCs w:val="20"/>
+          <w:lang w:val="fi-FI"/>
+        </w:rPr>
+        <w:t>Tempat, tanggal lahir</w:t>
+      </w:r>
+      <w:r>
+        <w:rPr>
+          <w:rFonts w:ascii="Arial" w:hAnsi="Arial" w:cs="Arial"/>
+          <w:sz w:val="20"/>
+          <w:szCs w:val="20"/>
+          <w:lang w:val="fi-FI"/>
+        </w:rPr>
+        <w:tab/>
+        <w:t>:</w:t>
+      </w:r>
+      <w:r>
+        <w:rPr>
+          <w:rFonts w:ascii="Arial" w:hAnsi="Arial" w:cs="Arial"/>
+          <w:sz w:val="20"/>
+          <w:szCs w:val="20"/>
+          <w:lang w:val="fi-FI"/>
+        </w:rPr>
+        <w:t>{tempat_lahir_anak_1_dari_anak_yang_sudah_almarhum},{_anak_1 _dari_anak_yang_sudah_almarhum}</w:t>
+      </w:r>
+    </w:p>
+    <w:p>
+      <w:pPr>
+        <w:pStyle w:val="ListParagraph"/>
+        <w:spacing w:line="276" w:lineRule="auto"/>
+        <w:ind w:left="284"/>
+        <w:jc w:val="both"/>
+        <w:rPr>
+          <w:rFonts w:ascii="Arial" w:hAnsi="Arial" w:cs="Arial"/>
+          <w:sz w:val="20"/>
+          <w:szCs w:val="20"/>
+          <w:lang w:val="fi-FI"/>
+        </w:rPr>
+      </w:pPr>
+      <w:r>
+        <w:rPr>
+          <w:rFonts w:ascii="Arial" w:hAnsi="Arial" w:cs="Arial"/>
+          <w:sz w:val="20"/>
+          <w:szCs w:val="20"/>
+          <w:lang w:val="fi-FI"/>
+        </w:rPr>
+        <w:t>NIK</w:t>
+      </w:r>
+      <w:r>
+        <w:rPr>
+          <w:rFonts w:ascii="Arial" w:hAnsi="Arial" w:cs="Arial"/>
+          <w:sz w:val="20"/>
+          <w:szCs w:val="20"/>
+          <w:lang w:val="fi-FI"/>
+        </w:rPr>
+        <w:tab/>
+      </w:r>
+      <w:r>
+        <w:rPr>
+          <w:rFonts w:ascii="Arial" w:hAnsi="Arial" w:cs="Arial"/>
+          <w:sz w:val="20"/>
+          <w:szCs w:val="20"/>
+          <w:lang w:val="fi-FI"/>
+        </w:rPr>
+        <w:tab/>
+      </w:r>
+      <w:r>
+        <w:rPr>
+          <w:rFonts w:ascii="Arial" w:hAnsi="Arial" w:cs="Arial"/>
+          <w:sz w:val="20"/>
+          <w:szCs w:val="20"/>
+          <w:lang w:val="fi-FI"/>
+        </w:rPr>
+        <w:tab/>
+      </w:r>
+      <w:r>
+        <w:rPr>
+          <w:rFonts w:ascii="Arial" w:hAnsi="Arial" w:cs="Arial"/>
+          <w:sz w:val="20"/>
+          <w:szCs w:val="20"/>
+          <w:lang w:val="fi-FI"/>
+        </w:rPr>
+        <w:tab/>
+        <w:t>:</w:t>
+      </w:r>
+      <w:r>
+        <w:rPr>
+          <w:rFonts w:ascii="Arial" w:hAnsi="Arial" w:cs="Arial"/>
+          <w:sz w:val="20"/>
+          <w:szCs w:val="20"/>
+          <w:lang w:val="fi-FI"/>
+        </w:rPr>
+        <w:t>{nik_anak_1_dari_anak_yang_sudah_almarhum}</w:t>
+      </w:r>
+    </w:p>
+    <w:p>
+      <w:pPr>
+        <w:pStyle w:val="ListParagraph"/>
+        <w:spacing w:line="276" w:lineRule="auto"/>
+        <w:ind w:left="284"/>
+        <w:jc w:val="both"/>
+        <w:rPr>
+          <w:rFonts w:ascii="Arial" w:hAnsi="Arial" w:cs="Arial"/>
+          <w:sz w:val="20"/>
+          <w:szCs w:val="20"/>
+          <w:lang w:val="fi-FI"/>
+        </w:rPr>
+      </w:pPr>
+      <w:r>
+        <w:rPr>
+          <w:rFonts w:ascii="Arial" w:hAnsi="Arial" w:cs="Arial"/>
+          <w:sz w:val="20"/>
+          <w:szCs w:val="20"/>
+          <w:lang w:val="fi-FI"/>
+        </w:rPr>
+        <w:t>Pekerjaan</w:t>
+      </w:r>
+      <w:r>
+        <w:rPr>
+          <w:rFonts w:ascii="Arial" w:hAnsi="Arial" w:cs="Arial"/>
+          <w:sz w:val="20"/>
+          <w:szCs w:val="20"/>
+          <w:lang w:val="fi-FI"/>
+        </w:rPr>
+        <w:tab/>
+      </w:r>
+      <w:r>
+        <w:rPr>
+          <w:rFonts w:ascii="Arial" w:hAnsi="Arial" w:cs="Arial"/>
+          <w:sz w:val="20"/>
+          <w:szCs w:val="20"/>
+          <w:lang w:val="fi-FI"/>
+        </w:rPr>
+        <w:tab/>
+      </w:r>
+      <w:r>
+        <w:rPr>
+          <w:rFonts w:ascii="Arial" w:hAnsi="Arial" w:cs="Arial"/>
+          <w:sz w:val="20"/>
+          <w:szCs w:val="20"/>
+          <w:lang w:val="fi-FI"/>
+        </w:rPr>
+        <w:tab/>
+        <w:t>:</w:t>
+      </w:r>
+      <w:r>
+        <w:rPr>
+          <w:rFonts w:ascii="Arial" w:hAnsi="Arial" w:cs="Arial"/>
+          <w:sz w:val="20"/>
+          <w:szCs w:val="20"/>
+          <w:lang w:val="fi-FI"/>
+        </w:rPr>
+        <w:t>{pekerjaan_anak_1_dari_anak_yang_sudah_almarhum}</w:t>
+      </w:r>
+    </w:p>
+    <w:p>
+      <w:pPr>
+        <w:spacing w:line="276" w:lineRule="auto"/>
+        <w:ind w:left="284"/>
+        <w:jc w:val="both"/>
+        <w:rPr>
+          <w:rFonts w:ascii="Arial" w:hAnsi="Arial" w:cs="Arial"/>
+          <w:sz w:val="20"/>
+          <w:szCs w:val="20"/>
+          <w:lang w:val="fi-FI"/>
+        </w:rPr>
+      </w:pPr>
+      <w:r>
+        <w:rPr>
+          <w:rFonts w:ascii="Arial" w:hAnsi="Arial" w:cs="Arial"/>
+          <w:sz w:val="20"/>
+          <w:szCs w:val="20"/>
+          <w:lang w:val="fi-FI"/>
+        </w:rPr>
+        <w:t>Alamat</w:t>
+      </w:r>
+      <w:r>
+        <w:rPr>
+          <w:rFonts w:ascii="Arial" w:hAnsi="Arial" w:cs="Arial"/>
+          <w:sz w:val="20"/>
+          <w:szCs w:val="20"/>
+          <w:lang w:val="fi-FI"/>
+        </w:rPr>
+        <w:tab/>
+      </w:r>
+      <w:r>
+        <w:rPr>
+          <w:rFonts w:ascii="Arial" w:hAnsi="Arial" w:cs="Arial"/>
+          <w:sz w:val="20"/>
+          <w:szCs w:val="20"/>
+          <w:lang w:val="fi-FI"/>
+        </w:rPr>
+        <w:tab/>
+      </w:r>
+      <w:r>
+        <w:rPr>
+          <w:rFonts w:ascii="Arial" w:hAnsi="Arial" w:cs="Arial"/>
+          <w:sz w:val="20"/>
+          <w:szCs w:val="20"/>
+          <w:lang w:val="fi-FI"/>
+        </w:rPr>
+        <w:tab/>
+        <w:t>:</w:t>
+      </w:r>
+      <w:r>
+        <w:rPr>
+          <w:rFonts w:ascii="Arial" w:hAnsi="Arial" w:cs="Arial"/>
+          <w:sz w:val="20"/>
+          <w:szCs w:val="20"/>
+          <w:lang w:val="fi-FI"/>
+        </w:rPr>
+        <w:t>{alamat_</w:t>
+      </w:r>
+      <w:r>
+        <w:rPr>
+          <w:rFonts w:ascii="Arial" w:hAnsi="Arial" w:cs="Arial"/>
+          <w:sz w:val="20"/>
+          <w:szCs w:val="20"/>
+          <w:lang w:val="fi-FI"/>
+        </w:rPr>
+        <w:t xml:space="preserve"> </w:t>
+      </w:r>
+      <w:r>
+        <w:rPr>
+          <w:rFonts w:ascii="Arial" w:hAnsi="Arial" w:cs="Arial"/>
+          <w:sz w:val="20"/>
+          <w:szCs w:val="20"/>
+          <w:lang w:val="fi-FI"/>
+        </w:rPr>
+        <w:t>anak_1_dari_anak_yang_sudah_almarhum}</w:t>
+      </w:r>
+    </w:p>
+    <w:p>
+      <w:pPr>
+        <w:spacing w:line="276" w:lineRule="auto"/>
+        <w:ind w:left="284"/>
+        <w:jc w:val="both"/>
+        <w:rPr>
+          <w:rFonts w:ascii="Arial" w:hAnsi="Arial" w:cs="Arial"/>
+          <w:sz w:val="20"/>
+          <w:szCs w:val="20"/>
+          <w:lang w:val="fi-FI"/>
+        </w:rPr>
+      </w:pPr>
     </w:p>
     <w:p>
       <w:pPr>
@@ -6471,7 +5937,70 @@
           <w:szCs w:val="20"/>
           <w:lang w:val="fi-FI"/>
         </w:rPr>
-        <w:t>Suami / Istri dan ........</w:t>
+        <w:t xml:space="preserve">Suami / Istri dan </w:t>
+      </w:r>
+      <w:r>
+        <w:rPr>
+          <w:rFonts w:ascii="Arial" w:hAnsi="Arial" w:cs="Arial"/>
+          <w:sz w:val="20"/>
+          <w:szCs w:val="20"/>
+          <w:lang w:val="fi-FI"/>
+        </w:rPr>
+        <w:t>{jumlah_anak_hidup}</w:t>
+      </w:r>
+      <w:r>
+        <w:rPr>
+          <w:rFonts w:ascii="Arial" w:hAnsi="Arial" w:cs="Arial"/>
+          <w:sz w:val="20"/>
+          <w:szCs w:val="20"/>
+          <w:lang w:val="fi-FI"/>
+        </w:rPr>
+        <w:t xml:space="preserve"> </w:t>
+      </w:r>
+      <w:r>
+        <w:rPr>
+          <w:rFonts w:ascii="Arial" w:hAnsi="Arial" w:cs="Arial"/>
+          <w:sz w:val="20"/>
+          <w:szCs w:val="20"/>
+          <w:lang w:val="fi-FI"/>
+        </w:rPr>
+        <w:t>(</w:t>
+      </w:r>
+      <w:r>
+        <w:rPr>
+          <w:rFonts w:ascii="Arial" w:hAnsi="Arial" w:cs="Arial"/>
+          <w:sz w:val="20"/>
+          <w:szCs w:val="20"/>
+          <w:lang w:val="fi-FI"/>
+        </w:rPr>
+        <w:t xml:space="preserve"> </w:t>
+      </w:r>
+      <w:r>
+        <w:rPr>
+          <w:rFonts w:ascii="Arial" w:hAnsi="Arial" w:cs="Arial"/>
+          <w:sz w:val="20"/>
+          <w:szCs w:val="20"/>
+          <w:lang w:val="fi-FI"/>
+        </w:rPr>
+        <w:t>{jumlah_anak_hidup}</w:t>
+      </w:r>
+      <w:r>
+        <w:rPr>
+          <w:rFonts w:ascii="Arial" w:hAnsi="Arial" w:cs="Arial"/>
+          <w:sz w:val="20"/>
+          <w:szCs w:val="20"/>
+          <w:lang w:val="fi-FI"/>
+        </w:rPr>
+        <w:t xml:space="preserve">) orang anak yang masih hidup beserta  </w:t>
+      </w:r>
+      <w:r>
+        <w:rPr>
+          <w:rFonts w:ascii="Arial" w:hAnsi="Arial" w:cs="Arial"/>
+          <w:sz w:val="20"/>
+          <w:szCs w:val="20"/>
+          <w:lang w:val="fi-FI"/>
+        </w:rPr>
+        <w:t>{jumlah_cucu_anak_meninggal}</w:t>
       </w:r>
       <w:r>
         <w:rPr>
@@ -6498,7 +6027,7 @@
           <w:szCs w:val="20"/>
           <w:lang w:val="fi-FI"/>
         </w:rPr>
-        <w:t>.................</w:t>
+        <w:t>{jumlah_cucu_anak_meninggal}</w:t>
       </w:r>
       <w:r>
         <w:rPr>
@@ -6516,25 +6045,16 @@
           <w:szCs w:val="20"/>
           <w:lang w:val="fi-FI"/>
         </w:rPr>
-        <w:t xml:space="preserve">) orang anak yang masih hidup beserta  </w:t>
-      </w:r>
-      <w:r>
-        <w:rPr>
-          <w:rFonts w:ascii="Arial" w:hAnsi="Arial" w:cs="Arial"/>
-          <w:sz w:val="20"/>
-          <w:szCs w:val="20"/>
-          <w:lang w:val="fi-FI"/>
-        </w:rPr>
-        <w:t>......</w:t>
-      </w:r>
-      <w:r>
-        <w:rPr>
-          <w:rFonts w:ascii="Arial" w:hAnsi="Arial" w:cs="Arial"/>
-          <w:sz w:val="20"/>
-          <w:szCs w:val="20"/>
-          <w:lang w:val="fi-FI"/>
-        </w:rPr>
-        <w:t xml:space="preserve"> (</w:t>
+        <w:t>)</w:t>
+      </w:r>
+      <w:r>
+        <w:rPr>
+          <w:rFonts w:ascii="Arial" w:hAnsi="Arial" w:cs="Arial"/>
+          <w:sz w:val="20"/>
+          <w:szCs w:val="20"/>
+          <w:lang w:val="fi-FI"/>
+        </w:rPr>
+        <w:t xml:space="preserve">  cucu yang </w:t>
       </w:r>
       <w:r>
         <w:rPr>
@@ -6552,7 +6072,7 @@
           <w:szCs w:val="20"/>
           <w:lang w:val="fi-FI"/>
         </w:rPr>
-        <w:t>..............</w:t>
+        <w:t>berasal</w:t>
       </w:r>
       <w:r>
         <w:rPr>
@@ -6570,6 +6090,105 @@
           <w:szCs w:val="20"/>
           <w:lang w:val="fi-FI"/>
         </w:rPr>
+        <w:t xml:space="preserve"> dari</w:t>
+      </w:r>
+      <w:r>
+        <w:rPr>
+          <w:rFonts w:ascii="Arial" w:hAnsi="Arial" w:cs="Arial"/>
+          <w:sz w:val="20"/>
+          <w:szCs w:val="20"/>
+          <w:lang w:val="fi-FI"/>
+        </w:rPr>
+        <w:t xml:space="preserve"> </w:t>
+      </w:r>
+      <w:r>
+        <w:rPr>
+          <w:rFonts w:ascii="Arial" w:hAnsi="Arial" w:cs="Arial"/>
+          <w:sz w:val="20"/>
+          <w:szCs w:val="20"/>
+          <w:lang w:val="fi-FI"/>
+        </w:rPr>
+        <w:t xml:space="preserve"> anak </w:t>
+      </w:r>
+      <w:r>
+        <w:rPr>
+          <w:rFonts w:ascii="Arial" w:hAnsi="Arial" w:cs="Arial"/>
+          <w:sz w:val="20"/>
+          <w:szCs w:val="20"/>
+          <w:lang w:val="fi-FI"/>
+        </w:rPr>
+        <w:t xml:space="preserve"> </w:t>
+      </w:r>
+      <w:r>
+        <w:rPr>
+          <w:rFonts w:ascii="Arial" w:hAnsi="Arial" w:cs="Arial"/>
+          <w:sz w:val="20"/>
+          <w:szCs w:val="20"/>
+          <w:lang w:val="fi-FI"/>
+        </w:rPr>
+        <w:t>ke</w:t>
+      </w:r>
+      <w:r>
+        <w:rPr>
+          <w:rFonts w:ascii="Arial" w:hAnsi="Arial" w:cs="Arial"/>
+          <w:sz w:val="20"/>
+          <w:szCs w:val="20"/>
+          <w:lang w:val="fi-FI"/>
+        </w:rPr>
+        <w:t xml:space="preserve"> </w:t>
+      </w:r>
+      <w:r>
+        <w:rPr>
+          <w:rFonts w:ascii="Arial" w:hAnsi="Arial" w:cs="Arial"/>
+          <w:sz w:val="20"/>
+          <w:szCs w:val="20"/>
+          <w:lang w:val="fi-FI"/>
+        </w:rPr>
+        <w:t>{anak_keberapa_yang_meninggal}</w:t>
+      </w:r>
+      <w:r>
+        <w:rPr>
+          <w:rFonts w:ascii="Arial" w:hAnsi="Arial" w:cs="Arial"/>
+          <w:sz w:val="20"/>
+          <w:szCs w:val="20"/>
+          <w:lang w:val="fi-FI"/>
+        </w:rPr>
+        <w:t xml:space="preserve"> </w:t>
+      </w:r>
+      <w:r>
+        <w:rPr>
+          <w:rFonts w:ascii="Arial" w:hAnsi="Arial" w:cs="Arial"/>
+          <w:sz w:val="20"/>
+          <w:szCs w:val="20"/>
+          <w:lang w:val="fi-FI"/>
+        </w:rPr>
+        <w:t>(</w:t>
+      </w:r>
+      <w:r>
+        <w:rPr>
+          <w:rFonts w:ascii="Arial" w:hAnsi="Arial" w:cs="Arial"/>
+          <w:sz w:val="20"/>
+          <w:szCs w:val="20"/>
+          <w:lang w:val="fi-FI"/>
+        </w:rPr>
+        <w:t xml:space="preserve"> </w:t>
+      </w:r>
+      <w:r>
+        <w:rPr>
+          <w:rFonts w:ascii="Arial" w:hAnsi="Arial" w:cs="Arial"/>
+          <w:sz w:val="20"/>
+          <w:szCs w:val="20"/>
+          <w:lang w:val="fi-FI"/>
+        </w:rPr>
+        <w:t>{anak_keberapa_yang_meninggal}</w:t>
+      </w:r>
+      <w:r>
+        <w:rPr>
+          <w:rFonts w:ascii="Arial" w:hAnsi="Arial" w:cs="Arial"/>
+          <w:sz w:val="20"/>
+          <w:szCs w:val="20"/>
+          <w:lang w:val="fi-FI"/>
+        </w:rPr>
         <w:t>)</w:t>
       </w:r>
       <w:r>
@@ -6579,15 +6198,6 @@
           <w:szCs w:val="20"/>
           <w:lang w:val="fi-FI"/>
         </w:rPr>
-        <w:t xml:space="preserve">  cucu yang </w:t>
-      </w:r>
-      <w:r>
-        <w:rPr>
-          <w:rFonts w:ascii="Arial" w:hAnsi="Arial" w:cs="Arial"/>
-          <w:sz w:val="20"/>
-          <w:szCs w:val="20"/>
-          <w:lang w:val="fi-FI"/>
-        </w:rPr>
         <w:t xml:space="preserve"> </w:t>
       </w:r>
       <w:r>
@@ -6597,15 +6207,6 @@
           <w:szCs w:val="20"/>
           <w:lang w:val="fi-FI"/>
         </w:rPr>
-        <w:t>berasal</w:t>
-      </w:r>
-      <w:r>
-        <w:rPr>
-          <w:rFonts w:ascii="Arial" w:hAnsi="Arial" w:cs="Arial"/>
-          <w:sz w:val="20"/>
-          <w:szCs w:val="20"/>
-          <w:lang w:val="fi-FI"/>
-        </w:rPr>
         <w:t xml:space="preserve"> </w:t>
       </w:r>
       <w:r>
@@ -6615,7 +6216,7 @@
           <w:szCs w:val="20"/>
           <w:lang w:val="fi-FI"/>
         </w:rPr>
-        <w:t xml:space="preserve"> dari</w:t>
+        <w:t xml:space="preserve">yang </w:t>
       </w:r>
       <w:r>
         <w:rPr>
@@ -6633,7 +6234,7 @@
           <w:szCs w:val="20"/>
           <w:lang w:val="fi-FI"/>
         </w:rPr>
-        <w:t xml:space="preserve"> anak </w:t>
+        <w:t xml:space="preserve">telah </w:t>
       </w:r>
       <w:r>
         <w:rPr>
@@ -6651,7 +6252,7 @@
           <w:szCs w:val="20"/>
           <w:lang w:val="fi-FI"/>
         </w:rPr>
-        <w:t>ke</w:t>
+        <w:t xml:space="preserve">meninggal </w:t>
       </w:r>
       <w:r>
         <w:rPr>
@@ -6669,7 +6270,34 @@
           <w:szCs w:val="20"/>
           <w:lang w:val="fi-FI"/>
         </w:rPr>
-        <w:t>.....</w:t>
+        <w:t>dunia</w:t>
+      </w:r>
+      <w:r>
+        <w:rPr>
+          <w:rFonts w:ascii="Arial" w:hAnsi="Arial" w:cs="Arial"/>
+          <w:sz w:val="20"/>
+          <w:szCs w:val="20"/>
+          <w:lang w:val="fi-FI"/>
+        </w:rPr>
+        <w:t>,</w:t>
+      </w:r>
+      <w:r>
+        <w:rPr>
+          <w:rFonts w:ascii="Arial" w:hAnsi="Arial" w:cs="Arial"/>
+          <w:sz w:val="20"/>
+          <w:szCs w:val="20"/>
+          <w:lang w:val="fi-FI"/>
+        </w:rPr>
+        <w:t xml:space="preserve">  </w:t>
+      </w:r>
+      <w:r>
+        <w:rPr>
+          <w:rFonts w:ascii="Arial" w:hAnsi="Arial" w:cs="Arial"/>
+          <w:sz w:val="20"/>
+          <w:szCs w:val="20"/>
+          <w:lang w:val="fi-FI"/>
+        </w:rPr>
+        <w:t>merupakan</w:t>
       </w:r>
       <w:r>
         <w:rPr>
@@ -6687,7 +6315,7 @@
           <w:szCs w:val="20"/>
           <w:lang w:val="fi-FI"/>
         </w:rPr>
-        <w:t>(</w:t>
+        <w:t xml:space="preserve"> ahli </w:t>
       </w:r>
       <w:r>
         <w:rPr>
@@ -6705,25 +6333,7 @@
           <w:szCs w:val="20"/>
           <w:lang w:val="fi-FI"/>
         </w:rPr>
-        <w:t>.........</w:t>
-      </w:r>
-      <w:r>
-        <w:rPr>
-          <w:rFonts w:ascii="Arial" w:hAnsi="Arial" w:cs="Arial"/>
-          <w:sz w:val="20"/>
-          <w:szCs w:val="20"/>
-          <w:lang w:val="fi-FI"/>
-        </w:rPr>
-        <w:t>..........</w:t>
-      </w:r>
-      <w:r>
-        <w:rPr>
-          <w:rFonts w:ascii="Arial" w:hAnsi="Arial" w:cs="Arial"/>
-          <w:sz w:val="20"/>
-          <w:szCs w:val="20"/>
-          <w:lang w:val="fi-FI"/>
-        </w:rPr>
-        <w:t>...</w:t>
+        <w:t xml:space="preserve">waris </w:t>
       </w:r>
       <w:r>
         <w:rPr>
@@ -6741,7 +6351,16 @@
           <w:szCs w:val="20"/>
           <w:lang w:val="fi-FI"/>
         </w:rPr>
-        <w:t>)</w:t>
+        <w:t xml:space="preserve">dari </w:t>
+      </w:r>
+      <w:r>
+        <w:rPr>
+          <w:rFonts w:ascii="Arial" w:hAnsi="Arial" w:cs="Arial"/>
+          <w:sz w:val="20"/>
+          <w:szCs w:val="20"/>
+          <w:lang w:val="fi-FI"/>
+        </w:rPr>
+        <w:t>mendiang</w:t>
       </w:r>
       <w:r>
         <w:rPr>
@@ -6759,178 +6378,7 @@
           <w:szCs w:val="20"/>
           <w:lang w:val="fi-FI"/>
         </w:rPr>
-        <w:t xml:space="preserve"> </w:t>
-      </w:r>
-      <w:r>
-        <w:rPr>
-          <w:rFonts w:ascii="Arial" w:hAnsi="Arial" w:cs="Arial"/>
-          <w:sz w:val="20"/>
-          <w:szCs w:val="20"/>
-          <w:lang w:val="fi-FI"/>
-        </w:rPr>
-        <w:t xml:space="preserve">yang </w:t>
-      </w:r>
-      <w:r>
-        <w:rPr>
-          <w:rFonts w:ascii="Arial" w:hAnsi="Arial" w:cs="Arial"/>
-          <w:sz w:val="20"/>
-          <w:szCs w:val="20"/>
-          <w:lang w:val="fi-FI"/>
-        </w:rPr>
-        <w:t xml:space="preserve"> </w:t>
-      </w:r>
-      <w:r>
-        <w:rPr>
-          <w:rFonts w:ascii="Arial" w:hAnsi="Arial" w:cs="Arial"/>
-          <w:sz w:val="20"/>
-          <w:szCs w:val="20"/>
-          <w:lang w:val="fi-FI"/>
-        </w:rPr>
-        <w:t xml:space="preserve">telah </w:t>
-      </w:r>
-      <w:r>
-        <w:rPr>
-          <w:rFonts w:ascii="Arial" w:hAnsi="Arial" w:cs="Arial"/>
-          <w:sz w:val="20"/>
-          <w:szCs w:val="20"/>
-          <w:lang w:val="fi-FI"/>
-        </w:rPr>
-        <w:t xml:space="preserve"> </w:t>
-      </w:r>
-      <w:r>
-        <w:rPr>
-          <w:rFonts w:ascii="Arial" w:hAnsi="Arial" w:cs="Arial"/>
-          <w:sz w:val="20"/>
-          <w:szCs w:val="20"/>
-          <w:lang w:val="fi-FI"/>
-        </w:rPr>
-        <w:t xml:space="preserve">meninggal </w:t>
-      </w:r>
-      <w:r>
-        <w:rPr>
-          <w:rFonts w:ascii="Arial" w:hAnsi="Arial" w:cs="Arial"/>
-          <w:sz w:val="20"/>
-          <w:szCs w:val="20"/>
-          <w:lang w:val="fi-FI"/>
-        </w:rPr>
-        <w:t xml:space="preserve"> </w:t>
-      </w:r>
-      <w:r>
-        <w:rPr>
-          <w:rFonts w:ascii="Arial" w:hAnsi="Arial" w:cs="Arial"/>
-          <w:sz w:val="20"/>
-          <w:szCs w:val="20"/>
-          <w:lang w:val="fi-FI"/>
-        </w:rPr>
-        <w:t>dunia</w:t>
-      </w:r>
-      <w:r>
-        <w:rPr>
-          <w:rFonts w:ascii="Arial" w:hAnsi="Arial" w:cs="Arial"/>
-          <w:sz w:val="20"/>
-          <w:szCs w:val="20"/>
-          <w:lang w:val="fi-FI"/>
-        </w:rPr>
-        <w:t>,</w:t>
-      </w:r>
-      <w:r>
-        <w:rPr>
-          <w:rFonts w:ascii="Arial" w:hAnsi="Arial" w:cs="Arial"/>
-          <w:sz w:val="20"/>
-          <w:szCs w:val="20"/>
-          <w:lang w:val="fi-FI"/>
-        </w:rPr>
-        <w:t xml:space="preserve">  </w:t>
-      </w:r>
-      <w:r>
-        <w:rPr>
-          <w:rFonts w:ascii="Arial" w:hAnsi="Arial" w:cs="Arial"/>
-          <w:sz w:val="20"/>
-          <w:szCs w:val="20"/>
-          <w:lang w:val="fi-FI"/>
-        </w:rPr>
-        <w:t>merupakan</w:t>
-      </w:r>
-      <w:r>
-        <w:rPr>
-          <w:rFonts w:ascii="Arial" w:hAnsi="Arial" w:cs="Arial"/>
-          <w:sz w:val="20"/>
-          <w:szCs w:val="20"/>
-          <w:lang w:val="fi-FI"/>
-        </w:rPr>
-        <w:t xml:space="preserve"> </w:t>
-      </w:r>
-      <w:r>
-        <w:rPr>
-          <w:rFonts w:ascii="Arial" w:hAnsi="Arial" w:cs="Arial"/>
-          <w:sz w:val="20"/>
-          <w:szCs w:val="20"/>
-          <w:lang w:val="fi-FI"/>
-        </w:rPr>
-        <w:t xml:space="preserve"> ahli </w:t>
-      </w:r>
-      <w:r>
-        <w:rPr>
-          <w:rFonts w:ascii="Arial" w:hAnsi="Arial" w:cs="Arial"/>
-          <w:sz w:val="20"/>
-          <w:szCs w:val="20"/>
-          <w:lang w:val="fi-FI"/>
-        </w:rPr>
-        <w:t xml:space="preserve"> </w:t>
-      </w:r>
-      <w:r>
-        <w:rPr>
-          <w:rFonts w:ascii="Arial" w:hAnsi="Arial" w:cs="Arial"/>
-          <w:sz w:val="20"/>
-          <w:szCs w:val="20"/>
-          <w:lang w:val="fi-FI"/>
-        </w:rPr>
-        <w:t xml:space="preserve">waris </w:t>
-      </w:r>
-      <w:r>
-        <w:rPr>
-          <w:rFonts w:ascii="Arial" w:hAnsi="Arial" w:cs="Arial"/>
-          <w:sz w:val="20"/>
-          <w:szCs w:val="20"/>
-          <w:lang w:val="fi-FI"/>
-        </w:rPr>
-        <w:t xml:space="preserve"> </w:t>
-      </w:r>
-      <w:r>
-        <w:rPr>
-          <w:rFonts w:ascii="Arial" w:hAnsi="Arial" w:cs="Arial"/>
-          <w:sz w:val="20"/>
-          <w:szCs w:val="20"/>
-          <w:lang w:val="fi-FI"/>
-        </w:rPr>
-        <w:t xml:space="preserve">dari </w:t>
-      </w:r>
-      <w:r>
-        <w:rPr>
-          <w:rFonts w:ascii="Arial" w:hAnsi="Arial" w:cs="Arial"/>
-          <w:sz w:val="20"/>
-          <w:szCs w:val="20"/>
-          <w:lang w:val="fi-FI"/>
-        </w:rPr>
-        <w:t>mendiang</w:t>
-      </w:r>
-      <w:r>
-        <w:rPr>
-          <w:rFonts w:ascii="Arial" w:hAnsi="Arial" w:cs="Arial"/>
-          <w:sz w:val="20"/>
-          <w:szCs w:val="20"/>
-          <w:lang w:val="fi-FI"/>
-        </w:rPr>
-        <w:t xml:space="preserve"> </w:t>
-      </w:r>
-      <w:r>
-        <w:rPr>
-          <w:rFonts w:ascii="Arial" w:hAnsi="Arial" w:cs="Arial"/>
-          <w:sz w:val="20"/>
-          <w:szCs w:val="20"/>
-          <w:lang w:val="fi-FI"/>
-        </w:rPr>
-        <w:t>.....................................................</w:t>
+        <w:t>{nama_almarhum}</w:t>
       </w:r>
       <w:r>
         <w:rPr>
@@ -7194,43 +6642,7 @@
           <w:szCs w:val="20"/>
           <w:lang w:val="fi-FI"/>
         </w:rPr>
-        <w:t xml:space="preserve">................... </w:t>
-      </w:r>
-      <w:r>
-        <w:rPr>
-          <w:rFonts w:ascii="Arial" w:hAnsi="Arial" w:cs="Arial"/>
-          <w:sz w:val="20"/>
-          <w:szCs w:val="20"/>
-          <w:lang w:val="fi-FI"/>
-        </w:rPr>
-        <w:t>,...........</w:t>
-      </w:r>
-      <w:r>
-        <w:rPr>
-          <w:rFonts w:ascii="Arial" w:hAnsi="Arial" w:cs="Arial"/>
-          <w:sz w:val="20"/>
-          <w:szCs w:val="20"/>
-          <w:lang w:val="fi-FI"/>
-        </w:rPr>
-        <w:t>....................</w:t>
-      </w:r>
-      <w:r>
-        <w:rPr>
-          <w:rFonts w:ascii="Arial" w:hAnsi="Arial" w:cs="Arial"/>
-          <w:sz w:val="20"/>
-          <w:szCs w:val="20"/>
-          <w:lang w:val="fi-FI"/>
-        </w:rPr>
-        <w:t>..................</w:t>
-      </w:r>
-      <w:r>
-        <w:rPr>
-          <w:rFonts w:ascii="Arial" w:hAnsi="Arial" w:cs="Arial"/>
-          <w:sz w:val="20"/>
-          <w:szCs w:val="20"/>
-          <w:lang w:val="fi-FI"/>
-        </w:rPr>
-        <w:t>......</w:t>
+        <w:t>Kembanglimus, {tanggal_hari_ini}</w:t>
       </w:r>
     </w:p>
     <w:p>
@@ -7330,7 +6742,16 @@
           <w:szCs w:val="20"/>
           <w:lang w:val="it-IT"/>
         </w:rPr>
-        <w:t>..............................................</w:t>
+        <w:t>{nama_ibu_almarhum}</w:t>
+      </w:r>
+      <w:r>
+        <w:rPr>
+          <w:rFonts w:ascii="Arial" w:hAnsi="Arial" w:cs="Arial"/>
+          <w:sz w:val="20"/>
+          <w:szCs w:val="20"/>
+          <w:lang w:val="it-IT"/>
+        </w:rPr>
+        <w:tab/>
       </w:r>
       <w:r>
         <w:rPr>
@@ -7434,25 +6855,7 @@
           <w:szCs w:val="20"/>
           <w:lang w:val="it-IT"/>
         </w:rPr>
-        <w:t xml:space="preserve"> </w:t>
-      </w:r>
-      <w:r>
-        <w:rPr>
-          <w:rFonts w:ascii="Arial" w:hAnsi="Arial" w:cs="Arial"/>
-          <w:sz w:val="20"/>
-          <w:szCs w:val="20"/>
-          <w:lang w:val="it-IT"/>
-        </w:rPr>
-        <w:t>.................</w:t>
-      </w:r>
-      <w:r>
-        <w:rPr>
-          <w:rFonts w:ascii="Arial" w:hAnsi="Arial" w:cs="Arial"/>
-          <w:sz w:val="20"/>
-          <w:szCs w:val="20"/>
-          <w:lang w:val="it-IT"/>
-        </w:rPr>
-        <w:t>................................</w:t>
+        <w:t xml:space="preserve"> {nama_pasangan_almarhum}</w:t>
       </w:r>
       <w:r>
         <w:rPr>
@@ -7600,16 +7003,6 @@
           <w:lang w:val="it-IT"/>
         </w:rPr>
         <w:tab/>
-        <w:t>:...............................................</w:t>
-      </w:r>
-      <w:r>
-        <w:rPr>
-          <w:rFonts w:ascii="Arial" w:hAnsi="Arial" w:cs="Arial"/>
-          <w:sz w:val="20"/>
-          <w:szCs w:val="20"/>
-          <w:lang w:val="it-IT"/>
-        </w:rPr>
-        <w:t xml:space="preserve">   </w:t>
       </w:r>
       <w:r>
         <w:rPr>
@@ -7704,7 +7097,6 @@
           <w:lang w:val="it-IT"/>
         </w:rPr>
         <w:tab/>
-        <w:t>:................................................</w:t>
       </w:r>
       <w:r>
         <w:rPr>
@@ -7852,7 +7244,6 @@
           <w:lang w:val="it-IT"/>
         </w:rPr>
         <w:tab/>
-        <w:t>:................................................</w:t>
       </w:r>
       <w:r>
         <w:rPr>
@@ -7973,7 +7364,6 @@
           <w:lang w:val="it-IT"/>
         </w:rPr>
         <w:tab/>
-        <w:t>:................................................</w:t>
       </w:r>
       <w:r>
         <w:rPr>
@@ -8075,6 +7465,7 @@
           <w:szCs w:val="20"/>
           <w:lang w:val="nb-NO"/>
         </w:rPr>
+        <w:lastRenderedPageBreak/>
         <w:t>7</w:t>
       </w:r>
       <w:r>
@@ -8094,34 +7485,6 @@
           <w:lang w:val="nb-NO"/>
         </w:rPr>
         <w:t xml:space="preserve">dari Anak ke </w:t>
-      </w:r>
-      <w:r>
-        <w:rPr>
-          <w:rFonts w:ascii="Arial" w:hAnsi="Arial" w:cs="Arial"/>
-          <w:sz w:val="20"/>
-          <w:szCs w:val="20"/>
-          <w:lang w:val="nb-NO"/>
-        </w:rPr>
-        <w:t>....</w:t>
-      </w:r>
-      <w:r>
-        <w:rPr>
-          <w:rFonts w:ascii="Arial" w:hAnsi="Arial" w:cs="Arial"/>
-          <w:sz w:val="20"/>
-          <w:szCs w:val="20"/>
-          <w:lang w:val="nb-NO"/>
-        </w:rPr>
-        <w:tab/>
-        <w:t>:.......................</w:t>
-      </w:r>
-      <w:r>
-        <w:rPr>
-          <w:rFonts w:ascii="Arial" w:hAnsi="Arial" w:cs="Arial"/>
-          <w:sz w:val="20"/>
-          <w:szCs w:val="20"/>
-          <w:lang w:val="nb-NO"/>
-        </w:rPr>
-        <w:t>.........................</w:t>
       </w:r>
       <w:r>
         <w:rPr>
@@ -8770,7 +8133,7 @@
     </w:p>
     <w:sectPr>
       <w:pgSz w:w="12191" w:h="18796" w:code="10002"/>
-      <w:pgMar w:top="284" w:right="851" w:bottom="851" w:left="851" w:header="720" w:footer="720" w:gutter="0"/>
+      <w:pgMar w:top="1418" w:right="851" w:bottom="1701" w:left="851" w:header="720" w:footer="720" w:gutter="0"/>
       <w:cols w:space="720"/>
       <w:docGrid w:linePitch="360"/>
     </w:sectPr>

</xml_diff>